<commit_message>
updated info about the datasets source and generation
</commit_message>
<xml_diff>
--- a/Medical-Cost-Analyis---Jon-Duea---John-Clark.docx
+++ b/Medical-Cost-Analyis---Jon-Duea---John-Clark.docx
@@ -110,6 +110,36 @@
             <w:rStyle w:val="Hyperlink"/>
           </w:rPr>
           <w:t xml:space="preserve">Stednick 2022</w:t>
+        </w:r>
+      </w:hyperlink>
+      <w:r>
+        <w:t xml:space="preserve">)</w:t>
+      </w:r>
+      <w:r>
+        <w:t xml:space="preserve">, and was initially prepared for the book</w:t>
+      </w:r>
+      <w:r>
+        <w:t xml:space="preserve"> </w:t>
+      </w:r>
+      <w:r>
+        <w:rPr>
+          <w:i/>
+          <w:iCs/>
+        </w:rPr>
+        <w:t xml:space="preserve">Machine Learning with R</w:t>
+      </w:r>
+      <w:r>
+        <w:t xml:space="preserve"> </w:t>
+      </w:r>
+      <w:r>
+        <w:t xml:space="preserve">(</w:t>
+      </w:r>
+      <w:hyperlink w:anchor="ref-lantz_2013_machine">
+        <w:r>
+          <w:rPr>
+            <w:rStyle w:val="Hyperlink"/>
+          </w:rPr>
+          <w:t xml:space="preserve">Lantz 2013</w:t>
         </w:r>
       </w:hyperlink>
       <w:r>
@@ -1194,7 +1224,7 @@
       </w:r>
     </w:p>
     <w:bookmarkEnd w:id="24"/>
-    <w:bookmarkStart w:id="30" w:name="references"/>
+    <w:bookmarkStart w:id="32" w:name="references"/>
     <w:p>
       <w:pPr>
         <w:pStyle w:val="Heading1"/>
@@ -1203,7 +1233,7 @@
         <w:t xml:space="preserve">References</w:t>
       </w:r>
     </w:p>
-    <w:bookmarkStart w:id="29" w:name="refs"/>
+    <w:bookmarkStart w:id="31" w:name="refs"/>
     <w:bookmarkStart w:id="26" w:name="ref-choi_medical"/>
     <w:p>
       <w:pPr>
@@ -1240,12 +1270,48 @@
       </w:r>
     </w:p>
     <w:bookmarkEnd w:id="26"/>
-    <w:bookmarkStart w:id="28" w:name="ref-stednick_2022_data"/>
+    <w:bookmarkStart w:id="28" w:name="ref-lantz_2013_machine"/>
     <w:p>
       <w:pPr>
         <w:pStyle w:val="Bibliography"/>
       </w:pPr>
       <w:r>
+        <w:t xml:space="preserve">Lantz, Brett. 2013.</w:t>
+      </w:r>
+      <w:r>
+        <w:t xml:space="preserve"> </w:t>
+      </w:r>
+      <w:r>
+        <w:t xml:space="preserve">“Machine Learning with r.”</w:t>
+      </w:r>
+      <w:r>
+        <w:t xml:space="preserve"> </w:t>
+      </w:r>
+      <w:r>
+        <w:t xml:space="preserve">Packt Publishing.</w:t>
+      </w:r>
+      <w:r>
+        <w:t xml:space="preserve"> </w:t>
+      </w:r>
+      <w:hyperlink r:id="rId27">
+        <w:r>
+          <w:rPr>
+            <w:rStyle w:val="Hyperlink"/>
+          </w:rPr>
+          <w:t xml:space="preserve">https://www.everand.com/book/253051595/Machine-Learning-with-R</w:t>
+        </w:r>
+      </w:hyperlink>
+      <w:r>
+        <w:t xml:space="preserve">.</w:t>
+      </w:r>
+    </w:p>
+    <w:bookmarkEnd w:id="28"/>
+    <w:bookmarkStart w:id="30" w:name="ref-stednick_2022_data"/>
+    <w:p>
+      <w:pPr>
+        <w:pStyle w:val="Bibliography"/>
+      </w:pPr>
+      <w:r>
         <w:t xml:space="preserve">Stednick, Zach. 2022.</w:t>
       </w:r>
       <w:r>
@@ -1263,7 +1329,7 @@
       <w:r>
         <w:t xml:space="preserve"> </w:t>
       </w:r>
-      <w:hyperlink r:id="rId27">
+      <w:hyperlink r:id="rId29">
         <w:r>
           <w:rPr>
             <w:rStyle w:val="Hyperlink"/>
@@ -1275,9 +1341,9 @@
         <w:t xml:space="preserve">.</w:t>
       </w:r>
     </w:p>
-    <w:bookmarkEnd w:id="28"/>
-    <w:bookmarkEnd w:id="29"/>
     <w:bookmarkEnd w:id="30"/>
+    <w:bookmarkEnd w:id="31"/>
+    <w:bookmarkEnd w:id="32"/>
     <w:sectPr>
       <w:pgSz w:h="15840" w:w="12240"/>
       <w:pgMar w:bottom="1440" w:footer="720" w:gutter="0" w:header="720" w:left="1440" w:right="1440" w:top="1440"/>

</xml_diff>

<commit_message>
finished, references push it to just over 6 pages but I think that will do. Changed some of the formatting for a tighter cleaner look
</commit_message>
<xml_diff>
--- a/Medical-Cost-Analyis---Jon-Duea---John-Clark.docx
+++ b/Medical-Cost-Analyis---Jon-Duea---John-Clark.docx
@@ -146,7 +146,7 @@
         <w:t xml:space="preserve">)</w:t>
       </w:r>
       <w:r>
-        <w:t xml:space="preserve">. This dataset contains information regarding medical costs billed to individuals by insurance as well as information about the individuals including their age, sex, bmi, number of children, smoking status, and region of the US where they reside.</w:t>
+        <w:t xml:space="preserve">. This dataset was simulated based on demographic statistics from the U.S. Census Bureau and contains information regarding medical costs billed to individuals by insurance as well as information about the individuals including their age, sex, bmi, number of children, smoking status, and region of the US where they reside.</w:t>
       </w:r>
     </w:p>
     <w:p>
@@ -683,29 +683,7 @@
         </w:numPr>
       </w:pPr>
       <w:r>
-        <w:t xml:space="preserve">Sex:</w:t>
-      </w:r>
-    </w:p>
-    <w:p>
-      <w:pPr>
-        <w:numPr>
-          <w:ilvl w:val="1"/>
-          <w:numId w:val="1007"/>
-        </w:numPr>
-      </w:pPr>
-      <w:r>
-        <w:t xml:space="preserve">Sex of the primary beneficiary</w:t>
-      </w:r>
-    </w:p>
-    <w:p>
-      <w:pPr>
-        <w:numPr>
-          <w:ilvl w:val="1"/>
-          <w:numId w:val="1007"/>
-        </w:numPr>
-      </w:pPr>
-      <w:r>
-        <w:t xml:space="preserve">Categorical variable with 2 levels (Male or Female)</w:t>
+        <w:t xml:space="preserve">Sex (sex of the primary beneficiary, categorical variable with 2 levels (male or female))</w:t>
       </w:r>
     </w:p>
     <w:p>
@@ -716,461 +694,2310 @@
         </w:numPr>
       </w:pPr>
       <w:r>
-        <w:t xml:space="preserve">Region:</w:t>
+        <w:t xml:space="preserve">Region (residential area of the primary beneficiary in the US, categorical variable with 4 levels (northeast, northwest, southeast, southwest)</w:t>
       </w:r>
     </w:p>
     <w:p>
       <w:pPr>
+        <w:numPr>
+          <w:ilvl w:val="0"/>
+          <w:numId w:val="1006"/>
+        </w:numPr>
+      </w:pPr>
+      <w:r>
+        <w:t xml:space="preserve">Charges (medical costs billed by health insurance, numeric variable, measured in USD):</w:t>
+      </w:r>
+    </w:p>
+    <w:bookmarkEnd w:id="20"/>
+    <w:bookmarkStart w:id="21" w:name="methods"/>
+    <w:p>
+      <w:pPr>
+        <w:pStyle w:val="Heading1"/>
+      </w:pPr>
+      <w:r>
+        <w:t xml:space="preserve">Methods</w:t>
+      </w:r>
+    </w:p>
+    <w:p>
+      <w:pPr>
+        <w:pStyle w:val="FirstParagraph"/>
+      </w:pPr>
+      <w:r>
+        <w:t xml:space="preserve">Since we’re working with two categorical independent variables and one numeric dependent variable, a two-way ANOVA was performed to analyze the effect of sex and region on medical costs billed by insurance. A two-way ANOVA is the appropriate method for our analysis because our research questions are interested in investigating the main effect of sex and region (both categorical variables with two or more levels) as well as the interaction between the two.</w:t>
+      </w:r>
+    </w:p>
+    <w:p>
+      <w:pPr>
+        <w:pStyle w:val="BodyText"/>
+      </w:pPr>
+      <w:r>
+        <w:t xml:space="preserve">In preparation for our analysis, we checked that the assumptions about our data for two-way ANOVA were satisfied (located in R chunk</w:t>
+      </w:r>
+      <w:r>
+        <w:t xml:space="preserve"> </w:t>
+      </w:r>
+      <w:r>
+        <w:t xml:space="preserve">“</w:t>
+      </w:r>
+      <w:r>
+        <w:t xml:space="preserve">Assumption checks</w:t>
+      </w:r>
+      <w:r>
+        <w:t xml:space="preserve">”</w:t>
+      </w:r>
+      <w:r>
+        <w:t xml:space="preserve">), and determined that no pre-processing of our data was needed other than converting the region and sex variables from a character to a factor.</w:t>
+      </w:r>
+    </w:p>
+    <w:bookmarkEnd w:id="21"/>
+    <w:bookmarkStart w:id="25" w:name="conclusion"/>
+    <w:p>
+      <w:pPr>
+        <w:pStyle w:val="Heading1"/>
+      </w:pPr>
+      <w:r>
+        <w:t xml:space="preserve">Conclusion</w:t>
+      </w:r>
+    </w:p>
+    <w:p>
+      <w:pPr>
+        <w:pStyle w:val="FirstParagraph"/>
+      </w:pPr>
+      <w:r>
+        <w:t xml:space="preserve">Based on the results of our analysis (see Table 1: Two-way ANOVA results below for the test statistics) we were able to answer the research questions posed at the beginning of this paper, that is:</w:t>
+      </w:r>
+    </w:p>
+    <w:p>
+      <w:pPr>
+        <w:pStyle w:val="Compact"/>
+        <w:numPr>
+          <w:ilvl w:val="0"/>
+          <w:numId w:val="1007"/>
+        </w:numPr>
+      </w:pPr>
+      <w:r>
+        <w:t xml:space="preserve">Do medical costs billed by insurance differ significantly based on sex and region independently?</w:t>
+      </w:r>
+    </w:p>
+    <w:p>
+      <w:pPr>
+        <w:pStyle w:val="Compact"/>
         <w:numPr>
           <w:ilvl w:val="1"/>
           <w:numId w:val="1008"/>
         </w:numPr>
       </w:pPr>
       <w:r>
-        <w:t xml:space="preserve">Residential area of the primary beneficiary in the US</w:t>
+        <w:t xml:space="preserve">Sex:</w:t>
       </w:r>
     </w:p>
     <w:p>
       <w:pPr>
+        <w:pStyle w:val="Compact"/>
+        <w:numPr>
+          <w:ilvl w:val="2"/>
+          <w:numId w:val="1009"/>
+        </w:numPr>
+      </w:pPr>
+      <m:oMath>
+        <m:sSub>
+          <m:e>
+            <m:r>
+              <m:t>H</m:t>
+            </m:r>
+          </m:e>
+          <m:sub>
+            <m:r>
+              <m:t>0</m:t>
+            </m:r>
+          </m:sub>
+        </m:sSub>
+        <m:r>
+          <m:rPr>
+            <m:sty m:val="p"/>
+          </m:rPr>
+          <m:t>:</m:t>
+        </m:r>
+        <m:sSub>
+          <m:e>
+            <m:r>
+              <m:t>μ</m:t>
+            </m:r>
+          </m:e>
+          <m:sub>
+            <m:r>
+              <m:t>m</m:t>
+            </m:r>
+            <m:r>
+              <m:t>a</m:t>
+            </m:r>
+            <m:r>
+              <m:t>l</m:t>
+            </m:r>
+            <m:r>
+              <m:t>e</m:t>
+            </m:r>
+          </m:sub>
+        </m:sSub>
+        <m:r>
+          <m:rPr>
+            <m:sty m:val="p"/>
+          </m:rPr>
+          <m:t>=</m:t>
+        </m:r>
+        <m:sSub>
+          <m:e>
+            <m:r>
+              <m:t>μ</m:t>
+            </m:r>
+          </m:e>
+          <m:sub>
+            <m:r>
+              <m:t>f</m:t>
+            </m:r>
+            <m:r>
+              <m:t>e</m:t>
+            </m:r>
+            <m:r>
+              <m:t>m</m:t>
+            </m:r>
+            <m:r>
+              <m:t>a</m:t>
+            </m:r>
+            <m:r>
+              <m:t>l</m:t>
+            </m:r>
+            <m:r>
+              <m:t>e</m:t>
+            </m:r>
+          </m:sub>
+        </m:sSub>
+      </m:oMath>
+      <w:r>
+        <w:t xml:space="preserve"> </w:t>
+      </w:r>
+      <w:r>
+        <w:t xml:space="preserve">vs</w:t>
+      </w:r>
+      <w:r>
+        <w:t xml:space="preserve"> </w:t>
+      </w:r>
+      <m:oMath>
+        <m:sSub>
+          <m:e>
+            <m:r>
+              <m:t>H</m:t>
+            </m:r>
+          </m:e>
+          <m:sub>
+            <m:r>
+              <m:t>a</m:t>
+            </m:r>
+          </m:sub>
+        </m:sSub>
+        <m:r>
+          <m:rPr>
+            <m:sty m:val="p"/>
+          </m:rPr>
+          <m:t>:</m:t>
+        </m:r>
+        <m:sSub>
+          <m:e>
+            <m:r>
+              <m:t>μ</m:t>
+            </m:r>
+          </m:e>
+          <m:sub>
+            <m:r>
+              <m:t>m</m:t>
+            </m:r>
+            <m:r>
+              <m:t>a</m:t>
+            </m:r>
+            <m:r>
+              <m:t>l</m:t>
+            </m:r>
+            <m:r>
+              <m:t>e</m:t>
+            </m:r>
+          </m:sub>
+        </m:sSub>
+        <m:r>
+          <m:rPr>
+            <m:sty m:val="p"/>
+          </m:rPr>
+          <m:t>≠</m:t>
+        </m:r>
+        <m:sSub>
+          <m:e>
+            <m:r>
+              <m:t>μ</m:t>
+            </m:r>
+          </m:e>
+          <m:sub>
+            <m:r>
+              <m:t>f</m:t>
+            </m:r>
+            <m:r>
+              <m:t>e</m:t>
+            </m:r>
+            <m:r>
+              <m:t>m</m:t>
+            </m:r>
+            <m:r>
+              <m:t>a</m:t>
+            </m:r>
+            <m:r>
+              <m:t>l</m:t>
+            </m:r>
+            <m:r>
+              <m:t>e</m:t>
+            </m:r>
+          </m:sub>
+        </m:sSub>
+      </m:oMath>
+    </w:p>
+    <w:p>
+      <w:pPr>
+        <w:pStyle w:val="Compact"/>
+        <w:numPr>
+          <w:ilvl w:val="2"/>
+          <w:numId w:val="1009"/>
+        </w:numPr>
+      </w:pPr>
+      <w:r>
+        <w:t xml:space="preserve">F=2.97533, P-value=.0307&lt;</w:t>
+      </w:r>
+      <w:r>
+        <w:t xml:space="preserve"> </w:t>
+      </w:r>
+      <m:oMath>
+        <m:r>
+          <m:t>α</m:t>
+        </m:r>
+      </m:oMath>
+      <w:r>
+        <w:t xml:space="preserve"> </w:t>
+      </w:r>
+      <w:r>
+        <w:t xml:space="preserve">= 0.05, we reject the null hypothesis and conclude that there is a statistically significant difference at the .05 significance level in medical costs billed by insurance between the male and female sexes.</w:t>
+      </w:r>
+    </w:p>
+    <w:p>
+      <w:pPr>
+        <w:pStyle w:val="Compact"/>
         <w:numPr>
           <w:ilvl w:val="1"/>
           <w:numId w:val="1008"/>
         </w:numPr>
       </w:pPr>
       <w:r>
-        <w:t xml:space="preserve">Categorical variable with 4 levels (Northeast, Northwest, Southeast, Southwest)</w:t>
+        <w:t xml:space="preserve">Region:</w:t>
       </w:r>
     </w:p>
     <w:p>
       <w:pPr>
+        <w:pStyle w:val="Compact"/>
+        <w:numPr>
+          <w:ilvl w:val="2"/>
+          <w:numId w:val="1010"/>
+        </w:numPr>
+      </w:pPr>
+      <m:oMath>
+        <m:sSub>
+          <m:e>
+            <m:r>
+              <m:t>H</m:t>
+            </m:r>
+          </m:e>
+          <m:sub>
+            <m:r>
+              <m:t>0</m:t>
+            </m:r>
+          </m:sub>
+        </m:sSub>
+        <m:r>
+          <m:rPr>
+            <m:sty m:val="p"/>
+          </m:rPr>
+          <m:t>:</m:t>
+        </m:r>
+        <m:sSub>
+          <m:e>
+            <m:r>
+              <m:t>μ</m:t>
+            </m:r>
+          </m:e>
+          <m:sub>
+            <m:r>
+              <m:t>n</m:t>
+            </m:r>
+            <m:r>
+              <m:t>o</m:t>
+            </m:r>
+            <m:r>
+              <m:t>r</m:t>
+            </m:r>
+            <m:r>
+              <m:t>t</m:t>
+            </m:r>
+            <m:r>
+              <m:t>h</m:t>
+            </m:r>
+            <m:r>
+              <m:t>e</m:t>
+            </m:r>
+            <m:r>
+              <m:t>a</m:t>
+            </m:r>
+            <m:r>
+              <m:t>s</m:t>
+            </m:r>
+            <m:r>
+              <m:t>t</m:t>
+            </m:r>
+          </m:sub>
+        </m:sSub>
+        <m:r>
+          <m:rPr>
+            <m:sty m:val="p"/>
+          </m:rPr>
+          <m:t>=</m:t>
+        </m:r>
+        <m:sSub>
+          <m:e>
+            <m:r>
+              <m:t>μ</m:t>
+            </m:r>
+          </m:e>
+          <m:sub>
+            <m:r>
+              <m:t>n</m:t>
+            </m:r>
+            <m:r>
+              <m:t>o</m:t>
+            </m:r>
+            <m:r>
+              <m:t>r</m:t>
+            </m:r>
+            <m:r>
+              <m:t>t</m:t>
+            </m:r>
+            <m:r>
+              <m:t>h</m:t>
+            </m:r>
+            <m:r>
+              <m:t>w</m:t>
+            </m:r>
+            <m:r>
+              <m:t>e</m:t>
+            </m:r>
+            <m:r>
+              <m:t>s</m:t>
+            </m:r>
+            <m:r>
+              <m:t>t</m:t>
+            </m:r>
+          </m:sub>
+        </m:sSub>
+        <m:r>
+          <m:rPr>
+            <m:sty m:val="p"/>
+          </m:rPr>
+          <m:t>=</m:t>
+        </m:r>
+        <m:sSub>
+          <m:e>
+            <m:r>
+              <m:t>μ</m:t>
+            </m:r>
+          </m:e>
+          <m:sub>
+            <m:r>
+              <m:t>s</m:t>
+            </m:r>
+            <m:r>
+              <m:t>o</m:t>
+            </m:r>
+            <m:r>
+              <m:t>u</m:t>
+            </m:r>
+            <m:r>
+              <m:t>t</m:t>
+            </m:r>
+            <m:r>
+              <m:t>h</m:t>
+            </m:r>
+            <m:r>
+              <m:t>e</m:t>
+            </m:r>
+            <m:r>
+              <m:t>a</m:t>
+            </m:r>
+            <m:r>
+              <m:t>s</m:t>
+            </m:r>
+            <m:r>
+              <m:t>t</m:t>
+            </m:r>
+          </m:sub>
+        </m:sSub>
+        <m:r>
+          <m:rPr>
+            <m:sty m:val="p"/>
+          </m:rPr>
+          <m:t>=</m:t>
+        </m:r>
+        <m:sSub>
+          <m:e>
+            <m:r>
+              <m:t>μ</m:t>
+            </m:r>
+          </m:e>
+          <m:sub>
+            <m:r>
+              <m:t>s</m:t>
+            </m:r>
+            <m:r>
+              <m:t>o</m:t>
+            </m:r>
+            <m:r>
+              <m:t>u</m:t>
+            </m:r>
+            <m:r>
+              <m:t>t</m:t>
+            </m:r>
+            <m:r>
+              <m:t>h</m:t>
+            </m:r>
+            <m:r>
+              <m:t>w</m:t>
+            </m:r>
+            <m:r>
+              <m:t>e</m:t>
+            </m:r>
+            <m:r>
+              <m:t>s</m:t>
+            </m:r>
+            <m:r>
+              <m:t>t</m:t>
+            </m:r>
+          </m:sub>
+        </m:sSub>
+      </m:oMath>
+      <w:r>
+        <w:t xml:space="preserve"> </w:t>
+      </w:r>
+      <w:r>
+        <w:t xml:space="preserve">vs</w:t>
+      </w:r>
+      <w:r>
+        <w:t xml:space="preserve"> </w:t>
+      </w:r>
+      <m:oMath>
+        <m:sSub>
+          <m:e>
+            <m:r>
+              <m:t>H</m:t>
+            </m:r>
+          </m:e>
+          <m:sub>
+            <m:r>
+              <m:t>a</m:t>
+            </m:r>
+          </m:sub>
+        </m:sSub>
+        <m:r>
+          <m:rPr>
+            <m:sty m:val="p"/>
+          </m:rPr>
+          <m:t>:</m:t>
+        </m:r>
+      </m:oMath>
+      <w:r>
+        <w:t xml:space="preserve"> </w:t>
+      </w:r>
+      <w:r>
+        <w:t xml:space="preserve">At least one regions mean charges are significantly different from the others.</w:t>
+      </w:r>
+    </w:p>
+    <w:p>
+      <w:pPr>
+        <w:pStyle w:val="Compact"/>
+        <w:numPr>
+          <w:ilvl w:val="2"/>
+          <w:numId w:val="1010"/>
+        </w:numPr>
+      </w:pPr>
+      <w:r>
+        <w:t xml:space="preserve">F=4.2069, P-value=.0405&lt;</w:t>
+      </w:r>
+      <w:r>
+        <w:t xml:space="preserve"> </w:t>
+      </w:r>
+      <m:oMath>
+        <m:r>
+          <m:t>α</m:t>
+        </m:r>
+      </m:oMath>
+      <w:r>
+        <w:t xml:space="preserve"> </w:t>
+      </w:r>
+      <w:r>
+        <w:t xml:space="preserve">= 0.05, we reject the null hypothesis and conclude that at the .05 significance level at least one regions mean medical costs billed by insurance differs significantly from the others.</w:t>
+      </w:r>
+    </w:p>
+    <w:p>
+      <w:pPr>
+        <w:pStyle w:val="Compact"/>
         <w:numPr>
           <w:ilvl w:val="0"/>
-          <w:numId w:val="1006"/>
+          <w:numId w:val="1007"/>
         </w:numPr>
       </w:pPr>
       <w:r>
-        <w:t xml:space="preserve">Charges:</w:t>
+        <w:t xml:space="preserve">Is there a significant interaction between sex of the primary beneficiary and region on medical costs billed by insurance, meaning that the effect of sex on medical costs billed by insurance depends on the region of the US where the individual resides?</w:t>
       </w:r>
     </w:p>
     <w:p>
       <w:pPr>
+        <w:pStyle w:val="Compact"/>
         <w:numPr>
           <w:ilvl w:val="1"/>
-          <w:numId w:val="1009"/>
+          <w:numId w:val="1011"/>
         </w:numPr>
       </w:pPr>
-      <w:r>
-        <w:t xml:space="preserve">Medical Costs Billed by Health Insurance</w:t>
+      <m:oMath>
+        <m:sSub>
+          <m:e>
+            <m:r>
+              <m:t>H</m:t>
+            </m:r>
+          </m:e>
+          <m:sub>
+            <m:r>
+              <m:t>0</m:t>
+            </m:r>
+          </m:sub>
+        </m:sSub>
+        <m:r>
+          <m:rPr>
+            <m:sty m:val="p"/>
+          </m:rPr>
+          <m:t>:</m:t>
+        </m:r>
+      </m:oMath>
+      <w:r>
+        <w:t xml:space="preserve"> </w:t>
+      </w:r>
+      <w:r>
+        <w:t xml:space="preserve">There is no interaction between sex and region on medical costs billed by insurance. vs</w:t>
+      </w:r>
+      <w:r>
+        <w:t xml:space="preserve"> </w:t>
+      </w:r>
+      <m:oMath>
+        <m:sSub>
+          <m:e>
+            <m:r>
+              <m:t>H</m:t>
+            </m:r>
+          </m:e>
+          <m:sub>
+            <m:r>
+              <m:t>a</m:t>
+            </m:r>
+          </m:sub>
+        </m:sSub>
+        <m:r>
+          <m:rPr>
+            <m:sty m:val="p"/>
+          </m:rPr>
+          <m:t>:</m:t>
+        </m:r>
+      </m:oMath>
+      <w:r>
+        <w:t xml:space="preserve"> </w:t>
+      </w:r>
+      <w:r>
+        <w:t xml:space="preserve">There is a significant interaction between sex and region on medical costs billed by insurance.</w:t>
       </w:r>
     </w:p>
     <w:p>
       <w:pPr>
+        <w:pStyle w:val="Compact"/>
         <w:numPr>
           <w:ilvl w:val="1"/>
-          <w:numId w:val="1009"/>
+          <w:numId w:val="1011"/>
         </w:numPr>
       </w:pPr>
       <w:r>
-        <w:t xml:space="preserve">Numeric variable, Measured in USD</w:t>
+        <w:t xml:space="preserve">F-value = 0.7781, P-value = 0.5062 &gt;</w:t>
+      </w:r>
+      <w:r>
+        <w:t xml:space="preserve"> </w:t>
+      </w:r>
+      <m:oMath>
+        <m:r>
+          <m:t>α</m:t>
+        </m:r>
+      </m:oMath>
+      <w:r>
+        <w:t xml:space="preserve"> </w:t>
+      </w:r>
+      <w:r>
+        <w:t xml:space="preserve">= 0.05, we fail to reject the null hypothesis; there is insufficient evidence at the .05 significance level to claim a significant interaction between sex and region medical costs billed by insurance exists.</w:t>
       </w:r>
     </w:p>
-    <w:bookmarkEnd w:id="20"/>
-    <w:bookmarkStart w:id="24" w:name="methods"/>
-    <w:p>
-      <w:pPr>
-        <w:pStyle w:val="Heading1"/>
-      </w:pPr>
-      <w:r>
-        <w:t xml:space="preserve">Methods</w:t>
+    <w:p xmlns:w="http://schemas.openxmlformats.org/wordprocessingml/2006/main" xmlns:wp="http://schemas.openxmlformats.org/drawingml/2006/wordprocessingDrawing" xmlns:r="http://schemas.openxmlformats.org/officeDocument/2006/relationships" xmlns:w14="http://schemas.microsoft.com/office/word/2010/wordml">
+      <w:pPr>
+        <w:pStyle w:val="TableCaption"/>
+        <w:jc w:val="center"/>
+        <w:keepNext/>
+        <w:pBdr>
+          <w:bottom w:val="none" w:sz="0" w:space="0" w:color="000000"/>
+          <w:top w:val="none" w:sz="0" w:space="0" w:color="000000"/>
+          <w:left w:val="none" w:sz="0" w:space="0" w:color="000000"/>
+          <w:right w:val="none" w:sz="0" w:space="0" w:color="000000"/>
+        </w:pBdr>
+        <w:spacing w:after="60" w:before="60" w:line="240"/>
+        <w:ind w:left="60" w:right="60" w:firstLine="0" w:firstLineChars="0"/>
+      </w:pPr>
+      <w:r>
+        <w:t xml:space="preserve">Table 1: Two-way Anova results</w:t>
       </w:r>
     </w:p>
-    <w:p>
-      <w:pPr>
-        <w:pStyle w:val="FirstParagraph"/>
-      </w:pPr>
-      <w:r>
-        <w:t xml:space="preserve">Since we’re working with two categorical independent variables and one numeric dependent variable, a two-way ANOVA was performed to analyze the effect of sex and region on medical costs billed by insurance. A two-way ANOVA is the appropriate method for our analysis because our research questions are interested in investigating the main effect of sex and region (both categorical variables with two or more levels) as well as the interaction between the two.</w:t>
-      </w:r>
-    </w:p>
-    <w:tbl>
+    <w:tbl xmlns:w="http://schemas.openxmlformats.org/wordprocessingml/2006/main" xmlns:r="http://schemas.openxmlformats.org/officeDocument/2006/relationships" xmlns:w14="http://schemas.microsoft.com/office/word/2010/wordml" xmlns:wp="http://schemas.openxmlformats.org/drawingml/2006/wordprocessingDrawing" xmlns:a="http://schemas.openxmlformats.org/drawingml/2006/main" xmlns:pic="http://schemas.openxmlformats.org/drawingml/2006/picture">
       <w:tblPr>
-        <w:tblStyle w:val="Table"/>
-        <w:tblW w:type="auto" w:w="0"/>
-        <w:tblLook w:firstRow="1" w:lastRow="0" w:firstColumn="0" w:lastColumn="0" w:noHBand="0" w:noVBand="0" w:val="0020"/>
+        <w:tblLayout w:type="fixed"/>
+        <w:jc w:val="center"/>
+        <w:tblLook w:firstRow="1" w:lastRow="0" w:firstColumn="0" w:lastColumn="0" w:noHBand="0" w:noVBand="1"/>
       </w:tblPr>
       <w:tblGrid>
-        <w:gridCol w:w="1320"/>
-        <w:gridCol w:w="1320"/>
-        <w:gridCol w:w="1320"/>
-        <w:gridCol w:w="1320"/>
-        <w:gridCol w:w="1320"/>
-        <w:gridCol w:w="1320"/>
+        <w:gridCol w:w="1598"/>
+        <w:gridCol w:w="958"/>
+        <w:gridCol w:w="2159"/>
+        <w:gridCol w:w="1692"/>
+        <w:gridCol w:w="1158"/>
+        <w:gridCol w:w="1171"/>
       </w:tblGrid>
       <w:tr>
         <w:trPr>
-          <w:tblHeader w:val="on"/>
+          <w:trHeight w:val="482" w:hRule="auto"/>
+          <w:tblHeader/>
         </w:trPr>
+        header1
         <w:tc>
-          <w:tcPr/>
+          <w:tcPr>
+            <w:tcBorders>
+              <w:bottom w:val="single" w:sz="12" w:space="0" w:color="BEBEBE"/>
+              <w:top w:val="single" w:sz="12" w:space="0" w:color="BEBEBE"/>
+              <w:left w:val="none" w:sz="0" w:space="0" w:color="000000"/>
+              <w:right w:val="none" w:sz="0" w:space="0" w:color="000000"/>
+            </w:tcBorders>
+            <w:shd w:val="clear" w:color="auto" w:fill="FFFFFF"/>
+            <w:tcMar>
+              <w:top w:w="0" w:type="dxa"/>
+              <w:bottom w:w="0" w:type="dxa"/>
+              <w:left w:w="0" w:type="dxa"/>
+              <w:right w:w="0" w:type="dxa"/>
+            </w:tcMar>
+            <w:vAlign w:val="center"/>
+          </w:tcPr>
           <w:p>
             <w:pPr>
-              <w:pStyle w:val="Compact"/>
+              <w:pStyle w:val="Normal"/>
+              <w:jc w:val="left"/>
+              <w:pBdr>
+                <w:bottom w:val="none" w:sz="0" w:space="0" w:color="000000"/>
+                <w:top w:val="none" w:sz="0" w:space="0" w:color="000000"/>
+                <w:left w:val="none" w:sz="0" w:space="0" w:color="000000"/>
+                <w:right w:val="none" w:sz="0" w:space="0" w:color="000000"/>
+              </w:pBdr>
+              <w:spacing w:after="60" w:before="60" w:line="312"/>
+              <w:ind w:left="80" w:right="80" w:firstLine="0" w:firstLineChars="0"/>
+              <w:rPr>
+                <w:rFonts w:ascii="Arial" w:hAnsi="Arial" w:eastAsia="Arial" w:cs="Arial"/>
+                <w:i w:val="false"/>
+                <w:b w:val="false"/>
+                <w:u w:val="none"/>
+                <w:sz w:val="24"/>
+                <w:szCs w:val="24"/>
+                <w:color w:val="000000"/>
+              </w:rPr>
             </w:pPr>
+            <w:r xmlns:w="http://schemas.openxmlformats.org/wordprocessingml/2006/main" xmlns:wp="http://schemas.openxmlformats.org/drawingml/2006/wordprocessingDrawing" xmlns:r="http://schemas.openxmlformats.org/officeDocument/2006/relationships" xmlns:w14="http://schemas.microsoft.com/office/word/2010/wordml">
+              <w:rPr>
+                <w:rFonts w:ascii="Arial" w:hAnsi="Arial" w:eastAsia="Arial" w:cs="Arial"/>
+                <w:i w:val="false"/>
+                <w:b w:val="false"/>
+                <w:u w:val="none"/>
+                <w:sz w:val="24"/>
+                <w:szCs w:val="24"/>
+                <w:color w:val="000000"/>
+              </w:rPr>
+              <w:t xml:space="preserve">Source</w:t>
+            </w:r>
           </w:p>
         </w:tc>
         <w:tc>
-          <w:tcPr/>
+          <w:tcPr>
+            <w:tcBorders>
+              <w:bottom w:val="single" w:sz="12" w:space="0" w:color="BEBEBE"/>
+              <w:top w:val="single" w:sz="12" w:space="0" w:color="BEBEBE"/>
+              <w:left w:val="none" w:sz="0" w:space="0" w:color="000000"/>
+              <w:right w:val="none" w:sz="0" w:space="0" w:color="000000"/>
+            </w:tcBorders>
+            <w:shd w:val="clear" w:color="auto" w:fill="FFFFFF"/>
+            <w:tcMar>
+              <w:top w:w="0" w:type="dxa"/>
+              <w:bottom w:w="0" w:type="dxa"/>
+              <w:left w:w="0" w:type="dxa"/>
+              <w:right w:w="0" w:type="dxa"/>
+            </w:tcMar>
+            <w:vAlign w:val="center"/>
+          </w:tcPr>
           <w:p>
             <w:pPr>
-              <w:pStyle w:val="Compact"/>
+              <w:pStyle w:val="Normal"/>
               <w:jc w:val="right"/>
+              <w:pBdr>
+                <w:bottom w:val="none" w:sz="0" w:space="0" w:color="000000"/>
+                <w:top w:val="none" w:sz="0" w:space="0" w:color="000000"/>
+                <w:left w:val="none" w:sz="0" w:space="0" w:color="000000"/>
+                <w:right w:val="none" w:sz="0" w:space="0" w:color="000000"/>
+              </w:pBdr>
+              <w:spacing w:after="60" w:before="60" w:line="312"/>
+              <w:ind w:left="80" w:right="80" w:firstLine="0" w:firstLineChars="0"/>
+              <w:rPr>
+                <w:rFonts w:ascii="Arial" w:hAnsi="Arial" w:eastAsia="Arial" w:cs="Arial"/>
+                <w:i w:val="false"/>
+                <w:b w:val="false"/>
+                <w:u w:val="none"/>
+                <w:sz w:val="24"/>
+                <w:szCs w:val="24"/>
+                <w:color w:val="000000"/>
+              </w:rPr>
             </w:pPr>
-            <w:r>
+            <w:r xmlns:w="http://schemas.openxmlformats.org/wordprocessingml/2006/main" xmlns:wp="http://schemas.openxmlformats.org/drawingml/2006/wordprocessingDrawing" xmlns:r="http://schemas.openxmlformats.org/officeDocument/2006/relationships" xmlns:w14="http://schemas.microsoft.com/office/word/2010/wordml">
+              <w:rPr>
+                <w:rFonts w:ascii="Arial" w:hAnsi="Arial" w:eastAsia="Arial" w:cs="Arial"/>
+                <w:i w:val="false"/>
+                <w:b w:val="false"/>
+                <w:u w:val="none"/>
+                <w:sz w:val="24"/>
+                <w:szCs w:val="24"/>
+                <w:color w:val="000000"/>
+              </w:rPr>
               <w:t xml:space="preserve">Df</w:t>
             </w:r>
           </w:p>
         </w:tc>
         <w:tc>
-          <w:tcPr/>
+          <w:tcPr>
+            <w:tcBorders>
+              <w:bottom w:val="single" w:sz="12" w:space="0" w:color="BEBEBE"/>
+              <w:top w:val="single" w:sz="12" w:space="0" w:color="BEBEBE"/>
+              <w:left w:val="none" w:sz="0" w:space="0" w:color="000000"/>
+              <w:right w:val="none" w:sz="0" w:space="0" w:color="000000"/>
+            </w:tcBorders>
+            <w:shd w:val="clear" w:color="auto" w:fill="FFFFFF"/>
+            <w:tcMar>
+              <w:top w:w="0" w:type="dxa"/>
+              <w:bottom w:w="0" w:type="dxa"/>
+              <w:left w:w="0" w:type="dxa"/>
+              <w:right w:w="0" w:type="dxa"/>
+            </w:tcMar>
+            <w:vAlign w:val="center"/>
+          </w:tcPr>
           <w:p>
             <w:pPr>
-              <w:pStyle w:val="Compact"/>
+              <w:pStyle w:val="Normal"/>
               <w:jc w:val="right"/>
+              <w:pBdr>
+                <w:bottom w:val="none" w:sz="0" w:space="0" w:color="000000"/>
+                <w:top w:val="none" w:sz="0" w:space="0" w:color="000000"/>
+                <w:left w:val="none" w:sz="0" w:space="0" w:color="000000"/>
+                <w:right w:val="none" w:sz="0" w:space="0" w:color="000000"/>
+              </w:pBdr>
+              <w:spacing w:after="60" w:before="60" w:line="312"/>
+              <w:ind w:left="80" w:right="80" w:firstLine="0" w:firstLineChars="0"/>
+              <w:rPr>
+                <w:rFonts w:ascii="Arial" w:hAnsi="Arial" w:eastAsia="Arial" w:cs="Arial"/>
+                <w:i w:val="false"/>
+                <w:b w:val="false"/>
+                <w:u w:val="none"/>
+                <w:sz w:val="24"/>
+                <w:szCs w:val="24"/>
+                <w:color w:val="000000"/>
+              </w:rPr>
             </w:pPr>
-            <w:r>
-              <w:t xml:space="preserve">Sum.Sq</w:t>
+            <w:r xmlns:w="http://schemas.openxmlformats.org/wordprocessingml/2006/main" xmlns:wp="http://schemas.openxmlformats.org/drawingml/2006/wordprocessingDrawing" xmlns:r="http://schemas.openxmlformats.org/officeDocument/2006/relationships" xmlns:w14="http://schemas.microsoft.com/office/word/2010/wordml">
+              <w:rPr>
+                <w:rFonts w:ascii="Arial" w:hAnsi="Arial" w:eastAsia="Arial" w:cs="Arial"/>
+                <w:i w:val="false"/>
+                <w:b w:val="false"/>
+                <w:u w:val="none"/>
+                <w:sz w:val="24"/>
+                <w:szCs w:val="24"/>
+                <w:color w:val="000000"/>
+              </w:rPr>
+              <w:t xml:space="preserve">SS</w:t>
             </w:r>
           </w:p>
         </w:tc>
         <w:tc>
-          <w:tcPr/>
+          <w:tcPr>
+            <w:tcBorders>
+              <w:bottom w:val="single" w:sz="12" w:space="0" w:color="BEBEBE"/>
+              <w:top w:val="single" w:sz="12" w:space="0" w:color="BEBEBE"/>
+              <w:left w:val="none" w:sz="0" w:space="0" w:color="000000"/>
+              <w:right w:val="none" w:sz="0" w:space="0" w:color="000000"/>
+            </w:tcBorders>
+            <w:shd w:val="clear" w:color="auto" w:fill="FFFFFF"/>
+            <w:tcMar>
+              <w:top w:w="0" w:type="dxa"/>
+              <w:bottom w:w="0" w:type="dxa"/>
+              <w:left w:w="0" w:type="dxa"/>
+              <w:right w:w="0" w:type="dxa"/>
+            </w:tcMar>
+            <w:vAlign w:val="center"/>
+          </w:tcPr>
           <w:p>
             <w:pPr>
-              <w:pStyle w:val="Compact"/>
+              <w:pStyle w:val="Normal"/>
               <w:jc w:val="right"/>
+              <w:pBdr>
+                <w:bottom w:val="none" w:sz="0" w:space="0" w:color="000000"/>
+                <w:top w:val="none" w:sz="0" w:space="0" w:color="000000"/>
+                <w:left w:val="none" w:sz="0" w:space="0" w:color="000000"/>
+                <w:right w:val="none" w:sz="0" w:space="0" w:color="000000"/>
+              </w:pBdr>
+              <w:spacing w:after="60" w:before="60" w:line="312"/>
+              <w:ind w:left="80" w:right="80" w:firstLine="0" w:firstLineChars="0"/>
+              <w:rPr>
+                <w:rFonts w:ascii="Arial" w:hAnsi="Arial" w:eastAsia="Arial" w:cs="Arial"/>
+                <w:i w:val="false"/>
+                <w:b w:val="false"/>
+                <w:u w:val="none"/>
+                <w:sz w:val="24"/>
+                <w:szCs w:val="24"/>
+                <w:color w:val="000000"/>
+              </w:rPr>
             </w:pPr>
-            <w:r>
-              <w:t xml:space="preserve">Mean.Sq</w:t>
+            <w:r xmlns:w="http://schemas.openxmlformats.org/wordprocessingml/2006/main" xmlns:wp="http://schemas.openxmlformats.org/drawingml/2006/wordprocessingDrawing" xmlns:r="http://schemas.openxmlformats.org/officeDocument/2006/relationships" xmlns:w14="http://schemas.microsoft.com/office/word/2010/wordml">
+              <w:rPr>
+                <w:rFonts w:ascii="Arial" w:hAnsi="Arial" w:eastAsia="Arial" w:cs="Arial"/>
+                <w:i w:val="false"/>
+                <w:b w:val="false"/>
+                <w:u w:val="none"/>
+                <w:sz w:val="24"/>
+                <w:szCs w:val="24"/>
+                <w:color w:val="000000"/>
+              </w:rPr>
+              <w:t xml:space="preserve">MS</w:t>
             </w:r>
           </w:p>
         </w:tc>
         <w:tc>
-          <w:tcPr/>
+          <w:tcPr>
+            <w:tcBorders>
+              <w:bottom w:val="single" w:sz="12" w:space="0" w:color="BEBEBE"/>
+              <w:top w:val="single" w:sz="12" w:space="0" w:color="BEBEBE"/>
+              <w:left w:val="none" w:sz="0" w:space="0" w:color="000000"/>
+              <w:right w:val="none" w:sz="0" w:space="0" w:color="000000"/>
+            </w:tcBorders>
+            <w:shd w:val="clear" w:color="auto" w:fill="FFFFFF"/>
+            <w:tcMar>
+              <w:top w:w="0" w:type="dxa"/>
+              <w:bottom w:w="0" w:type="dxa"/>
+              <w:left w:w="0" w:type="dxa"/>
+              <w:right w:w="0" w:type="dxa"/>
+            </w:tcMar>
+            <w:vAlign w:val="center"/>
+          </w:tcPr>
           <w:p>
             <w:pPr>
-              <w:pStyle w:val="Compact"/>
+              <w:pStyle w:val="Normal"/>
               <w:jc w:val="right"/>
+              <w:pBdr>
+                <w:bottom w:val="none" w:sz="0" w:space="0" w:color="000000"/>
+                <w:top w:val="none" w:sz="0" w:space="0" w:color="000000"/>
+                <w:left w:val="none" w:sz="0" w:space="0" w:color="000000"/>
+                <w:right w:val="none" w:sz="0" w:space="0" w:color="000000"/>
+              </w:pBdr>
+              <w:spacing w:after="60" w:before="60" w:line="312"/>
+              <w:ind w:left="80" w:right="80" w:firstLine="0" w:firstLineChars="0"/>
+              <w:rPr>
+                <w:rFonts w:ascii="Arial" w:hAnsi="Arial" w:eastAsia="Arial" w:cs="Arial"/>
+                <w:i w:val="false"/>
+                <w:b w:val="false"/>
+                <w:u w:val="none"/>
+                <w:sz w:val="24"/>
+                <w:szCs w:val="24"/>
+                <w:color w:val="000000"/>
+              </w:rPr>
             </w:pPr>
-            <w:r>
-              <w:t xml:space="preserve">F.value</w:t>
+            <w:r xmlns:w="http://schemas.openxmlformats.org/wordprocessingml/2006/main" xmlns:wp="http://schemas.openxmlformats.org/drawingml/2006/wordprocessingDrawing" xmlns:r="http://schemas.openxmlformats.org/officeDocument/2006/relationships" xmlns:w14="http://schemas.microsoft.com/office/word/2010/wordml">
+              <w:rPr>
+                <w:rFonts w:ascii="Arial" w:hAnsi="Arial" w:eastAsia="Arial" w:cs="Arial"/>
+                <w:i w:val="false"/>
+                <w:b w:val="false"/>
+                <w:u w:val="none"/>
+                <w:sz w:val="24"/>
+                <w:szCs w:val="24"/>
+                <w:color w:val="000000"/>
+              </w:rPr>
+              <w:t xml:space="preserve">F-value</w:t>
             </w:r>
           </w:p>
         </w:tc>
         <w:tc>
-          <w:tcPr/>
+          <w:tcPr>
+            <w:tcBorders>
+              <w:bottom w:val="single" w:sz="12" w:space="0" w:color="BEBEBE"/>
+              <w:top w:val="single" w:sz="12" w:space="0" w:color="BEBEBE"/>
+              <w:left w:val="none" w:sz="0" w:space="0" w:color="000000"/>
+              <w:right w:val="none" w:sz="0" w:space="0" w:color="000000"/>
+            </w:tcBorders>
+            <w:shd w:val="clear" w:color="auto" w:fill="FFFFFF"/>
+            <w:tcMar>
+              <w:top w:w="0" w:type="dxa"/>
+              <w:bottom w:w="0" w:type="dxa"/>
+              <w:left w:w="0" w:type="dxa"/>
+              <w:right w:w="0" w:type="dxa"/>
+            </w:tcMar>
+            <w:vAlign w:val="center"/>
+          </w:tcPr>
           <w:p>
             <w:pPr>
-              <w:pStyle w:val="Compact"/>
+              <w:pStyle w:val="Normal"/>
               <w:jc w:val="right"/>
+              <w:pBdr>
+                <w:bottom w:val="none" w:sz="0" w:space="0" w:color="000000"/>
+                <w:top w:val="none" w:sz="0" w:space="0" w:color="000000"/>
+                <w:left w:val="none" w:sz="0" w:space="0" w:color="000000"/>
+                <w:right w:val="none" w:sz="0" w:space="0" w:color="000000"/>
+              </w:pBdr>
+              <w:spacing w:after="60" w:before="60" w:line="312"/>
+              <w:ind w:left="80" w:right="80" w:firstLine="0" w:firstLineChars="0"/>
+              <w:rPr>
+                <w:rFonts w:ascii="Arial" w:hAnsi="Arial" w:eastAsia="Arial" w:cs="Arial"/>
+                <w:i w:val="false"/>
+                <w:b w:val="false"/>
+                <w:u w:val="none"/>
+                <w:sz w:val="24"/>
+                <w:szCs w:val="24"/>
+                <w:color w:val="000000"/>
+              </w:rPr>
             </w:pPr>
-            <w:r>
-              <w:t xml:space="preserve">Pr..F.</w:t>
+            <w:r xmlns:w="http://schemas.openxmlformats.org/wordprocessingml/2006/main" xmlns:wp="http://schemas.openxmlformats.org/drawingml/2006/wordprocessingDrawing" xmlns:r="http://schemas.openxmlformats.org/officeDocument/2006/relationships" xmlns:w14="http://schemas.microsoft.com/office/word/2010/wordml">
+              <w:rPr>
+                <w:rFonts w:ascii="Arial" w:hAnsi="Arial" w:eastAsia="Arial" w:cs="Arial"/>
+                <w:i w:val="false"/>
+                <w:b w:val="false"/>
+                <w:u w:val="none"/>
+                <w:sz w:val="24"/>
+                <w:szCs w:val="24"/>
+                <w:color w:val="000000"/>
+              </w:rPr>
+              <w:t xml:space="preserve">P-value</w:t>
             </w:r>
           </w:p>
         </w:tc>
       </w:tr>
       <w:tr>
+        <w:trPr>
+          <w:trHeight w:val="526" w:hRule="auto"/>
+        </w:trPr>
+        body1
         <w:tc>
-          <w:tcPr/>
+          <w:tcPr>
+            <w:tcBorders>
+              <w:bottom w:val="none" w:sz="0" w:space="0" w:color="000000"/>
+              <w:top w:val="single" w:sz="12" w:space="0" w:color="BEBEBE"/>
+              <w:left w:val="none" w:sz="0" w:space="0" w:color="000000"/>
+              <w:right w:val="none" w:sz="0" w:space="0" w:color="000000"/>
+            </w:tcBorders>
+            <w:shd w:val="clear" w:color="auto" w:fill="FFFFFF"/>
+            <w:tcMar>
+              <w:top w:w="0" w:type="dxa"/>
+              <w:bottom w:w="0" w:type="dxa"/>
+              <w:left w:w="0" w:type="dxa"/>
+              <w:right w:w="0" w:type="dxa"/>
+            </w:tcMar>
+            <w:vAlign w:val="center"/>
+          </w:tcPr>
           <w:p>
             <w:pPr>
-              <w:pStyle w:val="Compact"/>
+              <w:pStyle w:val="Normal"/>
               <w:jc w:val="left"/>
+              <w:pBdr>
+                <w:bottom w:val="none" w:sz="0" w:space="0" w:color="000000"/>
+                <w:top w:val="none" w:sz="0" w:space="0" w:color="000000"/>
+                <w:left w:val="none" w:sz="0" w:space="0" w:color="000000"/>
+                <w:right w:val="none" w:sz="0" w:space="0" w:color="000000"/>
+              </w:pBdr>
+              <w:spacing w:after="60" w:before="60" w:line="312"/>
+              <w:ind w:left="80" w:right="80" w:firstLine="0" w:firstLineChars="0"/>
+              <w:rPr>
+                <w:rFonts w:ascii="Arial" w:hAnsi="Arial" w:eastAsia="Arial" w:cs="Arial"/>
+                <w:i w:val="false"/>
+                <w:b w:val="false"/>
+                <w:u w:val="none"/>
+                <w:sz w:val="24"/>
+                <w:szCs w:val="24"/>
+                <w:color w:val="000000"/>
+              </w:rPr>
             </w:pPr>
-            <w:r>
-              <w:t xml:space="preserve">region</w:t>
+            <w:r xmlns:w="http://schemas.openxmlformats.org/wordprocessingml/2006/main" xmlns:wp="http://schemas.openxmlformats.org/drawingml/2006/wordprocessingDrawing" xmlns:r="http://schemas.openxmlformats.org/officeDocument/2006/relationships" xmlns:w14="http://schemas.microsoft.com/office/word/2010/wordml">
+              <w:rPr>
+                <w:rFonts w:ascii="Arial" w:hAnsi="Arial" w:eastAsia="Arial" w:cs="Arial"/>
+                <w:i w:val="false"/>
+                <w:b w:val="false"/>
+                <w:u w:val="none"/>
+                <w:sz w:val="24"/>
+                <w:szCs w:val="24"/>
+                <w:color w:val="000000"/>
+              </w:rPr>
+              <w:t xml:space="preserve">Region</w:t>
             </w:r>
           </w:p>
         </w:tc>
         <w:tc>
-          <w:tcPr/>
+          <w:tcPr>
+            <w:tcBorders>
+              <w:bottom w:val="none" w:sz="0" w:space="0" w:color="000000"/>
+              <w:top w:val="single" w:sz="12" w:space="0" w:color="BEBEBE"/>
+              <w:left w:val="none" w:sz="0" w:space="0" w:color="000000"/>
+              <w:right w:val="none" w:sz="0" w:space="0" w:color="000000"/>
+            </w:tcBorders>
+            <w:shd w:val="clear" w:color="auto" w:fill="FFFFFF"/>
+            <w:tcMar>
+              <w:top w:w="0" w:type="dxa"/>
+              <w:bottom w:w="0" w:type="dxa"/>
+              <w:left w:w="0" w:type="dxa"/>
+              <w:right w:w="0" w:type="dxa"/>
+            </w:tcMar>
+            <w:vAlign w:val="center"/>
+          </w:tcPr>
           <w:p>
             <w:pPr>
-              <w:pStyle w:val="Compact"/>
+              <w:pStyle w:val="Normal"/>
               <w:jc w:val="right"/>
+              <w:pBdr>
+                <w:bottom w:val="none" w:sz="0" w:space="0" w:color="000000"/>
+                <w:top w:val="none" w:sz="0" w:space="0" w:color="000000"/>
+                <w:left w:val="none" w:sz="0" w:space="0" w:color="000000"/>
+                <w:right w:val="none" w:sz="0" w:space="0" w:color="000000"/>
+              </w:pBdr>
+              <w:spacing w:after="60" w:before="60" w:line="312"/>
+              <w:ind w:left="80" w:right="80" w:firstLine="0" w:firstLineChars="0"/>
+              <w:rPr>
+                <w:rFonts w:ascii="Arial" w:hAnsi="Arial" w:eastAsia="Arial" w:cs="Arial"/>
+                <w:i w:val="false"/>
+                <w:b w:val="false"/>
+                <w:u w:val="none"/>
+                <w:sz w:val="24"/>
+                <w:szCs w:val="24"/>
+                <w:color w:val="000000"/>
+              </w:rPr>
             </w:pPr>
-            <w:r>
+            <w:r xmlns:w="http://schemas.openxmlformats.org/wordprocessingml/2006/main" xmlns:wp="http://schemas.openxmlformats.org/drawingml/2006/wordprocessingDrawing" xmlns:r="http://schemas.openxmlformats.org/officeDocument/2006/relationships" xmlns:w14="http://schemas.microsoft.com/office/word/2010/wordml">
+              <w:rPr>
+                <w:rFonts w:ascii="Arial" w:hAnsi="Arial" w:eastAsia="Arial" w:cs="Arial"/>
+                <w:i w:val="false"/>
+                <w:b w:val="false"/>
+                <w:u w:val="none"/>
+                <w:sz w:val="24"/>
+                <w:szCs w:val="24"/>
+                <w:color w:val="000000"/>
+              </w:rPr>
               <w:t xml:space="preserve">3</w:t>
             </w:r>
           </w:p>
         </w:tc>
         <w:tc>
-          <w:tcPr/>
+          <w:tcPr>
+            <w:tcBorders>
+              <w:bottom w:val="none" w:sz="0" w:space="0" w:color="000000"/>
+              <w:top w:val="single" w:sz="12" w:space="0" w:color="BEBEBE"/>
+              <w:left w:val="none" w:sz="0" w:space="0" w:color="000000"/>
+              <w:right w:val="none" w:sz="0" w:space="0" w:color="000000"/>
+            </w:tcBorders>
+            <w:shd w:val="clear" w:color="auto" w:fill="FFFFFF"/>
+            <w:tcMar>
+              <w:top w:w="0" w:type="dxa"/>
+              <w:bottom w:w="0" w:type="dxa"/>
+              <w:left w:w="0" w:type="dxa"/>
+              <w:right w:w="0" w:type="dxa"/>
+            </w:tcMar>
+            <w:vAlign w:val="center"/>
+          </w:tcPr>
           <w:p>
             <w:pPr>
-              <w:pStyle w:val="Compact"/>
+              <w:pStyle w:val="Normal"/>
               <w:jc w:val="right"/>
+              <w:pBdr>
+                <w:bottom w:val="none" w:sz="0" w:space="0" w:color="000000"/>
+                <w:top w:val="none" w:sz="0" w:space="0" w:color="000000"/>
+                <w:left w:val="none" w:sz="0" w:space="0" w:color="000000"/>
+                <w:right w:val="none" w:sz="0" w:space="0" w:color="000000"/>
+              </w:pBdr>
+              <w:spacing w:after="60" w:before="60" w:line="312"/>
+              <w:ind w:left="80" w:right="80" w:firstLine="0" w:firstLineChars="0"/>
+              <w:rPr>
+                <w:rFonts w:ascii="Arial" w:hAnsi="Arial" w:eastAsia="Arial" w:cs="Arial"/>
+                <w:i w:val="false"/>
+                <w:b w:val="false"/>
+                <w:u w:val="none"/>
+                <w:sz w:val="24"/>
+                <w:szCs w:val="24"/>
+                <w:color w:val="000000"/>
+              </w:rPr>
             </w:pPr>
-            <w:r>
-              <w:t xml:space="preserve">1300759681</w:t>
+            <w:r xmlns:w="http://schemas.openxmlformats.org/wordprocessingml/2006/main" xmlns:wp="http://schemas.openxmlformats.org/drawingml/2006/wordprocessingDrawing" xmlns:r="http://schemas.openxmlformats.org/officeDocument/2006/relationships" xmlns:w14="http://schemas.microsoft.com/office/word/2010/wordml">
+              <w:rPr>
+                <w:rFonts w:ascii="Arial" w:hAnsi="Arial" w:eastAsia="Arial" w:cs="Arial"/>
+                <w:i w:val="false"/>
+                <w:b w:val="false"/>
+                <w:u w:val="none"/>
+                <w:sz w:val="24"/>
+                <w:szCs w:val="24"/>
+                <w:color w:val="000000"/>
+              </w:rPr>
+              <w:t xml:space="preserve">1,300,759,681</w:t>
             </w:r>
           </w:p>
         </w:tc>
         <w:tc>
-          <w:tcPr/>
+          <w:tcPr>
+            <w:tcBorders>
+              <w:bottom w:val="none" w:sz="0" w:space="0" w:color="000000"/>
+              <w:top w:val="single" w:sz="12" w:space="0" w:color="BEBEBE"/>
+              <w:left w:val="none" w:sz="0" w:space="0" w:color="000000"/>
+              <w:right w:val="none" w:sz="0" w:space="0" w:color="000000"/>
+            </w:tcBorders>
+            <w:shd w:val="clear" w:color="auto" w:fill="FFFFFF"/>
+            <w:tcMar>
+              <w:top w:w="0" w:type="dxa"/>
+              <w:bottom w:w="0" w:type="dxa"/>
+              <w:left w:w="0" w:type="dxa"/>
+              <w:right w:w="0" w:type="dxa"/>
+            </w:tcMar>
+            <w:vAlign w:val="center"/>
+          </w:tcPr>
           <w:p>
             <w:pPr>
-              <w:pStyle w:val="Compact"/>
+              <w:pStyle w:val="Normal"/>
               <w:jc w:val="right"/>
+              <w:pBdr>
+                <w:bottom w:val="none" w:sz="0" w:space="0" w:color="000000"/>
+                <w:top w:val="none" w:sz="0" w:space="0" w:color="000000"/>
+                <w:left w:val="none" w:sz="0" w:space="0" w:color="000000"/>
+                <w:right w:val="none" w:sz="0" w:space="0" w:color="000000"/>
+              </w:pBdr>
+              <w:spacing w:after="60" w:before="60" w:line="312"/>
+              <w:ind w:left="80" w:right="80" w:firstLine="0" w:firstLineChars="0"/>
+              <w:rPr>
+                <w:rFonts w:ascii="Arial" w:hAnsi="Arial" w:eastAsia="Arial" w:cs="Arial"/>
+                <w:i w:val="false"/>
+                <w:b w:val="false"/>
+                <w:u w:val="none"/>
+                <w:sz w:val="24"/>
+                <w:szCs w:val="24"/>
+                <w:color w:val="000000"/>
+              </w:rPr>
             </w:pPr>
-            <w:r>
-              <w:t xml:space="preserve">433586560</w:t>
+            <w:r xmlns:w="http://schemas.openxmlformats.org/wordprocessingml/2006/main" xmlns:wp="http://schemas.openxmlformats.org/drawingml/2006/wordprocessingDrawing" xmlns:r="http://schemas.openxmlformats.org/officeDocument/2006/relationships" xmlns:w14="http://schemas.microsoft.com/office/word/2010/wordml">
+              <w:rPr>
+                <w:rFonts w:ascii="Arial" w:hAnsi="Arial" w:eastAsia="Arial" w:cs="Arial"/>
+                <w:i w:val="false"/>
+                <w:b w:val="false"/>
+                <w:u w:val="none"/>
+                <w:sz w:val="24"/>
+                <w:szCs w:val="24"/>
+                <w:color w:val="000000"/>
+              </w:rPr>
+              <w:t xml:space="preserve">433,586,560</w:t>
             </w:r>
           </w:p>
         </w:tc>
         <w:tc>
-          <w:tcPr/>
+          <w:tcPr>
+            <w:tcBorders>
+              <w:bottom w:val="none" w:sz="0" w:space="0" w:color="000000"/>
+              <w:top w:val="single" w:sz="12" w:space="0" w:color="BEBEBE"/>
+              <w:left w:val="none" w:sz="0" w:space="0" w:color="000000"/>
+              <w:right w:val="none" w:sz="0" w:space="0" w:color="000000"/>
+            </w:tcBorders>
+            <w:shd w:val="clear" w:color="auto" w:fill="FFFFFF"/>
+            <w:tcMar>
+              <w:top w:w="0" w:type="dxa"/>
+              <w:bottom w:w="0" w:type="dxa"/>
+              <w:left w:w="0" w:type="dxa"/>
+              <w:right w:w="0" w:type="dxa"/>
+            </w:tcMar>
+            <w:vAlign w:val="center"/>
+          </w:tcPr>
           <w:p>
             <w:pPr>
-              <w:pStyle w:val="Compact"/>
+              <w:pStyle w:val="Normal"/>
               <w:jc w:val="right"/>
+              <w:pBdr>
+                <w:bottom w:val="none" w:sz="0" w:space="0" w:color="000000"/>
+                <w:top w:val="none" w:sz="0" w:space="0" w:color="000000"/>
+                <w:left w:val="none" w:sz="0" w:space="0" w:color="000000"/>
+                <w:right w:val="none" w:sz="0" w:space="0" w:color="000000"/>
+              </w:pBdr>
+              <w:spacing w:after="60" w:before="60" w:line="312"/>
+              <w:ind w:left="80" w:right="80" w:firstLine="0" w:firstLineChars="0"/>
+              <w:rPr>
+                <w:rFonts w:ascii="Arial" w:hAnsi="Arial" w:eastAsia="Arial" w:cs="Arial"/>
+                <w:i w:val="false"/>
+                <w:b w:val="false"/>
+                <w:u w:val="none"/>
+                <w:sz w:val="24"/>
+                <w:szCs w:val="24"/>
+                <w:color w:val="000000"/>
+              </w:rPr>
             </w:pPr>
-            <w:r>
-              <w:t xml:space="preserve">2.9752836</w:t>
+            <w:r xmlns:w="http://schemas.openxmlformats.org/wordprocessingml/2006/main" xmlns:wp="http://schemas.openxmlformats.org/drawingml/2006/wordprocessingDrawing" xmlns:r="http://schemas.openxmlformats.org/officeDocument/2006/relationships" xmlns:w14="http://schemas.microsoft.com/office/word/2010/wordml">
+              <w:rPr>
+                <w:rFonts w:ascii="Arial" w:hAnsi="Arial" w:eastAsia="Arial" w:cs="Arial"/>
+                <w:i w:val="false"/>
+                <w:b w:val="false"/>
+                <w:u w:val="none"/>
+                <w:sz w:val="24"/>
+                <w:szCs w:val="24"/>
+                <w:color w:val="000000"/>
+              </w:rPr>
+              <w:t xml:space="preserve">2.9753</w:t>
             </w:r>
           </w:p>
         </w:tc>
         <w:tc>
-          <w:tcPr/>
+          <w:tcPr>
+            <w:tcBorders>
+              <w:bottom w:val="none" w:sz="0" w:space="0" w:color="000000"/>
+              <w:top w:val="single" w:sz="12" w:space="0" w:color="BEBEBE"/>
+              <w:left w:val="none" w:sz="0" w:space="0" w:color="000000"/>
+              <w:right w:val="none" w:sz="0" w:space="0" w:color="000000"/>
+            </w:tcBorders>
+            <w:shd w:val="clear" w:color="auto" w:fill="FFFFFF"/>
+            <w:tcMar>
+              <w:top w:w="0" w:type="dxa"/>
+              <w:bottom w:w="0" w:type="dxa"/>
+              <w:left w:w="0" w:type="dxa"/>
+              <w:right w:w="0" w:type="dxa"/>
+            </w:tcMar>
+            <w:vAlign w:val="center"/>
+          </w:tcPr>
           <w:p>
             <w:pPr>
-              <w:pStyle w:val="Compact"/>
+              <w:pStyle w:val="Normal"/>
               <w:jc w:val="right"/>
+              <w:pBdr>
+                <w:bottom w:val="none" w:sz="0" w:space="0" w:color="000000"/>
+                <w:top w:val="none" w:sz="0" w:space="0" w:color="000000"/>
+                <w:left w:val="none" w:sz="0" w:space="0" w:color="000000"/>
+                <w:right w:val="none" w:sz="0" w:space="0" w:color="000000"/>
+              </w:pBdr>
+              <w:spacing w:after="60" w:before="60" w:line="312"/>
+              <w:ind w:left="80" w:right="80" w:firstLine="0" w:firstLineChars="0"/>
+              <w:rPr>
+                <w:rFonts w:ascii="Arial" w:hAnsi="Arial" w:eastAsia="Arial" w:cs="Arial"/>
+                <w:i w:val="false"/>
+                <w:b w:val="false"/>
+                <w:u w:val="none"/>
+                <w:sz w:val="24"/>
+                <w:szCs w:val="24"/>
+                <w:color w:val="000000"/>
+              </w:rPr>
             </w:pPr>
-            <w:r>
-              <w:t xml:space="preserve">0.0306591</w:t>
+            <w:r xmlns:w="http://schemas.openxmlformats.org/wordprocessingml/2006/main" xmlns:wp="http://schemas.openxmlformats.org/drawingml/2006/wordprocessingDrawing" xmlns:r="http://schemas.openxmlformats.org/officeDocument/2006/relationships" xmlns:w14="http://schemas.microsoft.com/office/word/2010/wordml">
+              <w:rPr>
+                <w:rFonts w:ascii="Arial" w:hAnsi="Arial" w:eastAsia="Arial" w:cs="Arial"/>
+                <w:i w:val="false"/>
+                <w:b w:val="false"/>
+                <w:u w:val="none"/>
+                <w:sz w:val="24"/>
+                <w:szCs w:val="24"/>
+                <w:color w:val="000000"/>
+              </w:rPr>
+              <w:t xml:space="preserve">0.0307</w:t>
             </w:r>
           </w:p>
         </w:tc>
       </w:tr>
       <w:tr>
+        <w:trPr>
+          <w:trHeight w:val="510" w:hRule="auto"/>
+        </w:trPr>
+        body2
         <w:tc>
-          <w:tcPr/>
+          <w:tcPr>
+            <w:tcBorders>
+              <w:bottom w:val="none" w:sz="0" w:space="0" w:color="000000"/>
+              <w:top w:val="none" w:sz="0" w:space="0" w:color="000000"/>
+              <w:left w:val="none" w:sz="0" w:space="0" w:color="000000"/>
+              <w:right w:val="none" w:sz="0" w:space="0" w:color="000000"/>
+            </w:tcBorders>
+            <w:shd w:val="clear" w:color="auto" w:fill="FFFFFF"/>
+            <w:tcMar>
+              <w:top w:w="0" w:type="dxa"/>
+              <w:bottom w:w="0" w:type="dxa"/>
+              <w:left w:w="0" w:type="dxa"/>
+              <w:right w:w="0" w:type="dxa"/>
+            </w:tcMar>
+            <w:vAlign w:val="center"/>
+          </w:tcPr>
           <w:p>
             <w:pPr>
-              <w:pStyle w:val="Compact"/>
+              <w:pStyle w:val="Normal"/>
               <w:jc w:val="left"/>
+              <w:pBdr>
+                <w:bottom w:val="none" w:sz="0" w:space="0" w:color="000000"/>
+                <w:top w:val="none" w:sz="0" w:space="0" w:color="000000"/>
+                <w:left w:val="none" w:sz="0" w:space="0" w:color="000000"/>
+                <w:right w:val="none" w:sz="0" w:space="0" w:color="000000"/>
+              </w:pBdr>
+              <w:spacing w:after="60" w:before="60" w:line="312"/>
+              <w:ind w:left="80" w:right="80" w:firstLine="0" w:firstLineChars="0"/>
+              <w:rPr>
+                <w:rFonts w:ascii="Arial" w:hAnsi="Arial" w:eastAsia="Arial" w:cs="Arial"/>
+                <w:i w:val="false"/>
+                <w:b w:val="false"/>
+                <w:u w:val="none"/>
+                <w:sz w:val="24"/>
+                <w:szCs w:val="24"/>
+                <w:color w:val="000000"/>
+              </w:rPr>
             </w:pPr>
-            <w:r>
-              <w:t xml:space="preserve">sex</w:t>
+            <w:r xmlns:w="http://schemas.openxmlformats.org/wordprocessingml/2006/main" xmlns:wp="http://schemas.openxmlformats.org/drawingml/2006/wordprocessingDrawing" xmlns:r="http://schemas.openxmlformats.org/officeDocument/2006/relationships" xmlns:w14="http://schemas.microsoft.com/office/word/2010/wordml">
+              <w:rPr>
+                <w:rFonts w:ascii="Arial" w:hAnsi="Arial" w:eastAsia="Arial" w:cs="Arial"/>
+                <w:i w:val="false"/>
+                <w:b w:val="false"/>
+                <w:u w:val="none"/>
+                <w:sz w:val="24"/>
+                <w:szCs w:val="24"/>
+                <w:color w:val="000000"/>
+              </w:rPr>
+              <w:t xml:space="preserve">Sex</w:t>
             </w:r>
           </w:p>
         </w:tc>
         <w:tc>
-          <w:tcPr/>
+          <w:tcPr>
+            <w:tcBorders>
+              <w:bottom w:val="none" w:sz="0" w:space="0" w:color="000000"/>
+              <w:top w:val="none" w:sz="0" w:space="0" w:color="000000"/>
+              <w:left w:val="none" w:sz="0" w:space="0" w:color="000000"/>
+              <w:right w:val="none" w:sz="0" w:space="0" w:color="000000"/>
+            </w:tcBorders>
+            <w:shd w:val="clear" w:color="auto" w:fill="FFFFFF"/>
+            <w:tcMar>
+              <w:top w:w="0" w:type="dxa"/>
+              <w:bottom w:w="0" w:type="dxa"/>
+              <w:left w:w="0" w:type="dxa"/>
+              <w:right w:w="0" w:type="dxa"/>
+            </w:tcMar>
+            <w:vAlign w:val="center"/>
+          </w:tcPr>
           <w:p>
             <w:pPr>
-              <w:pStyle w:val="Compact"/>
+              <w:pStyle w:val="Normal"/>
               <w:jc w:val="right"/>
+              <w:pBdr>
+                <w:bottom w:val="none" w:sz="0" w:space="0" w:color="000000"/>
+                <w:top w:val="none" w:sz="0" w:space="0" w:color="000000"/>
+                <w:left w:val="none" w:sz="0" w:space="0" w:color="000000"/>
+                <w:right w:val="none" w:sz="0" w:space="0" w:color="000000"/>
+              </w:pBdr>
+              <w:spacing w:after="60" w:before="60" w:line="312"/>
+              <w:ind w:left="80" w:right="80" w:firstLine="0" w:firstLineChars="0"/>
+              <w:rPr>
+                <w:rFonts w:ascii="Arial" w:hAnsi="Arial" w:eastAsia="Arial" w:cs="Arial"/>
+                <w:i w:val="false"/>
+                <w:b w:val="false"/>
+                <w:u w:val="none"/>
+                <w:sz w:val="24"/>
+                <w:szCs w:val="24"/>
+                <w:color w:val="000000"/>
+              </w:rPr>
             </w:pPr>
-            <w:r>
+            <w:r xmlns:w="http://schemas.openxmlformats.org/wordprocessingml/2006/main" xmlns:wp="http://schemas.openxmlformats.org/drawingml/2006/wordprocessingDrawing" xmlns:r="http://schemas.openxmlformats.org/officeDocument/2006/relationships" xmlns:w14="http://schemas.microsoft.com/office/word/2010/wordml">
+              <w:rPr>
+                <w:rFonts w:ascii="Arial" w:hAnsi="Arial" w:eastAsia="Arial" w:cs="Arial"/>
+                <w:i w:val="false"/>
+                <w:b w:val="false"/>
+                <w:u w:val="none"/>
+                <w:sz w:val="24"/>
+                <w:szCs w:val="24"/>
+                <w:color w:val="000000"/>
+              </w:rPr>
               <w:t xml:space="preserve">1</w:t>
             </w:r>
           </w:p>
         </w:tc>
         <w:tc>
-          <w:tcPr/>
+          <w:tcPr>
+            <w:tcBorders>
+              <w:bottom w:val="none" w:sz="0" w:space="0" w:color="000000"/>
+              <w:top w:val="none" w:sz="0" w:space="0" w:color="000000"/>
+              <w:left w:val="none" w:sz="0" w:space="0" w:color="000000"/>
+              <w:right w:val="none" w:sz="0" w:space="0" w:color="000000"/>
+            </w:tcBorders>
+            <w:shd w:val="clear" w:color="auto" w:fill="FFFFFF"/>
+            <w:tcMar>
+              <w:top w:w="0" w:type="dxa"/>
+              <w:bottom w:w="0" w:type="dxa"/>
+              <w:left w:w="0" w:type="dxa"/>
+              <w:right w:w="0" w:type="dxa"/>
+            </w:tcMar>
+            <w:vAlign w:val="center"/>
+          </w:tcPr>
           <w:p>
             <w:pPr>
-              <w:pStyle w:val="Compact"/>
+              <w:pStyle w:val="Normal"/>
               <w:jc w:val="right"/>
+              <w:pBdr>
+                <w:bottom w:val="none" w:sz="0" w:space="0" w:color="000000"/>
+                <w:top w:val="none" w:sz="0" w:space="0" w:color="000000"/>
+                <w:left w:val="none" w:sz="0" w:space="0" w:color="000000"/>
+                <w:right w:val="none" w:sz="0" w:space="0" w:color="000000"/>
+              </w:pBdr>
+              <w:spacing w:after="60" w:before="60" w:line="312"/>
+              <w:ind w:left="80" w:right="80" w:firstLine="0" w:firstLineChars="0"/>
+              <w:rPr>
+                <w:rFonts w:ascii="Arial" w:hAnsi="Arial" w:eastAsia="Arial" w:cs="Arial"/>
+                <w:i w:val="false"/>
+                <w:b w:val="false"/>
+                <w:u w:val="none"/>
+                <w:sz w:val="24"/>
+                <w:szCs w:val="24"/>
+                <w:color w:val="000000"/>
+              </w:rPr>
             </w:pPr>
-            <w:r>
-              <w:t xml:space="preserve">613069167</w:t>
+            <w:r xmlns:w="http://schemas.openxmlformats.org/wordprocessingml/2006/main" xmlns:wp="http://schemas.openxmlformats.org/drawingml/2006/wordprocessingDrawing" xmlns:r="http://schemas.openxmlformats.org/officeDocument/2006/relationships" xmlns:w14="http://schemas.microsoft.com/office/word/2010/wordml">
+              <w:rPr>
+                <w:rFonts w:ascii="Arial" w:hAnsi="Arial" w:eastAsia="Arial" w:cs="Arial"/>
+                <w:i w:val="false"/>
+                <w:b w:val="false"/>
+                <w:u w:val="none"/>
+                <w:sz w:val="24"/>
+                <w:szCs w:val="24"/>
+                <w:color w:val="000000"/>
+              </w:rPr>
+              <w:t xml:space="preserve">613,069,167</w:t>
             </w:r>
           </w:p>
         </w:tc>
         <w:tc>
-          <w:tcPr/>
+          <w:tcPr>
+            <w:tcBorders>
+              <w:bottom w:val="none" w:sz="0" w:space="0" w:color="000000"/>
+              <w:top w:val="none" w:sz="0" w:space="0" w:color="000000"/>
+              <w:left w:val="none" w:sz="0" w:space="0" w:color="000000"/>
+              <w:right w:val="none" w:sz="0" w:space="0" w:color="000000"/>
+            </w:tcBorders>
+            <w:shd w:val="clear" w:color="auto" w:fill="FFFFFF"/>
+            <w:tcMar>
+              <w:top w:w="0" w:type="dxa"/>
+              <w:bottom w:w="0" w:type="dxa"/>
+              <w:left w:w="0" w:type="dxa"/>
+              <w:right w:w="0" w:type="dxa"/>
+            </w:tcMar>
+            <w:vAlign w:val="center"/>
+          </w:tcPr>
           <w:p>
             <w:pPr>
-              <w:pStyle w:val="Compact"/>
+              <w:pStyle w:val="Normal"/>
               <w:jc w:val="right"/>
+              <w:pBdr>
+                <w:bottom w:val="none" w:sz="0" w:space="0" w:color="000000"/>
+                <w:top w:val="none" w:sz="0" w:space="0" w:color="000000"/>
+                <w:left w:val="none" w:sz="0" w:space="0" w:color="000000"/>
+                <w:right w:val="none" w:sz="0" w:space="0" w:color="000000"/>
+              </w:pBdr>
+              <w:spacing w:after="60" w:before="60" w:line="312"/>
+              <w:ind w:left="80" w:right="80" w:firstLine="0" w:firstLineChars="0"/>
+              <w:rPr>
+                <w:rFonts w:ascii="Arial" w:hAnsi="Arial" w:eastAsia="Arial" w:cs="Arial"/>
+                <w:i w:val="false"/>
+                <w:b w:val="false"/>
+                <w:u w:val="none"/>
+                <w:sz w:val="24"/>
+                <w:szCs w:val="24"/>
+                <w:color w:val="000000"/>
+              </w:rPr>
             </w:pPr>
-            <w:r>
-              <w:t xml:space="preserve">613069167</w:t>
+            <w:r xmlns:w="http://schemas.openxmlformats.org/wordprocessingml/2006/main" xmlns:wp="http://schemas.openxmlformats.org/drawingml/2006/wordprocessingDrawing" xmlns:r="http://schemas.openxmlformats.org/officeDocument/2006/relationships" xmlns:w14="http://schemas.microsoft.com/office/word/2010/wordml">
+              <w:rPr>
+                <w:rFonts w:ascii="Arial" w:hAnsi="Arial" w:eastAsia="Arial" w:cs="Arial"/>
+                <w:i w:val="false"/>
+                <w:b w:val="false"/>
+                <w:u w:val="none"/>
+                <w:sz w:val="24"/>
+                <w:szCs w:val="24"/>
+                <w:color w:val="000000"/>
+              </w:rPr>
+              <w:t xml:space="preserve">613,069,167</w:t>
             </w:r>
           </w:p>
         </w:tc>
         <w:tc>
-          <w:tcPr/>
+          <w:tcPr>
+            <w:tcBorders>
+              <w:bottom w:val="none" w:sz="0" w:space="0" w:color="000000"/>
+              <w:top w:val="none" w:sz="0" w:space="0" w:color="000000"/>
+              <w:left w:val="none" w:sz="0" w:space="0" w:color="000000"/>
+              <w:right w:val="none" w:sz="0" w:space="0" w:color="000000"/>
+            </w:tcBorders>
+            <w:shd w:val="clear" w:color="auto" w:fill="FFFFFF"/>
+            <w:tcMar>
+              <w:top w:w="0" w:type="dxa"/>
+              <w:bottom w:w="0" w:type="dxa"/>
+              <w:left w:w="0" w:type="dxa"/>
+              <w:right w:w="0" w:type="dxa"/>
+            </w:tcMar>
+            <w:vAlign w:val="center"/>
+          </w:tcPr>
           <w:p>
             <w:pPr>
-              <w:pStyle w:val="Compact"/>
+              <w:pStyle w:val="Normal"/>
               <w:jc w:val="right"/>
+              <w:pBdr>
+                <w:bottom w:val="none" w:sz="0" w:space="0" w:color="000000"/>
+                <w:top w:val="none" w:sz="0" w:space="0" w:color="000000"/>
+                <w:left w:val="none" w:sz="0" w:space="0" w:color="000000"/>
+                <w:right w:val="none" w:sz="0" w:space="0" w:color="000000"/>
+              </w:pBdr>
+              <w:spacing w:after="60" w:before="60" w:line="312"/>
+              <w:ind w:left="80" w:right="80" w:firstLine="0" w:firstLineChars="0"/>
+              <w:rPr>
+                <w:rFonts w:ascii="Arial" w:hAnsi="Arial" w:eastAsia="Arial" w:cs="Arial"/>
+                <w:i w:val="false"/>
+                <w:b w:val="false"/>
+                <w:u w:val="none"/>
+                <w:sz w:val="24"/>
+                <w:szCs w:val="24"/>
+                <w:color w:val="000000"/>
+              </w:rPr>
             </w:pPr>
-            <w:r>
-              <w:t xml:space="preserve">4.2068985</w:t>
+            <w:r xmlns:w="http://schemas.openxmlformats.org/wordprocessingml/2006/main" xmlns:wp="http://schemas.openxmlformats.org/drawingml/2006/wordprocessingDrawing" xmlns:r="http://schemas.openxmlformats.org/officeDocument/2006/relationships" xmlns:w14="http://schemas.microsoft.com/office/word/2010/wordml">
+              <w:rPr>
+                <w:rFonts w:ascii="Arial" w:hAnsi="Arial" w:eastAsia="Arial" w:cs="Arial"/>
+                <w:i w:val="false"/>
+                <w:b w:val="false"/>
+                <w:u w:val="none"/>
+                <w:sz w:val="24"/>
+                <w:szCs w:val="24"/>
+                <w:color w:val="000000"/>
+              </w:rPr>
+              <w:t xml:space="preserve">4.2069</w:t>
             </w:r>
           </w:p>
         </w:tc>
         <w:tc>
-          <w:tcPr/>
+          <w:tcPr>
+            <w:tcBorders>
+              <w:bottom w:val="none" w:sz="0" w:space="0" w:color="000000"/>
+              <w:top w:val="none" w:sz="0" w:space="0" w:color="000000"/>
+              <w:left w:val="none" w:sz="0" w:space="0" w:color="000000"/>
+              <w:right w:val="none" w:sz="0" w:space="0" w:color="000000"/>
+            </w:tcBorders>
+            <w:shd w:val="clear" w:color="auto" w:fill="FFFFFF"/>
+            <w:tcMar>
+              <w:top w:w="0" w:type="dxa"/>
+              <w:bottom w:w="0" w:type="dxa"/>
+              <w:left w:w="0" w:type="dxa"/>
+              <w:right w:w="0" w:type="dxa"/>
+            </w:tcMar>
+            <w:vAlign w:val="center"/>
+          </w:tcPr>
           <w:p>
             <w:pPr>
-              <w:pStyle w:val="Compact"/>
+              <w:pStyle w:val="Normal"/>
               <w:jc w:val="right"/>
+              <w:pBdr>
+                <w:bottom w:val="none" w:sz="0" w:space="0" w:color="000000"/>
+                <w:top w:val="none" w:sz="0" w:space="0" w:color="000000"/>
+                <w:left w:val="none" w:sz="0" w:space="0" w:color="000000"/>
+                <w:right w:val="none" w:sz="0" w:space="0" w:color="000000"/>
+              </w:pBdr>
+              <w:spacing w:after="60" w:before="60" w:line="312"/>
+              <w:ind w:left="80" w:right="80" w:firstLine="0" w:firstLineChars="0"/>
+              <w:rPr>
+                <w:rFonts w:ascii="Arial" w:hAnsi="Arial" w:eastAsia="Arial" w:cs="Arial"/>
+                <w:i w:val="false"/>
+                <w:b w:val="false"/>
+                <w:u w:val="none"/>
+                <w:sz w:val="24"/>
+                <w:szCs w:val="24"/>
+                <w:color w:val="000000"/>
+              </w:rPr>
             </w:pPr>
-            <w:r>
-              <w:t xml:space="preserve">0.0404554</w:t>
+            <w:r xmlns:w="http://schemas.openxmlformats.org/wordprocessingml/2006/main" xmlns:wp="http://schemas.openxmlformats.org/drawingml/2006/wordprocessingDrawing" xmlns:r="http://schemas.openxmlformats.org/officeDocument/2006/relationships" xmlns:w14="http://schemas.microsoft.com/office/word/2010/wordml">
+              <w:rPr>
+                <w:rFonts w:ascii="Arial" w:hAnsi="Arial" w:eastAsia="Arial" w:cs="Arial"/>
+                <w:i w:val="false"/>
+                <w:b w:val="false"/>
+                <w:u w:val="none"/>
+                <w:sz w:val="24"/>
+                <w:szCs w:val="24"/>
+                <w:color w:val="000000"/>
+              </w:rPr>
+              <w:t xml:space="preserve">0.0405</w:t>
             </w:r>
           </w:p>
         </w:tc>
       </w:tr>
       <w:tr>
+        <w:trPr>
+          <w:trHeight w:val="529" w:hRule="auto"/>
+        </w:trPr>
+        body3
         <w:tc>
-          <w:tcPr/>
+          <w:tcPr>
+            <w:tcBorders>
+              <w:bottom w:val="none" w:sz="0" w:space="0" w:color="000000"/>
+              <w:top w:val="none" w:sz="0" w:space="0" w:color="000000"/>
+              <w:left w:val="none" w:sz="0" w:space="0" w:color="000000"/>
+              <w:right w:val="none" w:sz="0" w:space="0" w:color="000000"/>
+            </w:tcBorders>
+            <w:shd w:val="clear" w:color="auto" w:fill="FFFFFF"/>
+            <w:tcMar>
+              <w:top w:w="0" w:type="dxa"/>
+              <w:bottom w:w="0" w:type="dxa"/>
+              <w:left w:w="0" w:type="dxa"/>
+              <w:right w:w="0" w:type="dxa"/>
+            </w:tcMar>
+            <w:vAlign w:val="center"/>
+          </w:tcPr>
           <w:p>
             <w:pPr>
-              <w:pStyle w:val="Compact"/>
+              <w:pStyle w:val="Normal"/>
               <w:jc w:val="left"/>
+              <w:pBdr>
+                <w:bottom w:val="none" w:sz="0" w:space="0" w:color="000000"/>
+                <w:top w:val="none" w:sz="0" w:space="0" w:color="000000"/>
+                <w:left w:val="none" w:sz="0" w:space="0" w:color="000000"/>
+                <w:right w:val="none" w:sz="0" w:space="0" w:color="000000"/>
+              </w:pBdr>
+              <w:spacing w:after="60" w:before="60" w:line="312"/>
+              <w:ind w:left="80" w:right="80" w:firstLine="0" w:firstLineChars="0"/>
+              <w:rPr>
+                <w:rFonts w:ascii="Arial" w:hAnsi="Arial" w:eastAsia="Arial" w:cs="Arial"/>
+                <w:i w:val="false"/>
+                <w:b w:val="false"/>
+                <w:u w:val="none"/>
+                <w:sz w:val="24"/>
+                <w:szCs w:val="24"/>
+                <w:color w:val="000000"/>
+              </w:rPr>
             </w:pPr>
-            <w:r>
-              <w:t xml:space="preserve">region:sex</w:t>
+            <w:r xmlns:w="http://schemas.openxmlformats.org/wordprocessingml/2006/main" xmlns:wp="http://schemas.openxmlformats.org/drawingml/2006/wordprocessingDrawing" xmlns:r="http://schemas.openxmlformats.org/officeDocument/2006/relationships" xmlns:w14="http://schemas.microsoft.com/office/word/2010/wordml">
+              <w:rPr>
+                <w:rFonts w:ascii="Arial" w:hAnsi="Arial" w:eastAsia="Arial" w:cs="Arial"/>
+                <w:i w:val="false"/>
+                <w:b w:val="false"/>
+                <w:u w:val="none"/>
+                <w:sz w:val="24"/>
+                <w:szCs w:val="24"/>
+                <w:color w:val="000000"/>
+              </w:rPr>
+              <w:t xml:space="preserve">Region:Sex</w:t>
             </w:r>
           </w:p>
         </w:tc>
         <w:tc>
-          <w:tcPr/>
+          <w:tcPr>
+            <w:tcBorders>
+              <w:bottom w:val="none" w:sz="0" w:space="0" w:color="000000"/>
+              <w:top w:val="none" w:sz="0" w:space="0" w:color="000000"/>
+              <w:left w:val="none" w:sz="0" w:space="0" w:color="000000"/>
+              <w:right w:val="none" w:sz="0" w:space="0" w:color="000000"/>
+            </w:tcBorders>
+            <w:shd w:val="clear" w:color="auto" w:fill="FFFFFF"/>
+            <w:tcMar>
+              <w:top w:w="0" w:type="dxa"/>
+              <w:bottom w:w="0" w:type="dxa"/>
+              <w:left w:w="0" w:type="dxa"/>
+              <w:right w:w="0" w:type="dxa"/>
+            </w:tcMar>
+            <w:vAlign w:val="center"/>
+          </w:tcPr>
           <w:p>
             <w:pPr>
-              <w:pStyle w:val="Compact"/>
+              <w:pStyle w:val="Normal"/>
               <w:jc w:val="right"/>
+              <w:pBdr>
+                <w:bottom w:val="none" w:sz="0" w:space="0" w:color="000000"/>
+                <w:top w:val="none" w:sz="0" w:space="0" w:color="000000"/>
+                <w:left w:val="none" w:sz="0" w:space="0" w:color="000000"/>
+                <w:right w:val="none" w:sz="0" w:space="0" w:color="000000"/>
+              </w:pBdr>
+              <w:spacing w:after="60" w:before="60" w:line="312"/>
+              <w:ind w:left="80" w:right="80" w:firstLine="0" w:firstLineChars="0"/>
+              <w:rPr>
+                <w:rFonts w:ascii="Arial" w:hAnsi="Arial" w:eastAsia="Arial" w:cs="Arial"/>
+                <w:i w:val="false"/>
+                <w:b w:val="false"/>
+                <w:u w:val="none"/>
+                <w:sz w:val="24"/>
+                <w:szCs w:val="24"/>
+                <w:color w:val="000000"/>
+              </w:rPr>
             </w:pPr>
-            <w:r>
+            <w:r xmlns:w="http://schemas.openxmlformats.org/wordprocessingml/2006/main" xmlns:wp="http://schemas.openxmlformats.org/drawingml/2006/wordprocessingDrawing" xmlns:r="http://schemas.openxmlformats.org/officeDocument/2006/relationships" xmlns:w14="http://schemas.microsoft.com/office/word/2010/wordml">
+              <w:rPr>
+                <w:rFonts w:ascii="Arial" w:hAnsi="Arial" w:eastAsia="Arial" w:cs="Arial"/>
+                <w:i w:val="false"/>
+                <w:b w:val="false"/>
+                <w:u w:val="none"/>
+                <w:sz w:val="24"/>
+                <w:szCs w:val="24"/>
+                <w:color w:val="000000"/>
+              </w:rPr>
               <w:t xml:space="preserve">3</w:t>
             </w:r>
           </w:p>
         </w:tc>
         <w:tc>
-          <w:tcPr/>
+          <w:tcPr>
+            <w:tcBorders>
+              <w:bottom w:val="none" w:sz="0" w:space="0" w:color="000000"/>
+              <w:top w:val="none" w:sz="0" w:space="0" w:color="000000"/>
+              <w:left w:val="none" w:sz="0" w:space="0" w:color="000000"/>
+              <w:right w:val="none" w:sz="0" w:space="0" w:color="000000"/>
+            </w:tcBorders>
+            <w:shd w:val="clear" w:color="auto" w:fill="FFFFFF"/>
+            <w:tcMar>
+              <w:top w:w="0" w:type="dxa"/>
+              <w:bottom w:w="0" w:type="dxa"/>
+              <w:left w:w="0" w:type="dxa"/>
+              <w:right w:w="0" w:type="dxa"/>
+            </w:tcMar>
+            <w:vAlign w:val="center"/>
+          </w:tcPr>
           <w:p>
             <w:pPr>
-              <w:pStyle w:val="Compact"/>
+              <w:pStyle w:val="Normal"/>
               <w:jc w:val="right"/>
+              <w:pBdr>
+                <w:bottom w:val="none" w:sz="0" w:space="0" w:color="000000"/>
+                <w:top w:val="none" w:sz="0" w:space="0" w:color="000000"/>
+                <w:left w:val="none" w:sz="0" w:space="0" w:color="000000"/>
+                <w:right w:val="none" w:sz="0" w:space="0" w:color="000000"/>
+              </w:pBdr>
+              <w:spacing w:after="60" w:before="60" w:line="312"/>
+              <w:ind w:left="80" w:right="80" w:firstLine="0" w:firstLineChars="0"/>
+              <w:rPr>
+                <w:rFonts w:ascii="Arial" w:hAnsi="Arial" w:eastAsia="Arial" w:cs="Arial"/>
+                <w:i w:val="false"/>
+                <w:b w:val="false"/>
+                <w:u w:val="none"/>
+                <w:sz w:val="24"/>
+                <w:szCs w:val="24"/>
+                <w:color w:val="000000"/>
+              </w:rPr>
             </w:pPr>
-            <w:r>
-              <w:t xml:space="preserve">340173346</w:t>
+            <w:r xmlns:w="http://schemas.openxmlformats.org/wordprocessingml/2006/main" xmlns:wp="http://schemas.openxmlformats.org/drawingml/2006/wordprocessingDrawing" xmlns:r="http://schemas.openxmlformats.org/officeDocument/2006/relationships" xmlns:w14="http://schemas.microsoft.com/office/word/2010/wordml">
+              <w:rPr>
+                <w:rFonts w:ascii="Arial" w:hAnsi="Arial" w:eastAsia="Arial" w:cs="Arial"/>
+                <w:i w:val="false"/>
+                <w:b w:val="false"/>
+                <w:u w:val="none"/>
+                <w:sz w:val="24"/>
+                <w:szCs w:val="24"/>
+                <w:color w:val="000000"/>
+              </w:rPr>
+              <w:t xml:space="preserve">340,173,346</w:t>
             </w:r>
           </w:p>
         </w:tc>
         <w:tc>
-          <w:tcPr/>
+          <w:tcPr>
+            <w:tcBorders>
+              <w:bottom w:val="none" w:sz="0" w:space="0" w:color="000000"/>
+              <w:top w:val="none" w:sz="0" w:space="0" w:color="000000"/>
+              <w:left w:val="none" w:sz="0" w:space="0" w:color="000000"/>
+              <w:right w:val="none" w:sz="0" w:space="0" w:color="000000"/>
+            </w:tcBorders>
+            <w:shd w:val="clear" w:color="auto" w:fill="FFFFFF"/>
+            <w:tcMar>
+              <w:top w:w="0" w:type="dxa"/>
+              <w:bottom w:w="0" w:type="dxa"/>
+              <w:left w:w="0" w:type="dxa"/>
+              <w:right w:w="0" w:type="dxa"/>
+            </w:tcMar>
+            <w:vAlign w:val="center"/>
+          </w:tcPr>
           <w:p>
             <w:pPr>
-              <w:pStyle w:val="Compact"/>
+              <w:pStyle w:val="Normal"/>
               <w:jc w:val="right"/>
+              <w:pBdr>
+                <w:bottom w:val="none" w:sz="0" w:space="0" w:color="000000"/>
+                <w:top w:val="none" w:sz="0" w:space="0" w:color="000000"/>
+                <w:left w:val="none" w:sz="0" w:space="0" w:color="000000"/>
+                <w:right w:val="none" w:sz="0" w:space="0" w:color="000000"/>
+              </w:pBdr>
+              <w:spacing w:after="60" w:before="60" w:line="312"/>
+              <w:ind w:left="80" w:right="80" w:firstLine="0" w:firstLineChars="0"/>
+              <w:rPr>
+                <w:rFonts w:ascii="Arial" w:hAnsi="Arial" w:eastAsia="Arial" w:cs="Arial"/>
+                <w:i w:val="false"/>
+                <w:b w:val="false"/>
+                <w:u w:val="none"/>
+                <w:sz w:val="24"/>
+                <w:szCs w:val="24"/>
+                <w:color w:val="000000"/>
+              </w:rPr>
             </w:pPr>
-            <w:r>
-              <w:t xml:space="preserve">113391115</w:t>
+            <w:r xmlns:w="http://schemas.openxmlformats.org/wordprocessingml/2006/main" xmlns:wp="http://schemas.openxmlformats.org/drawingml/2006/wordprocessingDrawing" xmlns:r="http://schemas.openxmlformats.org/officeDocument/2006/relationships" xmlns:w14="http://schemas.microsoft.com/office/word/2010/wordml">
+              <w:rPr>
+                <w:rFonts w:ascii="Arial" w:hAnsi="Arial" w:eastAsia="Arial" w:cs="Arial"/>
+                <w:i w:val="false"/>
+                <w:b w:val="false"/>
+                <w:u w:val="none"/>
+                <w:sz w:val="24"/>
+                <w:szCs w:val="24"/>
+                <w:color w:val="000000"/>
+              </w:rPr>
+              <w:t xml:space="preserve">113,391,115</w:t>
             </w:r>
           </w:p>
         </w:tc>
         <w:tc>
-          <w:tcPr/>
+          <w:tcPr>
+            <w:tcBorders>
+              <w:bottom w:val="none" w:sz="0" w:space="0" w:color="000000"/>
+              <w:top w:val="none" w:sz="0" w:space="0" w:color="000000"/>
+              <w:left w:val="none" w:sz="0" w:space="0" w:color="000000"/>
+              <w:right w:val="none" w:sz="0" w:space="0" w:color="000000"/>
+            </w:tcBorders>
+            <w:shd w:val="clear" w:color="auto" w:fill="FFFFFF"/>
+            <w:tcMar>
+              <w:top w:w="0" w:type="dxa"/>
+              <w:bottom w:w="0" w:type="dxa"/>
+              <w:left w:w="0" w:type="dxa"/>
+              <w:right w:w="0" w:type="dxa"/>
+            </w:tcMar>
+            <w:vAlign w:val="center"/>
+          </w:tcPr>
           <w:p>
             <w:pPr>
-              <w:pStyle w:val="Compact"/>
+              <w:pStyle w:val="Normal"/>
               <w:jc w:val="right"/>
+              <w:pBdr>
+                <w:bottom w:val="none" w:sz="0" w:space="0" w:color="000000"/>
+                <w:top w:val="none" w:sz="0" w:space="0" w:color="000000"/>
+                <w:left w:val="none" w:sz="0" w:space="0" w:color="000000"/>
+                <w:right w:val="none" w:sz="0" w:space="0" w:color="000000"/>
+              </w:pBdr>
+              <w:spacing w:after="60" w:before="60" w:line="312"/>
+              <w:ind w:left="80" w:right="80" w:firstLine="0" w:firstLineChars="0"/>
+              <w:rPr>
+                <w:rFonts w:ascii="Arial" w:hAnsi="Arial" w:eastAsia="Arial" w:cs="Arial"/>
+                <w:i w:val="false"/>
+                <w:b w:val="false"/>
+                <w:u w:val="none"/>
+                <w:sz w:val="24"/>
+                <w:szCs w:val="24"/>
+                <w:color w:val="000000"/>
+              </w:rPr>
             </w:pPr>
-            <w:r>
-              <w:t xml:space="preserve">0.7780931</w:t>
+            <w:r xmlns:w="http://schemas.openxmlformats.org/wordprocessingml/2006/main" xmlns:wp="http://schemas.openxmlformats.org/drawingml/2006/wordprocessingDrawing" xmlns:r="http://schemas.openxmlformats.org/officeDocument/2006/relationships" xmlns:w14="http://schemas.microsoft.com/office/word/2010/wordml">
+              <w:rPr>
+                <w:rFonts w:ascii="Arial" w:hAnsi="Arial" w:eastAsia="Arial" w:cs="Arial"/>
+                <w:i w:val="false"/>
+                <w:b w:val="false"/>
+                <w:u w:val="none"/>
+                <w:sz w:val="24"/>
+                <w:szCs w:val="24"/>
+                <w:color w:val="000000"/>
+              </w:rPr>
+              <w:t xml:space="preserve">0.7781</w:t>
             </w:r>
           </w:p>
         </w:tc>
         <w:tc>
-          <w:tcPr/>
+          <w:tcPr>
+            <w:tcBorders>
+              <w:bottom w:val="none" w:sz="0" w:space="0" w:color="000000"/>
+              <w:top w:val="none" w:sz="0" w:space="0" w:color="000000"/>
+              <w:left w:val="none" w:sz="0" w:space="0" w:color="000000"/>
+              <w:right w:val="none" w:sz="0" w:space="0" w:color="000000"/>
+            </w:tcBorders>
+            <w:shd w:val="clear" w:color="auto" w:fill="FFFFFF"/>
+            <w:tcMar>
+              <w:top w:w="0" w:type="dxa"/>
+              <w:bottom w:w="0" w:type="dxa"/>
+              <w:left w:w="0" w:type="dxa"/>
+              <w:right w:w="0" w:type="dxa"/>
+            </w:tcMar>
+            <w:vAlign w:val="center"/>
+          </w:tcPr>
           <w:p>
             <w:pPr>
-              <w:pStyle w:val="Compact"/>
+              <w:pStyle w:val="Normal"/>
               <w:jc w:val="right"/>
+              <w:pBdr>
+                <w:bottom w:val="none" w:sz="0" w:space="0" w:color="000000"/>
+                <w:top w:val="none" w:sz="0" w:space="0" w:color="000000"/>
+                <w:left w:val="none" w:sz="0" w:space="0" w:color="000000"/>
+                <w:right w:val="none" w:sz="0" w:space="0" w:color="000000"/>
+              </w:pBdr>
+              <w:spacing w:after="60" w:before="60" w:line="312"/>
+              <w:ind w:left="80" w:right="80" w:firstLine="0" w:firstLineChars="0"/>
+              <w:rPr>
+                <w:rFonts w:ascii="Arial" w:hAnsi="Arial" w:eastAsia="Arial" w:cs="Arial"/>
+                <w:i w:val="false"/>
+                <w:b w:val="false"/>
+                <w:u w:val="none"/>
+                <w:sz w:val="24"/>
+                <w:szCs w:val="24"/>
+                <w:color w:val="000000"/>
+              </w:rPr>
             </w:pPr>
-            <w:r>
-              <w:t xml:space="preserve">0.5062076</w:t>
+            <w:r xmlns:w="http://schemas.openxmlformats.org/wordprocessingml/2006/main" xmlns:wp="http://schemas.openxmlformats.org/drawingml/2006/wordprocessingDrawing" xmlns:r="http://schemas.openxmlformats.org/officeDocument/2006/relationships" xmlns:w14="http://schemas.microsoft.com/office/word/2010/wordml">
+              <w:rPr>
+                <w:rFonts w:ascii="Arial" w:hAnsi="Arial" w:eastAsia="Arial" w:cs="Arial"/>
+                <w:i w:val="false"/>
+                <w:b w:val="false"/>
+                <w:u w:val="none"/>
+                <w:sz w:val="24"/>
+                <w:szCs w:val="24"/>
+                <w:color w:val="000000"/>
+              </w:rPr>
+              <w:t xml:space="preserve">0.5062</w:t>
             </w:r>
           </w:p>
         </w:tc>
       </w:tr>
       <w:tr>
+        <w:trPr>
+          <w:trHeight w:val="510" w:hRule="auto"/>
+        </w:trPr>
+        body4
         <w:tc>
-          <w:tcPr/>
+          <w:tcPr>
+            <w:tcBorders>
+              <w:bottom w:val="single" w:sz="12" w:space="0" w:color="BEBEBE"/>
+              <w:top w:val="none" w:sz="0" w:space="0" w:color="000000"/>
+              <w:left w:val="none" w:sz="0" w:space="0" w:color="000000"/>
+              <w:right w:val="none" w:sz="0" w:space="0" w:color="000000"/>
+            </w:tcBorders>
+            <w:shd w:val="clear" w:color="auto" w:fill="FFFFFF"/>
+            <w:tcMar>
+              <w:top w:w="0" w:type="dxa"/>
+              <w:bottom w:w="0" w:type="dxa"/>
+              <w:left w:w="0" w:type="dxa"/>
+              <w:right w:w="0" w:type="dxa"/>
+            </w:tcMar>
+            <w:vAlign w:val="center"/>
+          </w:tcPr>
           <w:p>
             <w:pPr>
-              <w:pStyle w:val="Compact"/>
+              <w:pStyle w:val="Normal"/>
               <w:jc w:val="left"/>
+              <w:pBdr>
+                <w:bottom w:val="none" w:sz="0" w:space="0" w:color="000000"/>
+                <w:top w:val="none" w:sz="0" w:space="0" w:color="000000"/>
+                <w:left w:val="none" w:sz="0" w:space="0" w:color="000000"/>
+                <w:right w:val="none" w:sz="0" w:space="0" w:color="000000"/>
+              </w:pBdr>
+              <w:spacing w:after="60" w:before="60" w:line="312"/>
+              <w:ind w:left="80" w:right="80" w:firstLine="0" w:firstLineChars="0"/>
+              <w:rPr>
+                <w:rFonts w:ascii="Arial" w:hAnsi="Arial" w:eastAsia="Arial" w:cs="Arial"/>
+                <w:i w:val="false"/>
+                <w:b w:val="false"/>
+                <w:u w:val="none"/>
+                <w:sz w:val="24"/>
+                <w:szCs w:val="24"/>
+                <w:color w:val="000000"/>
+              </w:rPr>
             </w:pPr>
-            <w:r>
+            <w:r xmlns:w="http://schemas.openxmlformats.org/wordprocessingml/2006/main" xmlns:wp="http://schemas.openxmlformats.org/drawingml/2006/wordprocessingDrawing" xmlns:r="http://schemas.openxmlformats.org/officeDocument/2006/relationships" xmlns:w14="http://schemas.microsoft.com/office/word/2010/wordml">
+              <w:rPr>
+                <w:rFonts w:ascii="Arial" w:hAnsi="Arial" w:eastAsia="Arial" w:cs="Arial"/>
+                <w:i w:val="false"/>
+                <w:b w:val="false"/>
+                <w:u w:val="none"/>
+                <w:sz w:val="24"/>
+                <w:szCs w:val="24"/>
+                <w:color w:val="000000"/>
+              </w:rPr>
               <w:t xml:space="preserve">Residuals</w:t>
             </w:r>
           </w:p>
         </w:tc>
         <w:tc>
-          <w:tcPr/>
+          <w:tcPr>
+            <w:tcBorders>
+              <w:bottom w:val="single" w:sz="12" w:space="0" w:color="BEBEBE"/>
+              <w:top w:val="none" w:sz="0" w:space="0" w:color="000000"/>
+              <w:left w:val="none" w:sz="0" w:space="0" w:color="000000"/>
+              <w:right w:val="none" w:sz="0" w:space="0" w:color="000000"/>
+            </w:tcBorders>
+            <w:shd w:val="clear" w:color="auto" w:fill="FFFFFF"/>
+            <w:tcMar>
+              <w:top w:w="0" w:type="dxa"/>
+              <w:bottom w:w="0" w:type="dxa"/>
+              <w:left w:w="0" w:type="dxa"/>
+              <w:right w:w="0" w:type="dxa"/>
+            </w:tcMar>
+            <w:vAlign w:val="center"/>
+          </w:tcPr>
           <w:p>
             <w:pPr>
-              <w:pStyle w:val="Compact"/>
+              <w:pStyle w:val="Normal"/>
               <w:jc w:val="right"/>
+              <w:pBdr>
+                <w:bottom w:val="none" w:sz="0" w:space="0" w:color="000000"/>
+                <w:top w:val="none" w:sz="0" w:space="0" w:color="000000"/>
+                <w:left w:val="none" w:sz="0" w:space="0" w:color="000000"/>
+                <w:right w:val="none" w:sz="0" w:space="0" w:color="000000"/>
+              </w:pBdr>
+              <w:spacing w:after="60" w:before="60" w:line="312"/>
+              <w:ind w:left="80" w:right="80" w:firstLine="0" w:firstLineChars="0"/>
+              <w:rPr>
+                <w:rFonts w:ascii="Arial" w:hAnsi="Arial" w:eastAsia="Arial" w:cs="Arial"/>
+                <w:i w:val="false"/>
+                <w:b w:val="false"/>
+                <w:u w:val="none"/>
+                <w:sz w:val="24"/>
+                <w:szCs w:val="24"/>
+                <w:color w:val="000000"/>
+              </w:rPr>
             </w:pPr>
-            <w:r>
-              <w:t xml:space="preserve">1330</w:t>
+            <w:r xmlns:w="http://schemas.openxmlformats.org/wordprocessingml/2006/main" xmlns:wp="http://schemas.openxmlformats.org/drawingml/2006/wordprocessingDrawing" xmlns:r="http://schemas.openxmlformats.org/officeDocument/2006/relationships" xmlns:w14="http://schemas.microsoft.com/office/word/2010/wordml">
+              <w:rPr>
+                <w:rFonts w:ascii="Arial" w:hAnsi="Arial" w:eastAsia="Arial" w:cs="Arial"/>
+                <w:i w:val="false"/>
+                <w:b w:val="false"/>
+                <w:u w:val="none"/>
+                <w:sz w:val="24"/>
+                <w:szCs w:val="24"/>
+                <w:color w:val="000000"/>
+              </w:rPr>
+              <w:t xml:space="preserve">1,330</w:t>
             </w:r>
           </w:p>
         </w:tc>
         <w:tc>
-          <w:tcPr/>
+          <w:tcPr>
+            <w:tcBorders>
+              <w:bottom w:val="single" w:sz="12" w:space="0" w:color="BEBEBE"/>
+              <w:top w:val="none" w:sz="0" w:space="0" w:color="000000"/>
+              <w:left w:val="none" w:sz="0" w:space="0" w:color="000000"/>
+              <w:right w:val="none" w:sz="0" w:space="0" w:color="000000"/>
+            </w:tcBorders>
+            <w:shd w:val="clear" w:color="auto" w:fill="FFFFFF"/>
+            <w:tcMar>
+              <w:top w:w="0" w:type="dxa"/>
+              <w:bottom w:w="0" w:type="dxa"/>
+              <w:left w:w="0" w:type="dxa"/>
+              <w:right w:w="0" w:type="dxa"/>
+            </w:tcMar>
+            <w:vAlign w:val="center"/>
+          </w:tcPr>
           <w:p>
             <w:pPr>
-              <w:pStyle w:val="Compact"/>
+              <w:pStyle w:val="Normal"/>
               <w:jc w:val="right"/>
+              <w:pBdr>
+                <w:bottom w:val="none" w:sz="0" w:space="0" w:color="000000"/>
+                <w:top w:val="none" w:sz="0" w:space="0" w:color="000000"/>
+                <w:left w:val="none" w:sz="0" w:space="0" w:color="000000"/>
+                <w:right w:val="none" w:sz="0" w:space="0" w:color="000000"/>
+              </w:pBdr>
+              <w:spacing w:after="60" w:before="60" w:line="312"/>
+              <w:ind w:left="80" w:right="80" w:firstLine="0" w:firstLineChars="0"/>
+              <w:rPr>
+                <w:rFonts w:ascii="Arial" w:hAnsi="Arial" w:eastAsia="Arial" w:cs="Arial"/>
+                <w:i w:val="false"/>
+                <w:b w:val="false"/>
+                <w:u w:val="none"/>
+                <w:sz w:val="24"/>
+                <w:szCs w:val="24"/>
+                <w:color w:val="000000"/>
+              </w:rPr>
             </w:pPr>
-            <w:r>
-              <w:t xml:space="preserve">193820219374</w:t>
+            <w:r xmlns:w="http://schemas.openxmlformats.org/wordprocessingml/2006/main" xmlns:wp="http://schemas.openxmlformats.org/drawingml/2006/wordprocessingDrawing" xmlns:r="http://schemas.openxmlformats.org/officeDocument/2006/relationships" xmlns:w14="http://schemas.microsoft.com/office/word/2010/wordml">
+              <w:rPr>
+                <w:rFonts w:ascii="Arial" w:hAnsi="Arial" w:eastAsia="Arial" w:cs="Arial"/>
+                <w:i w:val="false"/>
+                <w:b w:val="false"/>
+                <w:u w:val="none"/>
+                <w:sz w:val="24"/>
+                <w:szCs w:val="24"/>
+                <w:color w:val="000000"/>
+              </w:rPr>
+              <w:t xml:space="preserve">193,820,219,374</w:t>
             </w:r>
           </w:p>
         </w:tc>
         <w:tc>
-          <w:tcPr/>
+          <w:tcPr>
+            <w:tcBorders>
+              <w:bottom w:val="single" w:sz="12" w:space="0" w:color="BEBEBE"/>
+              <w:top w:val="none" w:sz="0" w:space="0" w:color="000000"/>
+              <w:left w:val="none" w:sz="0" w:space="0" w:color="000000"/>
+              <w:right w:val="none" w:sz="0" w:space="0" w:color="000000"/>
+            </w:tcBorders>
+            <w:shd w:val="clear" w:color="auto" w:fill="FFFFFF"/>
+            <w:tcMar>
+              <w:top w:w="0" w:type="dxa"/>
+              <w:bottom w:w="0" w:type="dxa"/>
+              <w:left w:w="0" w:type="dxa"/>
+              <w:right w:w="0" w:type="dxa"/>
+            </w:tcMar>
+            <w:vAlign w:val="center"/>
+          </w:tcPr>
           <w:p>
             <w:pPr>
-              <w:pStyle w:val="Compact"/>
+              <w:pStyle w:val="Normal"/>
               <w:jc w:val="right"/>
+              <w:pBdr>
+                <w:bottom w:val="none" w:sz="0" w:space="0" w:color="000000"/>
+                <w:top w:val="none" w:sz="0" w:space="0" w:color="000000"/>
+                <w:left w:val="none" w:sz="0" w:space="0" w:color="000000"/>
+                <w:right w:val="none" w:sz="0" w:space="0" w:color="000000"/>
+              </w:pBdr>
+              <w:spacing w:after="60" w:before="60" w:line="312"/>
+              <w:ind w:left="80" w:right="80" w:firstLine="0" w:firstLineChars="0"/>
+              <w:rPr>
+                <w:rFonts w:ascii="Arial" w:hAnsi="Arial" w:eastAsia="Arial" w:cs="Arial"/>
+                <w:i w:val="false"/>
+                <w:b w:val="false"/>
+                <w:u w:val="none"/>
+                <w:sz w:val="24"/>
+                <w:szCs w:val="24"/>
+                <w:color w:val="000000"/>
+              </w:rPr>
             </w:pPr>
-            <w:r>
-              <w:t xml:space="preserve">145729488</w:t>
+            <w:r xmlns:w="http://schemas.openxmlformats.org/wordprocessingml/2006/main" xmlns:wp="http://schemas.openxmlformats.org/drawingml/2006/wordprocessingDrawing" xmlns:r="http://schemas.openxmlformats.org/officeDocument/2006/relationships" xmlns:w14="http://schemas.microsoft.com/office/word/2010/wordml">
+              <w:rPr>
+                <w:rFonts w:ascii="Arial" w:hAnsi="Arial" w:eastAsia="Arial" w:cs="Arial"/>
+                <w:i w:val="false"/>
+                <w:b w:val="false"/>
+                <w:u w:val="none"/>
+                <w:sz w:val="24"/>
+                <w:szCs w:val="24"/>
+                <w:color w:val="000000"/>
+              </w:rPr>
+              <w:t xml:space="preserve">145,729,488</w:t>
             </w:r>
           </w:p>
         </w:tc>
         <w:tc>
-          <w:tcPr/>
+          <w:tcPr>
+            <w:tcBorders>
+              <w:bottom w:val="single" w:sz="12" w:space="0" w:color="BEBEBE"/>
+              <w:top w:val="none" w:sz="0" w:space="0" w:color="000000"/>
+              <w:left w:val="none" w:sz="0" w:space="0" w:color="000000"/>
+              <w:right w:val="none" w:sz="0" w:space="0" w:color="000000"/>
+            </w:tcBorders>
+            <w:shd w:val="clear" w:color="auto" w:fill="FFFFFF"/>
+            <w:tcMar>
+              <w:top w:w="0" w:type="dxa"/>
+              <w:bottom w:w="0" w:type="dxa"/>
+              <w:left w:w="0" w:type="dxa"/>
+              <w:right w:w="0" w:type="dxa"/>
+            </w:tcMar>
+            <w:vAlign w:val="center"/>
+          </w:tcPr>
           <w:p>
             <w:pPr>
-              <w:pStyle w:val="Compact"/>
+              <w:pStyle w:val="Normal"/>
               <w:jc w:val="right"/>
+              <w:pBdr>
+                <w:bottom w:val="none" w:sz="0" w:space="0" w:color="000000"/>
+                <w:top w:val="none" w:sz="0" w:space="0" w:color="000000"/>
+                <w:left w:val="none" w:sz="0" w:space="0" w:color="000000"/>
+                <w:right w:val="none" w:sz="0" w:space="0" w:color="000000"/>
+              </w:pBdr>
+              <w:spacing w:after="60" w:before="60" w:line="312"/>
+              <w:ind w:left="80" w:right="80" w:firstLine="0" w:firstLineChars="0"/>
+              <w:rPr>
+                <w:rFonts w:ascii="Arial" w:hAnsi="Arial" w:eastAsia="Arial" w:cs="Arial"/>
+                <w:i w:val="false"/>
+                <w:b w:val="false"/>
+                <w:u w:val="none"/>
+                <w:sz w:val="24"/>
+                <w:szCs w:val="24"/>
+                <w:color w:val="000000"/>
+              </w:rPr>
             </w:pPr>
-            <w:r>
-              <w:t xml:space="preserve">NA</w:t>
+            <w:r xmlns:w="http://schemas.openxmlformats.org/wordprocessingml/2006/main" xmlns:wp="http://schemas.openxmlformats.org/drawingml/2006/wordprocessingDrawing" xmlns:r="http://schemas.openxmlformats.org/officeDocument/2006/relationships" xmlns:w14="http://schemas.microsoft.com/office/word/2010/wordml">
+              <w:rPr>
+                <w:rFonts w:ascii="Arial" w:hAnsi="Arial" w:eastAsia="Arial" w:cs="Arial"/>
+                <w:i w:val="false"/>
+                <w:b w:val="false"/>
+                <w:u w:val="none"/>
+                <w:sz w:val="24"/>
+                <w:szCs w:val="24"/>
+                <w:color w:val="000000"/>
+              </w:rPr>
+              <w:t xml:space="preserve"/>
             </w:r>
           </w:p>
         </w:tc>
         <w:tc>
-          <w:tcPr/>
+          <w:tcPr>
+            <w:tcBorders>
+              <w:bottom w:val="single" w:sz="12" w:space="0" w:color="BEBEBE"/>
+              <w:top w:val="none" w:sz="0" w:space="0" w:color="000000"/>
+              <w:left w:val="none" w:sz="0" w:space="0" w:color="000000"/>
+              <w:right w:val="none" w:sz="0" w:space="0" w:color="000000"/>
+            </w:tcBorders>
+            <w:shd w:val="clear" w:color="auto" w:fill="FFFFFF"/>
+            <w:tcMar>
+              <w:top w:w="0" w:type="dxa"/>
+              <w:bottom w:w="0" w:type="dxa"/>
+              <w:left w:w="0" w:type="dxa"/>
+              <w:right w:w="0" w:type="dxa"/>
+            </w:tcMar>
+            <w:vAlign w:val="center"/>
+          </w:tcPr>
           <w:p>
             <w:pPr>
-              <w:pStyle w:val="Compact"/>
+              <w:pStyle w:val="Normal"/>
               <w:jc w:val="right"/>
+              <w:pBdr>
+                <w:bottom w:val="none" w:sz="0" w:space="0" w:color="000000"/>
+                <w:top w:val="none" w:sz="0" w:space="0" w:color="000000"/>
+                <w:left w:val="none" w:sz="0" w:space="0" w:color="000000"/>
+                <w:right w:val="none" w:sz="0" w:space="0" w:color="000000"/>
+              </w:pBdr>
+              <w:spacing w:after="60" w:before="60" w:line="312"/>
+              <w:ind w:left="80" w:right="80" w:firstLine="0" w:firstLineChars="0"/>
+              <w:rPr>
+                <w:rFonts w:ascii="Arial" w:hAnsi="Arial" w:eastAsia="Arial" w:cs="Arial"/>
+                <w:i w:val="false"/>
+                <w:b w:val="false"/>
+                <w:u w:val="none"/>
+                <w:sz w:val="24"/>
+                <w:szCs w:val="24"/>
+                <w:color w:val="000000"/>
+              </w:rPr>
             </w:pPr>
-            <w:r>
-              <w:t xml:space="preserve">NA</w:t>
+            <w:r xmlns:w="http://schemas.openxmlformats.org/wordprocessingml/2006/main" xmlns:wp="http://schemas.openxmlformats.org/drawingml/2006/wordprocessingDrawing" xmlns:r="http://schemas.openxmlformats.org/officeDocument/2006/relationships" xmlns:w14="http://schemas.microsoft.com/office/word/2010/wordml">
+              <w:rPr>
+                <w:rFonts w:ascii="Arial" w:hAnsi="Arial" w:eastAsia="Arial" w:cs="Arial"/>
+                <w:i w:val="false"/>
+                <w:b w:val="false"/>
+                <w:u w:val="none"/>
+                <w:sz w:val="24"/>
+                <w:szCs w:val="24"/>
+                <w:color w:val="000000"/>
+              </w:rPr>
+              <w:t xml:space="preserve"/>
             </w:r>
           </w:p>
         </w:tc>
@@ -1178,25 +3005,1971 @@
     </w:tbl>
     <w:p>
       <w:pPr>
+        <w:pStyle w:val="FirstParagraph"/>
+      </w:pPr>
+      <w:r>
+        <w:t xml:space="preserve">Diving deeper into where the significant differences lie between the regions, our Tukey analysis unveiled a surprising discovery, that is the only significant difference (at the .05 significance level) found was between the southwest and southeast regions (see Table 2: TukeyHSD results below for full test statistics). This was surprising because it differed from what we would have assumed to be the regions where a significant difference would lie.</w:t>
+      </w:r>
+    </w:p>
+    <w:p xmlns:w="http://schemas.openxmlformats.org/wordprocessingml/2006/main" xmlns:wp="http://schemas.openxmlformats.org/drawingml/2006/wordprocessingDrawing" xmlns:r="http://schemas.openxmlformats.org/officeDocument/2006/relationships" xmlns:w14="http://schemas.microsoft.com/office/word/2010/wordml">
+      <w:pPr>
+        <w:pStyle w:val="TableCaption"/>
+        <w:jc w:val="center"/>
+        <w:keepNext/>
+        <w:pBdr>
+          <w:bottom w:val="none" w:sz="0" w:space="0" w:color="000000"/>
+          <w:top w:val="none" w:sz="0" w:space="0" w:color="000000"/>
+          <w:left w:val="none" w:sz="0" w:space="0" w:color="000000"/>
+          <w:right w:val="none" w:sz="0" w:space="0" w:color="000000"/>
+        </w:pBdr>
+        <w:spacing w:after="60" w:before="60" w:line="240"/>
+        <w:ind w:left="60" w:right="60" w:firstLine="0" w:firstLineChars="0"/>
+      </w:pPr>
+      <w:r>
+        <w:t xml:space="preserve">Table 2: TukeyHSD results</w:t>
+      </w:r>
+    </w:p>
+    <w:tbl xmlns:w="http://schemas.openxmlformats.org/wordprocessingml/2006/main" xmlns:r="http://schemas.openxmlformats.org/officeDocument/2006/relationships" xmlns:w14="http://schemas.microsoft.com/office/word/2010/wordml" xmlns:wp="http://schemas.openxmlformats.org/drawingml/2006/wordprocessingDrawing" xmlns:a="http://schemas.openxmlformats.org/drawingml/2006/main" xmlns:pic="http://schemas.openxmlformats.org/drawingml/2006/picture">
+      <w:tblPr>
+        <w:tblLayout w:type="fixed"/>
+        <w:jc w:val="center"/>
+        <w:tblLook w:firstRow="1" w:lastRow="0" w:firstColumn="0" w:lastColumn="0" w:noHBand="0" w:noVBand="1"/>
+      </w:tblPr>
+      <w:tblGrid>
+        <w:gridCol w:w="2559"/>
+        <w:gridCol w:w="1638"/>
+        <w:gridCol w:w="1638"/>
+        <w:gridCol w:w="1559"/>
+        <w:gridCol w:w="1518"/>
+      </w:tblGrid>
+      <w:tr>
+        <w:trPr>
+          <w:trHeight w:val="526" w:hRule="auto"/>
+          <w:tblHeader/>
+        </w:trPr>
+        header1
+        <w:tc>
+          <w:tcPr>
+            <w:tcBorders>
+              <w:bottom w:val="single" w:sz="12" w:space="0" w:color="BEBEBE"/>
+              <w:top w:val="single" w:sz="12" w:space="0" w:color="BEBEBE"/>
+              <w:left w:val="none" w:sz="0" w:space="0" w:color="000000"/>
+              <w:right w:val="none" w:sz="0" w:space="0" w:color="000000"/>
+            </w:tcBorders>
+            <w:shd w:val="clear" w:color="auto" w:fill="FFFFFF"/>
+            <w:tcMar>
+              <w:top w:w="0" w:type="dxa"/>
+              <w:bottom w:w="0" w:type="dxa"/>
+              <w:left w:w="0" w:type="dxa"/>
+              <w:right w:w="0" w:type="dxa"/>
+            </w:tcMar>
+            <w:vAlign w:val="center"/>
+          </w:tcPr>
+          <w:p>
+            <w:pPr>
+              <w:pStyle w:val="Normal"/>
+              <w:jc w:val="left"/>
+              <w:pBdr>
+                <w:bottom w:val="none" w:sz="0" w:space="0" w:color="000000"/>
+                <w:top w:val="none" w:sz="0" w:space="0" w:color="000000"/>
+                <w:left w:val="none" w:sz="0" w:space="0" w:color="000000"/>
+                <w:right w:val="none" w:sz="0" w:space="0" w:color="000000"/>
+              </w:pBdr>
+              <w:spacing w:after="60" w:before="60" w:line="312"/>
+              <w:ind w:left="80" w:right="80" w:firstLine="0" w:firstLineChars="0"/>
+              <w:rPr>
+                <w:rFonts w:ascii="Arial" w:hAnsi="Arial" w:eastAsia="Arial" w:cs="Arial"/>
+                <w:i w:val="false"/>
+                <w:b w:val="false"/>
+                <w:u w:val="none"/>
+                <w:sz w:val="24"/>
+                <w:szCs w:val="24"/>
+                <w:color w:val="000000"/>
+              </w:rPr>
+            </w:pPr>
+            <w:r xmlns:w="http://schemas.openxmlformats.org/wordprocessingml/2006/main" xmlns:wp="http://schemas.openxmlformats.org/drawingml/2006/wordprocessingDrawing" xmlns:r="http://schemas.openxmlformats.org/officeDocument/2006/relationships" xmlns:w14="http://schemas.microsoft.com/office/word/2010/wordml">
+              <w:rPr>
+                <w:rFonts w:ascii="Arial" w:hAnsi="Arial" w:eastAsia="Arial" w:cs="Arial"/>
+                <w:i w:val="false"/>
+                <w:b w:val="false"/>
+                <w:u w:val="none"/>
+                <w:sz w:val="24"/>
+                <w:szCs w:val="24"/>
+                <w:color w:val="000000"/>
+              </w:rPr>
+              <w:t xml:space="preserve">Region</w:t>
+            </w:r>
+          </w:p>
+        </w:tc>
+        <w:tc>
+          <w:tcPr>
+            <w:tcBorders>
+              <w:bottom w:val="single" w:sz="12" w:space="0" w:color="BEBEBE"/>
+              <w:top w:val="single" w:sz="12" w:space="0" w:color="BEBEBE"/>
+              <w:left w:val="none" w:sz="0" w:space="0" w:color="000000"/>
+              <w:right w:val="none" w:sz="0" w:space="0" w:color="000000"/>
+            </w:tcBorders>
+            <w:shd w:val="clear" w:color="auto" w:fill="FFFFFF"/>
+            <w:tcMar>
+              <w:top w:w="0" w:type="dxa"/>
+              <w:bottom w:w="0" w:type="dxa"/>
+              <w:left w:w="0" w:type="dxa"/>
+              <w:right w:w="0" w:type="dxa"/>
+            </w:tcMar>
+            <w:vAlign w:val="center"/>
+          </w:tcPr>
+          <w:p>
+            <w:pPr>
+              <w:pStyle w:val="Normal"/>
+              <w:jc w:val="right"/>
+              <w:pBdr>
+                <w:bottom w:val="none" w:sz="0" w:space="0" w:color="000000"/>
+                <w:top w:val="none" w:sz="0" w:space="0" w:color="000000"/>
+                <w:left w:val="none" w:sz="0" w:space="0" w:color="000000"/>
+                <w:right w:val="none" w:sz="0" w:space="0" w:color="000000"/>
+              </w:pBdr>
+              <w:spacing w:after="60" w:before="60" w:line="312"/>
+              <w:ind w:left="80" w:right="80" w:firstLine="0" w:firstLineChars="0"/>
+              <w:rPr>
+                <w:rFonts w:ascii="Arial" w:hAnsi="Arial" w:eastAsia="Arial" w:cs="Arial"/>
+                <w:i w:val="false"/>
+                <w:b w:val="false"/>
+                <w:u w:val="none"/>
+                <w:sz w:val="24"/>
+                <w:szCs w:val="24"/>
+                <w:color w:val="000000"/>
+              </w:rPr>
+            </w:pPr>
+            <w:r xmlns:w="http://schemas.openxmlformats.org/wordprocessingml/2006/main" xmlns:wp="http://schemas.openxmlformats.org/drawingml/2006/wordprocessingDrawing" xmlns:r="http://schemas.openxmlformats.org/officeDocument/2006/relationships" xmlns:w14="http://schemas.microsoft.com/office/word/2010/wordml">
+              <w:rPr>
+                <w:rFonts w:ascii="Arial" w:hAnsi="Arial" w:eastAsia="Arial" w:cs="Arial"/>
+                <w:i w:val="false"/>
+                <w:b w:val="false"/>
+                <w:u w:val="none"/>
+                <w:sz w:val="24"/>
+                <w:szCs w:val="24"/>
+                <w:color w:val="000000"/>
+              </w:rPr>
+              <w:t xml:space="preserve">Diff</w:t>
+            </w:r>
+          </w:p>
+        </w:tc>
+        <w:tc>
+          <w:tcPr>
+            <w:tcBorders>
+              <w:bottom w:val="single" w:sz="12" w:space="0" w:color="BEBEBE"/>
+              <w:top w:val="single" w:sz="12" w:space="0" w:color="BEBEBE"/>
+              <w:left w:val="none" w:sz="0" w:space="0" w:color="000000"/>
+              <w:right w:val="none" w:sz="0" w:space="0" w:color="000000"/>
+            </w:tcBorders>
+            <w:shd w:val="clear" w:color="auto" w:fill="FFFFFF"/>
+            <w:tcMar>
+              <w:top w:w="0" w:type="dxa"/>
+              <w:bottom w:w="0" w:type="dxa"/>
+              <w:left w:w="0" w:type="dxa"/>
+              <w:right w:w="0" w:type="dxa"/>
+            </w:tcMar>
+            <w:vAlign w:val="center"/>
+          </w:tcPr>
+          <w:p>
+            <w:pPr>
+              <w:pStyle w:val="Normal"/>
+              <w:jc w:val="right"/>
+              <w:pBdr>
+                <w:bottom w:val="none" w:sz="0" w:space="0" w:color="000000"/>
+                <w:top w:val="none" w:sz="0" w:space="0" w:color="000000"/>
+                <w:left w:val="none" w:sz="0" w:space="0" w:color="000000"/>
+                <w:right w:val="none" w:sz="0" w:space="0" w:color="000000"/>
+              </w:pBdr>
+              <w:spacing w:after="60" w:before="60" w:line="312"/>
+              <w:ind w:left="80" w:right="80" w:firstLine="0" w:firstLineChars="0"/>
+              <w:rPr>
+                <w:rFonts w:ascii="Arial" w:hAnsi="Arial" w:eastAsia="Arial" w:cs="Arial"/>
+                <w:i w:val="false"/>
+                <w:b w:val="false"/>
+                <w:u w:val="none"/>
+                <w:sz w:val="24"/>
+                <w:szCs w:val="24"/>
+                <w:color w:val="000000"/>
+              </w:rPr>
+            </w:pPr>
+            <w:r xmlns:w="http://schemas.openxmlformats.org/wordprocessingml/2006/main" xmlns:wp="http://schemas.openxmlformats.org/drawingml/2006/wordprocessingDrawing" xmlns:r="http://schemas.openxmlformats.org/officeDocument/2006/relationships" xmlns:w14="http://schemas.microsoft.com/office/word/2010/wordml">
+              <w:rPr>
+                <w:rFonts w:ascii="Arial" w:hAnsi="Arial" w:eastAsia="Arial" w:cs="Arial"/>
+                <w:i w:val="false"/>
+                <w:b w:val="false"/>
+                <w:u w:val="none"/>
+                <w:sz w:val="24"/>
+                <w:szCs w:val="24"/>
+                <w:color w:val="000000"/>
+              </w:rPr>
+              <w:t xml:space="preserve">Lower</w:t>
+            </w:r>
+          </w:p>
+        </w:tc>
+        <w:tc>
+          <w:tcPr>
+            <w:tcBorders>
+              <w:bottom w:val="single" w:sz="12" w:space="0" w:color="BEBEBE"/>
+              <w:top w:val="single" w:sz="12" w:space="0" w:color="BEBEBE"/>
+              <w:left w:val="none" w:sz="0" w:space="0" w:color="000000"/>
+              <w:right w:val="none" w:sz="0" w:space="0" w:color="000000"/>
+            </w:tcBorders>
+            <w:shd w:val="clear" w:color="auto" w:fill="FFFFFF"/>
+            <w:tcMar>
+              <w:top w:w="0" w:type="dxa"/>
+              <w:bottom w:w="0" w:type="dxa"/>
+              <w:left w:w="0" w:type="dxa"/>
+              <w:right w:w="0" w:type="dxa"/>
+            </w:tcMar>
+            <w:vAlign w:val="center"/>
+          </w:tcPr>
+          <w:p>
+            <w:pPr>
+              <w:pStyle w:val="Normal"/>
+              <w:jc w:val="right"/>
+              <w:pBdr>
+                <w:bottom w:val="none" w:sz="0" w:space="0" w:color="000000"/>
+                <w:top w:val="none" w:sz="0" w:space="0" w:color="000000"/>
+                <w:left w:val="none" w:sz="0" w:space="0" w:color="000000"/>
+                <w:right w:val="none" w:sz="0" w:space="0" w:color="000000"/>
+              </w:pBdr>
+              <w:spacing w:after="60" w:before="60" w:line="312"/>
+              <w:ind w:left="80" w:right="80" w:firstLine="0" w:firstLineChars="0"/>
+              <w:rPr>
+                <w:rFonts w:ascii="Arial" w:hAnsi="Arial" w:eastAsia="Arial" w:cs="Arial"/>
+                <w:i w:val="false"/>
+                <w:b w:val="false"/>
+                <w:u w:val="none"/>
+                <w:sz w:val="24"/>
+                <w:szCs w:val="24"/>
+                <w:color w:val="000000"/>
+              </w:rPr>
+            </w:pPr>
+            <w:r xmlns:w="http://schemas.openxmlformats.org/wordprocessingml/2006/main" xmlns:wp="http://schemas.openxmlformats.org/drawingml/2006/wordprocessingDrawing" xmlns:r="http://schemas.openxmlformats.org/officeDocument/2006/relationships" xmlns:w14="http://schemas.microsoft.com/office/word/2010/wordml">
+              <w:rPr>
+                <w:rFonts w:ascii="Arial" w:hAnsi="Arial" w:eastAsia="Arial" w:cs="Arial"/>
+                <w:i w:val="false"/>
+                <w:b w:val="false"/>
+                <w:u w:val="none"/>
+                <w:sz w:val="24"/>
+                <w:szCs w:val="24"/>
+                <w:color w:val="000000"/>
+              </w:rPr>
+              <w:t xml:space="preserve">Upper</w:t>
+            </w:r>
+          </w:p>
+        </w:tc>
+        <w:tc>
+          <w:tcPr>
+            <w:tcBorders>
+              <w:bottom w:val="single" w:sz="12" w:space="0" w:color="BEBEBE"/>
+              <w:top w:val="single" w:sz="12" w:space="0" w:color="BEBEBE"/>
+              <w:left w:val="none" w:sz="0" w:space="0" w:color="000000"/>
+              <w:right w:val="none" w:sz="0" w:space="0" w:color="000000"/>
+            </w:tcBorders>
+            <w:shd w:val="clear" w:color="auto" w:fill="FFFFFF"/>
+            <w:tcMar>
+              <w:top w:w="0" w:type="dxa"/>
+              <w:bottom w:w="0" w:type="dxa"/>
+              <w:left w:w="0" w:type="dxa"/>
+              <w:right w:w="0" w:type="dxa"/>
+            </w:tcMar>
+            <w:vAlign w:val="center"/>
+          </w:tcPr>
+          <w:p>
+            <w:pPr>
+              <w:pStyle w:val="Normal"/>
+              <w:jc w:val="right"/>
+              <w:pBdr>
+                <w:bottom w:val="none" w:sz="0" w:space="0" w:color="000000"/>
+                <w:top w:val="none" w:sz="0" w:space="0" w:color="000000"/>
+                <w:left w:val="none" w:sz="0" w:space="0" w:color="000000"/>
+                <w:right w:val="none" w:sz="0" w:space="0" w:color="000000"/>
+              </w:pBdr>
+              <w:spacing w:after="60" w:before="60" w:line="312"/>
+              <w:ind w:left="80" w:right="80" w:firstLine="0" w:firstLineChars="0"/>
+              <w:rPr>
+                <w:rFonts w:ascii="Arial" w:hAnsi="Arial" w:eastAsia="Arial" w:cs="Arial"/>
+                <w:i w:val="false"/>
+                <w:b w:val="false"/>
+                <w:u w:val="none"/>
+                <w:sz w:val="24"/>
+                <w:szCs w:val="24"/>
+                <w:color w:val="000000"/>
+              </w:rPr>
+            </w:pPr>
+            <w:r xmlns:w="http://schemas.openxmlformats.org/wordprocessingml/2006/main" xmlns:wp="http://schemas.openxmlformats.org/drawingml/2006/wordprocessingDrawing" xmlns:r="http://schemas.openxmlformats.org/officeDocument/2006/relationships" xmlns:w14="http://schemas.microsoft.com/office/word/2010/wordml">
+              <w:rPr>
+                <w:rFonts w:ascii="Arial" w:hAnsi="Arial" w:eastAsia="Arial" w:cs="Arial"/>
+                <w:i w:val="false"/>
+                <w:b w:val="false"/>
+                <w:u w:val="none"/>
+                <w:sz w:val="24"/>
+                <w:szCs w:val="24"/>
+                <w:color w:val="000000"/>
+              </w:rPr>
+              <w:t xml:space="preserve">Adjusted P</w:t>
+            </w:r>
+          </w:p>
+        </w:tc>
+      </w:tr>
+      <w:tr>
+        <w:trPr>
+          <w:trHeight w:val="510" w:hRule="auto"/>
+        </w:trPr>
+        body1
+        <w:tc>
+          <w:tcPr>
+            <w:tcBorders>
+              <w:bottom w:val="none" w:sz="0" w:space="0" w:color="000000"/>
+              <w:top w:val="single" w:sz="12" w:space="0" w:color="BEBEBE"/>
+              <w:left w:val="none" w:sz="0" w:space="0" w:color="000000"/>
+              <w:right w:val="none" w:sz="0" w:space="0" w:color="000000"/>
+            </w:tcBorders>
+            <w:shd w:val="clear" w:color="auto" w:fill="FFFFFF"/>
+            <w:tcMar>
+              <w:top w:w="0" w:type="dxa"/>
+              <w:bottom w:w="0" w:type="dxa"/>
+              <w:left w:w="0" w:type="dxa"/>
+              <w:right w:w="0" w:type="dxa"/>
+            </w:tcMar>
+            <w:vAlign w:val="center"/>
+          </w:tcPr>
+          <w:p>
+            <w:pPr>
+              <w:pStyle w:val="Normal"/>
+              <w:jc w:val="left"/>
+              <w:pBdr>
+                <w:bottom w:val="none" w:sz="0" w:space="0" w:color="000000"/>
+                <w:top w:val="none" w:sz="0" w:space="0" w:color="000000"/>
+                <w:left w:val="none" w:sz="0" w:space="0" w:color="000000"/>
+                <w:right w:val="none" w:sz="0" w:space="0" w:color="000000"/>
+              </w:pBdr>
+              <w:spacing w:after="60" w:before="60" w:line="312"/>
+              <w:ind w:left="80" w:right="80" w:firstLine="0" w:firstLineChars="0"/>
+              <w:rPr>
+                <w:rFonts w:ascii="Arial" w:hAnsi="Arial" w:eastAsia="Arial" w:cs="Arial"/>
+                <w:i w:val="false"/>
+                <w:b w:val="false"/>
+                <w:u w:val="none"/>
+                <w:sz w:val="24"/>
+                <w:szCs w:val="24"/>
+                <w:color w:val="000000"/>
+              </w:rPr>
+            </w:pPr>
+            <w:r xmlns:w="http://schemas.openxmlformats.org/wordprocessingml/2006/main" xmlns:wp="http://schemas.openxmlformats.org/drawingml/2006/wordprocessingDrawing" xmlns:r="http://schemas.openxmlformats.org/officeDocument/2006/relationships" xmlns:w14="http://schemas.microsoft.com/office/word/2010/wordml">
+              <w:rPr>
+                <w:rFonts w:ascii="Arial" w:hAnsi="Arial" w:eastAsia="Arial" w:cs="Arial"/>
+                <w:i w:val="false"/>
+                <w:b w:val="false"/>
+                <w:u w:val="none"/>
+                <w:sz w:val="24"/>
+                <w:szCs w:val="24"/>
+                <w:color w:val="000000"/>
+              </w:rPr>
+              <w:t xml:space="preserve">northwest-northeast</w:t>
+            </w:r>
+          </w:p>
+        </w:tc>
+        <w:tc>
+          <w:tcPr>
+            <w:tcBorders>
+              <w:bottom w:val="none" w:sz="0" w:space="0" w:color="000000"/>
+              <w:top w:val="single" w:sz="12" w:space="0" w:color="BEBEBE"/>
+              <w:left w:val="none" w:sz="0" w:space="0" w:color="000000"/>
+              <w:right w:val="none" w:sz="0" w:space="0" w:color="000000"/>
+            </w:tcBorders>
+            <w:shd w:val="clear" w:color="auto" w:fill="FFFFFF"/>
+            <w:tcMar>
+              <w:top w:w="0" w:type="dxa"/>
+              <w:bottom w:w="0" w:type="dxa"/>
+              <w:left w:w="0" w:type="dxa"/>
+              <w:right w:w="0" w:type="dxa"/>
+            </w:tcMar>
+            <w:vAlign w:val="center"/>
+          </w:tcPr>
+          <w:p>
+            <w:pPr>
+              <w:pStyle w:val="Normal"/>
+              <w:jc w:val="right"/>
+              <w:pBdr>
+                <w:bottom w:val="none" w:sz="0" w:space="0" w:color="000000"/>
+                <w:top w:val="none" w:sz="0" w:space="0" w:color="000000"/>
+                <w:left w:val="none" w:sz="0" w:space="0" w:color="000000"/>
+                <w:right w:val="none" w:sz="0" w:space="0" w:color="000000"/>
+              </w:pBdr>
+              <w:spacing w:after="60" w:before="60" w:line="312"/>
+              <w:ind w:left="80" w:right="80" w:firstLine="0" w:firstLineChars="0"/>
+              <w:rPr>
+                <w:rFonts w:ascii="Arial" w:hAnsi="Arial" w:eastAsia="Arial" w:cs="Arial"/>
+                <w:i w:val="false"/>
+                <w:b w:val="false"/>
+                <w:u w:val="none"/>
+                <w:sz w:val="24"/>
+                <w:szCs w:val="24"/>
+                <w:color w:val="000000"/>
+              </w:rPr>
+            </w:pPr>
+            <w:r xmlns:w="http://schemas.openxmlformats.org/wordprocessingml/2006/main" xmlns:wp="http://schemas.openxmlformats.org/drawingml/2006/wordprocessingDrawing" xmlns:r="http://schemas.openxmlformats.org/officeDocument/2006/relationships" xmlns:w14="http://schemas.microsoft.com/office/word/2010/wordml">
+              <w:rPr>
+                <w:rFonts w:ascii="Arial" w:hAnsi="Arial" w:eastAsia="Arial" w:cs="Arial"/>
+                <w:i w:val="false"/>
+                <w:b w:val="false"/>
+                <w:u w:val="none"/>
+                <w:sz w:val="24"/>
+                <w:szCs w:val="24"/>
+                <w:color w:val="000000"/>
+              </w:rPr>
+              <w:t xml:space="preserve">-988.8091</w:t>
+            </w:r>
+          </w:p>
+        </w:tc>
+        <w:tc>
+          <w:tcPr>
+            <w:tcBorders>
+              <w:bottom w:val="none" w:sz="0" w:space="0" w:color="000000"/>
+              <w:top w:val="single" w:sz="12" w:space="0" w:color="BEBEBE"/>
+              <w:left w:val="none" w:sz="0" w:space="0" w:color="000000"/>
+              <w:right w:val="none" w:sz="0" w:space="0" w:color="000000"/>
+            </w:tcBorders>
+            <w:shd w:val="clear" w:color="auto" w:fill="FFFFFF"/>
+            <w:tcMar>
+              <w:top w:w="0" w:type="dxa"/>
+              <w:bottom w:w="0" w:type="dxa"/>
+              <w:left w:w="0" w:type="dxa"/>
+              <w:right w:w="0" w:type="dxa"/>
+            </w:tcMar>
+            <w:vAlign w:val="center"/>
+          </w:tcPr>
+          <w:p>
+            <w:pPr>
+              <w:pStyle w:val="Normal"/>
+              <w:jc w:val="right"/>
+              <w:pBdr>
+                <w:bottom w:val="none" w:sz="0" w:space="0" w:color="000000"/>
+                <w:top w:val="none" w:sz="0" w:space="0" w:color="000000"/>
+                <w:left w:val="none" w:sz="0" w:space="0" w:color="000000"/>
+                <w:right w:val="none" w:sz="0" w:space="0" w:color="000000"/>
+              </w:pBdr>
+              <w:spacing w:after="60" w:before="60" w:line="312"/>
+              <w:ind w:left="80" w:right="80" w:firstLine="0" w:firstLineChars="0"/>
+              <w:rPr>
+                <w:rFonts w:ascii="Arial" w:hAnsi="Arial" w:eastAsia="Arial" w:cs="Arial"/>
+                <w:i w:val="false"/>
+                <w:b w:val="false"/>
+                <w:u w:val="none"/>
+                <w:sz w:val="24"/>
+                <w:szCs w:val="24"/>
+                <w:color w:val="000000"/>
+              </w:rPr>
+            </w:pPr>
+            <w:r xmlns:w="http://schemas.openxmlformats.org/wordprocessingml/2006/main" xmlns:wp="http://schemas.openxmlformats.org/drawingml/2006/wordprocessingDrawing" xmlns:r="http://schemas.openxmlformats.org/officeDocument/2006/relationships" xmlns:w14="http://schemas.microsoft.com/office/word/2010/wordml">
+              <w:rPr>
+                <w:rFonts w:ascii="Arial" w:hAnsi="Arial" w:eastAsia="Arial" w:cs="Arial"/>
+                <w:i w:val="false"/>
+                <w:b w:val="false"/>
+                <w:u w:val="none"/>
+                <w:sz w:val="24"/>
+                <w:szCs w:val="24"/>
+                <w:color w:val="000000"/>
+              </w:rPr>
+              <w:t xml:space="preserve">-3,426.6228</w:t>
+            </w:r>
+          </w:p>
+        </w:tc>
+        <w:tc>
+          <w:tcPr>
+            <w:tcBorders>
+              <w:bottom w:val="none" w:sz="0" w:space="0" w:color="000000"/>
+              <w:top w:val="single" w:sz="12" w:space="0" w:color="BEBEBE"/>
+              <w:left w:val="none" w:sz="0" w:space="0" w:color="000000"/>
+              <w:right w:val="none" w:sz="0" w:space="0" w:color="000000"/>
+            </w:tcBorders>
+            <w:shd w:val="clear" w:color="auto" w:fill="FFFFFF"/>
+            <w:tcMar>
+              <w:top w:w="0" w:type="dxa"/>
+              <w:bottom w:w="0" w:type="dxa"/>
+              <w:left w:w="0" w:type="dxa"/>
+              <w:right w:w="0" w:type="dxa"/>
+            </w:tcMar>
+            <w:vAlign w:val="center"/>
+          </w:tcPr>
+          <w:p>
+            <w:pPr>
+              <w:pStyle w:val="Normal"/>
+              <w:jc w:val="right"/>
+              <w:pBdr>
+                <w:bottom w:val="none" w:sz="0" w:space="0" w:color="000000"/>
+                <w:top w:val="none" w:sz="0" w:space="0" w:color="000000"/>
+                <w:left w:val="none" w:sz="0" w:space="0" w:color="000000"/>
+                <w:right w:val="none" w:sz="0" w:space="0" w:color="000000"/>
+              </w:pBdr>
+              <w:spacing w:after="60" w:before="60" w:line="312"/>
+              <w:ind w:left="80" w:right="80" w:firstLine="0" w:firstLineChars="0"/>
+              <w:rPr>
+                <w:rFonts w:ascii="Arial" w:hAnsi="Arial" w:eastAsia="Arial" w:cs="Arial"/>
+                <w:i w:val="false"/>
+                <w:b w:val="false"/>
+                <w:u w:val="none"/>
+                <w:sz w:val="24"/>
+                <w:szCs w:val="24"/>
+                <w:color w:val="000000"/>
+              </w:rPr>
+            </w:pPr>
+            <w:r xmlns:w="http://schemas.openxmlformats.org/wordprocessingml/2006/main" xmlns:wp="http://schemas.openxmlformats.org/drawingml/2006/wordprocessingDrawing" xmlns:r="http://schemas.openxmlformats.org/officeDocument/2006/relationships" xmlns:w14="http://schemas.microsoft.com/office/word/2010/wordml">
+              <w:rPr>
+                <w:rFonts w:ascii="Arial" w:hAnsi="Arial" w:eastAsia="Arial" w:cs="Arial"/>
+                <w:i w:val="false"/>
+                <w:b w:val="false"/>
+                <w:u w:val="none"/>
+                <w:sz w:val="24"/>
+                <w:szCs w:val="24"/>
+                <w:color w:val="000000"/>
+              </w:rPr>
+              <w:t xml:space="preserve">1,449.0045</w:t>
+            </w:r>
+          </w:p>
+        </w:tc>
+        <w:tc>
+          <w:tcPr>
+            <w:tcBorders>
+              <w:bottom w:val="none" w:sz="0" w:space="0" w:color="000000"/>
+              <w:top w:val="single" w:sz="12" w:space="0" w:color="BEBEBE"/>
+              <w:left w:val="none" w:sz="0" w:space="0" w:color="000000"/>
+              <w:right w:val="none" w:sz="0" w:space="0" w:color="000000"/>
+            </w:tcBorders>
+            <w:shd w:val="clear" w:color="auto" w:fill="FFFFFF"/>
+            <w:tcMar>
+              <w:top w:w="0" w:type="dxa"/>
+              <w:bottom w:w="0" w:type="dxa"/>
+              <w:left w:w="0" w:type="dxa"/>
+              <w:right w:w="0" w:type="dxa"/>
+            </w:tcMar>
+            <w:vAlign w:val="center"/>
+          </w:tcPr>
+          <w:p>
+            <w:pPr>
+              <w:pStyle w:val="Normal"/>
+              <w:jc w:val="right"/>
+              <w:pBdr>
+                <w:bottom w:val="none" w:sz="0" w:space="0" w:color="000000"/>
+                <w:top w:val="none" w:sz="0" w:space="0" w:color="000000"/>
+                <w:left w:val="none" w:sz="0" w:space="0" w:color="000000"/>
+                <w:right w:val="none" w:sz="0" w:space="0" w:color="000000"/>
+              </w:pBdr>
+              <w:spacing w:after="60" w:before="60" w:line="312"/>
+              <w:ind w:left="80" w:right="80" w:firstLine="0" w:firstLineChars="0"/>
+              <w:rPr>
+                <w:rFonts w:ascii="Arial" w:hAnsi="Arial" w:eastAsia="Arial" w:cs="Arial"/>
+                <w:i w:val="false"/>
+                <w:b w:val="false"/>
+                <w:u w:val="none"/>
+                <w:sz w:val="24"/>
+                <w:szCs w:val="24"/>
+                <w:color w:val="000000"/>
+              </w:rPr>
+            </w:pPr>
+            <w:r xmlns:w="http://schemas.openxmlformats.org/wordprocessingml/2006/main" xmlns:wp="http://schemas.openxmlformats.org/drawingml/2006/wordprocessingDrawing" xmlns:r="http://schemas.openxmlformats.org/officeDocument/2006/relationships" xmlns:w14="http://schemas.microsoft.com/office/word/2010/wordml">
+              <w:rPr>
+                <w:rFonts w:ascii="Arial" w:hAnsi="Arial" w:eastAsia="Arial" w:cs="Arial"/>
+                <w:i w:val="false"/>
+                <w:b w:val="false"/>
+                <w:u w:val="none"/>
+                <w:sz w:val="24"/>
+                <w:szCs w:val="24"/>
+                <w:color w:val="000000"/>
+              </w:rPr>
+              <w:t xml:space="preserve">0.7239</w:t>
+            </w:r>
+          </w:p>
+        </w:tc>
+      </w:tr>
+      <w:tr>
+        <w:trPr>
+          <w:trHeight w:val="510" w:hRule="auto"/>
+        </w:trPr>
+        body2
+        <w:tc>
+          <w:tcPr>
+            <w:tcBorders>
+              <w:bottom w:val="none" w:sz="0" w:space="0" w:color="000000"/>
+              <w:top w:val="none" w:sz="0" w:space="0" w:color="000000"/>
+              <w:left w:val="none" w:sz="0" w:space="0" w:color="000000"/>
+              <w:right w:val="none" w:sz="0" w:space="0" w:color="000000"/>
+            </w:tcBorders>
+            <w:shd w:val="clear" w:color="auto" w:fill="FFFFFF"/>
+            <w:tcMar>
+              <w:top w:w="0" w:type="dxa"/>
+              <w:bottom w:w="0" w:type="dxa"/>
+              <w:left w:w="0" w:type="dxa"/>
+              <w:right w:w="0" w:type="dxa"/>
+            </w:tcMar>
+            <w:vAlign w:val="center"/>
+          </w:tcPr>
+          <w:p>
+            <w:pPr>
+              <w:pStyle w:val="Normal"/>
+              <w:jc w:val="left"/>
+              <w:pBdr>
+                <w:bottom w:val="none" w:sz="0" w:space="0" w:color="000000"/>
+                <w:top w:val="none" w:sz="0" w:space="0" w:color="000000"/>
+                <w:left w:val="none" w:sz="0" w:space="0" w:color="000000"/>
+                <w:right w:val="none" w:sz="0" w:space="0" w:color="000000"/>
+              </w:pBdr>
+              <w:spacing w:after="60" w:before="60" w:line="312"/>
+              <w:ind w:left="80" w:right="80" w:firstLine="0" w:firstLineChars="0"/>
+              <w:rPr>
+                <w:rFonts w:ascii="Arial" w:hAnsi="Arial" w:eastAsia="Arial" w:cs="Arial"/>
+                <w:i w:val="false"/>
+                <w:b w:val="false"/>
+                <w:u w:val="none"/>
+                <w:sz w:val="24"/>
+                <w:szCs w:val="24"/>
+                <w:color w:val="000000"/>
+              </w:rPr>
+            </w:pPr>
+            <w:r xmlns:w="http://schemas.openxmlformats.org/wordprocessingml/2006/main" xmlns:wp="http://schemas.openxmlformats.org/drawingml/2006/wordprocessingDrawing" xmlns:r="http://schemas.openxmlformats.org/officeDocument/2006/relationships" xmlns:w14="http://schemas.microsoft.com/office/word/2010/wordml">
+              <w:rPr>
+                <w:rFonts w:ascii="Arial" w:hAnsi="Arial" w:eastAsia="Arial" w:cs="Arial"/>
+                <w:i w:val="false"/>
+                <w:b w:val="false"/>
+                <w:u w:val="none"/>
+                <w:sz w:val="24"/>
+                <w:szCs w:val="24"/>
+                <w:color w:val="000000"/>
+              </w:rPr>
+              <w:t xml:space="preserve">southeast-northeast</w:t>
+            </w:r>
+          </w:p>
+        </w:tc>
+        <w:tc>
+          <w:tcPr>
+            <w:tcBorders>
+              <w:bottom w:val="none" w:sz="0" w:space="0" w:color="000000"/>
+              <w:top w:val="none" w:sz="0" w:space="0" w:color="000000"/>
+              <w:left w:val="none" w:sz="0" w:space="0" w:color="000000"/>
+              <w:right w:val="none" w:sz="0" w:space="0" w:color="000000"/>
+            </w:tcBorders>
+            <w:shd w:val="clear" w:color="auto" w:fill="FFFFFF"/>
+            <w:tcMar>
+              <w:top w:w="0" w:type="dxa"/>
+              <w:bottom w:w="0" w:type="dxa"/>
+              <w:left w:w="0" w:type="dxa"/>
+              <w:right w:w="0" w:type="dxa"/>
+            </w:tcMar>
+            <w:vAlign w:val="center"/>
+          </w:tcPr>
+          <w:p>
+            <w:pPr>
+              <w:pStyle w:val="Normal"/>
+              <w:jc w:val="right"/>
+              <w:pBdr>
+                <w:bottom w:val="none" w:sz="0" w:space="0" w:color="000000"/>
+                <w:top w:val="none" w:sz="0" w:space="0" w:color="000000"/>
+                <w:left w:val="none" w:sz="0" w:space="0" w:color="000000"/>
+                <w:right w:val="none" w:sz="0" w:space="0" w:color="000000"/>
+              </w:pBdr>
+              <w:spacing w:after="60" w:before="60" w:line="312"/>
+              <w:ind w:left="80" w:right="80" w:firstLine="0" w:firstLineChars="0"/>
+              <w:rPr>
+                <w:rFonts w:ascii="Arial" w:hAnsi="Arial" w:eastAsia="Arial" w:cs="Arial"/>
+                <w:i w:val="false"/>
+                <w:b w:val="false"/>
+                <w:u w:val="none"/>
+                <w:sz w:val="24"/>
+                <w:szCs w:val="24"/>
+                <w:color w:val="000000"/>
+              </w:rPr>
+            </w:pPr>
+            <w:r xmlns:w="http://schemas.openxmlformats.org/wordprocessingml/2006/main" xmlns:wp="http://schemas.openxmlformats.org/drawingml/2006/wordprocessingDrawing" xmlns:r="http://schemas.openxmlformats.org/officeDocument/2006/relationships" xmlns:w14="http://schemas.microsoft.com/office/word/2010/wordml">
+              <w:rPr>
+                <w:rFonts w:ascii="Arial" w:hAnsi="Arial" w:eastAsia="Arial" w:cs="Arial"/>
+                <w:i w:val="false"/>
+                <w:b w:val="false"/>
+                <w:u w:val="none"/>
+                <w:sz w:val="24"/>
+                <w:szCs w:val="24"/>
+                <w:color w:val="000000"/>
+              </w:rPr>
+              <w:t xml:space="preserve">1,329.0269</w:t>
+            </w:r>
+          </w:p>
+        </w:tc>
+        <w:tc>
+          <w:tcPr>
+            <w:tcBorders>
+              <w:bottom w:val="none" w:sz="0" w:space="0" w:color="000000"/>
+              <w:top w:val="none" w:sz="0" w:space="0" w:color="000000"/>
+              <w:left w:val="none" w:sz="0" w:space="0" w:color="000000"/>
+              <w:right w:val="none" w:sz="0" w:space="0" w:color="000000"/>
+            </w:tcBorders>
+            <w:shd w:val="clear" w:color="auto" w:fill="FFFFFF"/>
+            <w:tcMar>
+              <w:top w:w="0" w:type="dxa"/>
+              <w:bottom w:w="0" w:type="dxa"/>
+              <w:left w:w="0" w:type="dxa"/>
+              <w:right w:w="0" w:type="dxa"/>
+            </w:tcMar>
+            <w:vAlign w:val="center"/>
+          </w:tcPr>
+          <w:p>
+            <w:pPr>
+              <w:pStyle w:val="Normal"/>
+              <w:jc w:val="right"/>
+              <w:pBdr>
+                <w:bottom w:val="none" w:sz="0" w:space="0" w:color="000000"/>
+                <w:top w:val="none" w:sz="0" w:space="0" w:color="000000"/>
+                <w:left w:val="none" w:sz="0" w:space="0" w:color="000000"/>
+                <w:right w:val="none" w:sz="0" w:space="0" w:color="000000"/>
+              </w:pBdr>
+              <w:spacing w:after="60" w:before="60" w:line="312"/>
+              <w:ind w:left="80" w:right="80" w:firstLine="0" w:firstLineChars="0"/>
+              <w:rPr>
+                <w:rFonts w:ascii="Arial" w:hAnsi="Arial" w:eastAsia="Arial" w:cs="Arial"/>
+                <w:i w:val="false"/>
+                <w:b w:val="false"/>
+                <w:u w:val="none"/>
+                <w:sz w:val="24"/>
+                <w:szCs w:val="24"/>
+                <w:color w:val="000000"/>
+              </w:rPr>
+            </w:pPr>
+            <w:r xmlns:w="http://schemas.openxmlformats.org/wordprocessingml/2006/main" xmlns:wp="http://schemas.openxmlformats.org/drawingml/2006/wordprocessingDrawing" xmlns:r="http://schemas.openxmlformats.org/officeDocument/2006/relationships" xmlns:w14="http://schemas.microsoft.com/office/word/2010/wordml">
+              <w:rPr>
+                <w:rFonts w:ascii="Arial" w:hAnsi="Arial" w:eastAsia="Arial" w:cs="Arial"/>
+                <w:i w:val="false"/>
+                <w:b w:val="false"/>
+                <w:u w:val="none"/>
+                <w:sz w:val="24"/>
+                <w:szCs w:val="24"/>
+                <w:color w:val="000000"/>
+              </w:rPr>
+              <w:t xml:space="preserve">-1,042.6928</w:t>
+            </w:r>
+          </w:p>
+        </w:tc>
+        <w:tc>
+          <w:tcPr>
+            <w:tcBorders>
+              <w:bottom w:val="none" w:sz="0" w:space="0" w:color="000000"/>
+              <w:top w:val="none" w:sz="0" w:space="0" w:color="000000"/>
+              <w:left w:val="none" w:sz="0" w:space="0" w:color="000000"/>
+              <w:right w:val="none" w:sz="0" w:space="0" w:color="000000"/>
+            </w:tcBorders>
+            <w:shd w:val="clear" w:color="auto" w:fill="FFFFFF"/>
+            <w:tcMar>
+              <w:top w:w="0" w:type="dxa"/>
+              <w:bottom w:w="0" w:type="dxa"/>
+              <w:left w:w="0" w:type="dxa"/>
+              <w:right w:w="0" w:type="dxa"/>
+            </w:tcMar>
+            <w:vAlign w:val="center"/>
+          </w:tcPr>
+          <w:p>
+            <w:pPr>
+              <w:pStyle w:val="Normal"/>
+              <w:jc w:val="right"/>
+              <w:pBdr>
+                <w:bottom w:val="none" w:sz="0" w:space="0" w:color="000000"/>
+                <w:top w:val="none" w:sz="0" w:space="0" w:color="000000"/>
+                <w:left w:val="none" w:sz="0" w:space="0" w:color="000000"/>
+                <w:right w:val="none" w:sz="0" w:space="0" w:color="000000"/>
+              </w:pBdr>
+              <w:spacing w:after="60" w:before="60" w:line="312"/>
+              <w:ind w:left="80" w:right="80" w:firstLine="0" w:firstLineChars="0"/>
+              <w:rPr>
+                <w:rFonts w:ascii="Arial" w:hAnsi="Arial" w:eastAsia="Arial" w:cs="Arial"/>
+                <w:i w:val="false"/>
+                <w:b w:val="false"/>
+                <w:u w:val="none"/>
+                <w:sz w:val="24"/>
+                <w:szCs w:val="24"/>
+                <w:color w:val="000000"/>
+              </w:rPr>
+            </w:pPr>
+            <w:r xmlns:w="http://schemas.openxmlformats.org/wordprocessingml/2006/main" xmlns:wp="http://schemas.openxmlformats.org/drawingml/2006/wordprocessingDrawing" xmlns:r="http://schemas.openxmlformats.org/officeDocument/2006/relationships" xmlns:w14="http://schemas.microsoft.com/office/word/2010/wordml">
+              <w:rPr>
+                <w:rFonts w:ascii="Arial" w:hAnsi="Arial" w:eastAsia="Arial" w:cs="Arial"/>
+                <w:i w:val="false"/>
+                <w:b w:val="false"/>
+                <w:u w:val="none"/>
+                <w:sz w:val="24"/>
+                <w:szCs w:val="24"/>
+                <w:color w:val="000000"/>
+              </w:rPr>
+              <w:t xml:space="preserve">3,700.7466</w:t>
+            </w:r>
+          </w:p>
+        </w:tc>
+        <w:tc>
+          <w:tcPr>
+            <w:tcBorders>
+              <w:bottom w:val="none" w:sz="0" w:space="0" w:color="000000"/>
+              <w:top w:val="none" w:sz="0" w:space="0" w:color="000000"/>
+              <w:left w:val="none" w:sz="0" w:space="0" w:color="000000"/>
+              <w:right w:val="none" w:sz="0" w:space="0" w:color="000000"/>
+            </w:tcBorders>
+            <w:shd w:val="clear" w:color="auto" w:fill="FFFFFF"/>
+            <w:tcMar>
+              <w:top w:w="0" w:type="dxa"/>
+              <w:bottom w:w="0" w:type="dxa"/>
+              <w:left w:w="0" w:type="dxa"/>
+              <w:right w:w="0" w:type="dxa"/>
+            </w:tcMar>
+            <w:vAlign w:val="center"/>
+          </w:tcPr>
+          <w:p>
+            <w:pPr>
+              <w:pStyle w:val="Normal"/>
+              <w:jc w:val="right"/>
+              <w:pBdr>
+                <w:bottom w:val="none" w:sz="0" w:space="0" w:color="000000"/>
+                <w:top w:val="none" w:sz="0" w:space="0" w:color="000000"/>
+                <w:left w:val="none" w:sz="0" w:space="0" w:color="000000"/>
+                <w:right w:val="none" w:sz="0" w:space="0" w:color="000000"/>
+              </w:pBdr>
+              <w:spacing w:after="60" w:before="60" w:line="312"/>
+              <w:ind w:left="80" w:right="80" w:firstLine="0" w:firstLineChars="0"/>
+              <w:rPr>
+                <w:rFonts w:ascii="Arial" w:hAnsi="Arial" w:eastAsia="Arial" w:cs="Arial"/>
+                <w:i w:val="false"/>
+                <w:b w:val="false"/>
+                <w:u w:val="none"/>
+                <w:sz w:val="24"/>
+                <w:szCs w:val="24"/>
+                <w:color w:val="000000"/>
+              </w:rPr>
+            </w:pPr>
+            <w:r xmlns:w="http://schemas.openxmlformats.org/wordprocessingml/2006/main" xmlns:wp="http://schemas.openxmlformats.org/drawingml/2006/wordprocessingDrawing" xmlns:r="http://schemas.openxmlformats.org/officeDocument/2006/relationships" xmlns:w14="http://schemas.microsoft.com/office/word/2010/wordml">
+              <w:rPr>
+                <w:rFonts w:ascii="Arial" w:hAnsi="Arial" w:eastAsia="Arial" w:cs="Arial"/>
+                <w:i w:val="false"/>
+                <w:b w:val="false"/>
+                <w:u w:val="none"/>
+                <w:sz w:val="24"/>
+                <w:szCs w:val="24"/>
+                <w:color w:val="000000"/>
+              </w:rPr>
+              <w:t xml:space="preserve">0.4737</w:t>
+            </w:r>
+          </w:p>
+        </w:tc>
+      </w:tr>
+      <w:tr>
+        <w:trPr>
+          <w:trHeight w:val="510" w:hRule="auto"/>
+        </w:trPr>
+        body3
+        <w:tc>
+          <w:tcPr>
+            <w:tcBorders>
+              <w:bottom w:val="none" w:sz="0" w:space="0" w:color="000000"/>
+              <w:top w:val="none" w:sz="0" w:space="0" w:color="000000"/>
+              <w:left w:val="none" w:sz="0" w:space="0" w:color="000000"/>
+              <w:right w:val="none" w:sz="0" w:space="0" w:color="000000"/>
+            </w:tcBorders>
+            <w:shd w:val="clear" w:color="auto" w:fill="FFFFFF"/>
+            <w:tcMar>
+              <w:top w:w="0" w:type="dxa"/>
+              <w:bottom w:w="0" w:type="dxa"/>
+              <w:left w:w="0" w:type="dxa"/>
+              <w:right w:w="0" w:type="dxa"/>
+            </w:tcMar>
+            <w:vAlign w:val="center"/>
+          </w:tcPr>
+          <w:p>
+            <w:pPr>
+              <w:pStyle w:val="Normal"/>
+              <w:jc w:val="left"/>
+              <w:pBdr>
+                <w:bottom w:val="none" w:sz="0" w:space="0" w:color="000000"/>
+                <w:top w:val="none" w:sz="0" w:space="0" w:color="000000"/>
+                <w:left w:val="none" w:sz="0" w:space="0" w:color="000000"/>
+                <w:right w:val="none" w:sz="0" w:space="0" w:color="000000"/>
+              </w:pBdr>
+              <w:spacing w:after="60" w:before="60" w:line="312"/>
+              <w:ind w:left="80" w:right="80" w:firstLine="0" w:firstLineChars="0"/>
+              <w:rPr>
+                <w:rFonts w:ascii="Arial" w:hAnsi="Arial" w:eastAsia="Arial" w:cs="Arial"/>
+                <w:i w:val="false"/>
+                <w:b w:val="false"/>
+                <w:u w:val="none"/>
+                <w:sz w:val="24"/>
+                <w:szCs w:val="24"/>
+                <w:color w:val="000000"/>
+              </w:rPr>
+            </w:pPr>
+            <w:r xmlns:w="http://schemas.openxmlformats.org/wordprocessingml/2006/main" xmlns:wp="http://schemas.openxmlformats.org/drawingml/2006/wordprocessingDrawing" xmlns:r="http://schemas.openxmlformats.org/officeDocument/2006/relationships" xmlns:w14="http://schemas.microsoft.com/office/word/2010/wordml">
+              <w:rPr>
+                <w:rFonts w:ascii="Arial" w:hAnsi="Arial" w:eastAsia="Arial" w:cs="Arial"/>
+                <w:i w:val="false"/>
+                <w:b w:val="false"/>
+                <w:u w:val="none"/>
+                <w:sz w:val="24"/>
+                <w:szCs w:val="24"/>
+                <w:color w:val="000000"/>
+              </w:rPr>
+              <w:t xml:space="preserve">southwest-northeast</w:t>
+            </w:r>
+          </w:p>
+        </w:tc>
+        <w:tc>
+          <w:tcPr>
+            <w:tcBorders>
+              <w:bottom w:val="none" w:sz="0" w:space="0" w:color="000000"/>
+              <w:top w:val="none" w:sz="0" w:space="0" w:color="000000"/>
+              <w:left w:val="none" w:sz="0" w:space="0" w:color="000000"/>
+              <w:right w:val="none" w:sz="0" w:space="0" w:color="000000"/>
+            </w:tcBorders>
+            <w:shd w:val="clear" w:color="auto" w:fill="FFFFFF"/>
+            <w:tcMar>
+              <w:top w:w="0" w:type="dxa"/>
+              <w:bottom w:w="0" w:type="dxa"/>
+              <w:left w:w="0" w:type="dxa"/>
+              <w:right w:w="0" w:type="dxa"/>
+            </w:tcMar>
+            <w:vAlign w:val="center"/>
+          </w:tcPr>
+          <w:p>
+            <w:pPr>
+              <w:pStyle w:val="Normal"/>
+              <w:jc w:val="right"/>
+              <w:pBdr>
+                <w:bottom w:val="none" w:sz="0" w:space="0" w:color="000000"/>
+                <w:top w:val="none" w:sz="0" w:space="0" w:color="000000"/>
+                <w:left w:val="none" w:sz="0" w:space="0" w:color="000000"/>
+                <w:right w:val="none" w:sz="0" w:space="0" w:color="000000"/>
+              </w:pBdr>
+              <w:spacing w:after="60" w:before="60" w:line="312"/>
+              <w:ind w:left="80" w:right="80" w:firstLine="0" w:firstLineChars="0"/>
+              <w:rPr>
+                <w:rFonts w:ascii="Arial" w:hAnsi="Arial" w:eastAsia="Arial" w:cs="Arial"/>
+                <w:i w:val="false"/>
+                <w:b w:val="false"/>
+                <w:u w:val="none"/>
+                <w:sz w:val="24"/>
+                <w:szCs w:val="24"/>
+                <w:color w:val="000000"/>
+              </w:rPr>
+            </w:pPr>
+            <w:r xmlns:w="http://schemas.openxmlformats.org/wordprocessingml/2006/main" xmlns:wp="http://schemas.openxmlformats.org/drawingml/2006/wordprocessingDrawing" xmlns:r="http://schemas.openxmlformats.org/officeDocument/2006/relationships" xmlns:w14="http://schemas.microsoft.com/office/word/2010/wordml">
+              <w:rPr>
+                <w:rFonts w:ascii="Arial" w:hAnsi="Arial" w:eastAsia="Arial" w:cs="Arial"/>
+                <w:i w:val="false"/>
+                <w:b w:val="false"/>
+                <w:u w:val="none"/>
+                <w:sz w:val="24"/>
+                <w:szCs w:val="24"/>
+                <w:color w:val="000000"/>
+              </w:rPr>
+              <w:t xml:space="preserve">-1,059.4471</w:t>
+            </w:r>
+          </w:p>
+        </w:tc>
+        <w:tc>
+          <w:tcPr>
+            <w:tcBorders>
+              <w:bottom w:val="none" w:sz="0" w:space="0" w:color="000000"/>
+              <w:top w:val="none" w:sz="0" w:space="0" w:color="000000"/>
+              <w:left w:val="none" w:sz="0" w:space="0" w:color="000000"/>
+              <w:right w:val="none" w:sz="0" w:space="0" w:color="000000"/>
+            </w:tcBorders>
+            <w:shd w:val="clear" w:color="auto" w:fill="FFFFFF"/>
+            <w:tcMar>
+              <w:top w:w="0" w:type="dxa"/>
+              <w:bottom w:w="0" w:type="dxa"/>
+              <w:left w:w="0" w:type="dxa"/>
+              <w:right w:w="0" w:type="dxa"/>
+            </w:tcMar>
+            <w:vAlign w:val="center"/>
+          </w:tcPr>
+          <w:p>
+            <w:pPr>
+              <w:pStyle w:val="Normal"/>
+              <w:jc w:val="right"/>
+              <w:pBdr>
+                <w:bottom w:val="none" w:sz="0" w:space="0" w:color="000000"/>
+                <w:top w:val="none" w:sz="0" w:space="0" w:color="000000"/>
+                <w:left w:val="none" w:sz="0" w:space="0" w:color="000000"/>
+                <w:right w:val="none" w:sz="0" w:space="0" w:color="000000"/>
+              </w:pBdr>
+              <w:spacing w:after="60" w:before="60" w:line="312"/>
+              <w:ind w:left="80" w:right="80" w:firstLine="0" w:firstLineChars="0"/>
+              <w:rPr>
+                <w:rFonts w:ascii="Arial" w:hAnsi="Arial" w:eastAsia="Arial" w:cs="Arial"/>
+                <w:i w:val="false"/>
+                <w:b w:val="false"/>
+                <w:u w:val="none"/>
+                <w:sz w:val="24"/>
+                <w:szCs w:val="24"/>
+                <w:color w:val="000000"/>
+              </w:rPr>
+            </w:pPr>
+            <w:r xmlns:w="http://schemas.openxmlformats.org/wordprocessingml/2006/main" xmlns:wp="http://schemas.openxmlformats.org/drawingml/2006/wordprocessingDrawing" xmlns:r="http://schemas.openxmlformats.org/officeDocument/2006/relationships" xmlns:w14="http://schemas.microsoft.com/office/word/2010/wordml">
+              <w:rPr>
+                <w:rFonts w:ascii="Arial" w:hAnsi="Arial" w:eastAsia="Arial" w:cs="Arial"/>
+                <w:i w:val="false"/>
+                <w:b w:val="false"/>
+                <w:u w:val="none"/>
+                <w:sz w:val="24"/>
+                <w:szCs w:val="24"/>
+                <w:color w:val="000000"/>
+              </w:rPr>
+              <w:t xml:space="preserve">-3,497.2608</w:t>
+            </w:r>
+          </w:p>
+        </w:tc>
+        <w:tc>
+          <w:tcPr>
+            <w:tcBorders>
+              <w:bottom w:val="none" w:sz="0" w:space="0" w:color="000000"/>
+              <w:top w:val="none" w:sz="0" w:space="0" w:color="000000"/>
+              <w:left w:val="none" w:sz="0" w:space="0" w:color="000000"/>
+              <w:right w:val="none" w:sz="0" w:space="0" w:color="000000"/>
+            </w:tcBorders>
+            <w:shd w:val="clear" w:color="auto" w:fill="FFFFFF"/>
+            <w:tcMar>
+              <w:top w:w="0" w:type="dxa"/>
+              <w:bottom w:w="0" w:type="dxa"/>
+              <w:left w:w="0" w:type="dxa"/>
+              <w:right w:w="0" w:type="dxa"/>
+            </w:tcMar>
+            <w:vAlign w:val="center"/>
+          </w:tcPr>
+          <w:p>
+            <w:pPr>
+              <w:pStyle w:val="Normal"/>
+              <w:jc w:val="right"/>
+              <w:pBdr>
+                <w:bottom w:val="none" w:sz="0" w:space="0" w:color="000000"/>
+                <w:top w:val="none" w:sz="0" w:space="0" w:color="000000"/>
+                <w:left w:val="none" w:sz="0" w:space="0" w:color="000000"/>
+                <w:right w:val="none" w:sz="0" w:space="0" w:color="000000"/>
+              </w:pBdr>
+              <w:spacing w:after="60" w:before="60" w:line="312"/>
+              <w:ind w:left="80" w:right="80" w:firstLine="0" w:firstLineChars="0"/>
+              <w:rPr>
+                <w:rFonts w:ascii="Arial" w:hAnsi="Arial" w:eastAsia="Arial" w:cs="Arial"/>
+                <w:i w:val="false"/>
+                <w:b w:val="false"/>
+                <w:u w:val="none"/>
+                <w:sz w:val="24"/>
+                <w:szCs w:val="24"/>
+                <w:color w:val="000000"/>
+              </w:rPr>
+            </w:pPr>
+            <w:r xmlns:w="http://schemas.openxmlformats.org/wordprocessingml/2006/main" xmlns:wp="http://schemas.openxmlformats.org/drawingml/2006/wordprocessingDrawing" xmlns:r="http://schemas.openxmlformats.org/officeDocument/2006/relationships" xmlns:w14="http://schemas.microsoft.com/office/word/2010/wordml">
+              <w:rPr>
+                <w:rFonts w:ascii="Arial" w:hAnsi="Arial" w:eastAsia="Arial" w:cs="Arial"/>
+                <w:i w:val="false"/>
+                <w:b w:val="false"/>
+                <w:u w:val="none"/>
+                <w:sz w:val="24"/>
+                <w:szCs w:val="24"/>
+                <w:color w:val="000000"/>
+              </w:rPr>
+              <w:t xml:space="preserve">1,378.3665</w:t>
+            </w:r>
+          </w:p>
+        </w:tc>
+        <w:tc>
+          <w:tcPr>
+            <w:tcBorders>
+              <w:bottom w:val="none" w:sz="0" w:space="0" w:color="000000"/>
+              <w:top w:val="none" w:sz="0" w:space="0" w:color="000000"/>
+              <w:left w:val="none" w:sz="0" w:space="0" w:color="000000"/>
+              <w:right w:val="none" w:sz="0" w:space="0" w:color="000000"/>
+            </w:tcBorders>
+            <w:shd w:val="clear" w:color="auto" w:fill="FFFFFF"/>
+            <w:tcMar>
+              <w:top w:w="0" w:type="dxa"/>
+              <w:bottom w:w="0" w:type="dxa"/>
+              <w:left w:w="0" w:type="dxa"/>
+              <w:right w:w="0" w:type="dxa"/>
+            </w:tcMar>
+            <w:vAlign w:val="center"/>
+          </w:tcPr>
+          <w:p>
+            <w:pPr>
+              <w:pStyle w:val="Normal"/>
+              <w:jc w:val="right"/>
+              <w:pBdr>
+                <w:bottom w:val="none" w:sz="0" w:space="0" w:color="000000"/>
+                <w:top w:val="none" w:sz="0" w:space="0" w:color="000000"/>
+                <w:left w:val="none" w:sz="0" w:space="0" w:color="000000"/>
+                <w:right w:val="none" w:sz="0" w:space="0" w:color="000000"/>
+              </w:pBdr>
+              <w:spacing w:after="60" w:before="60" w:line="312"/>
+              <w:ind w:left="80" w:right="80" w:firstLine="0" w:firstLineChars="0"/>
+              <w:rPr>
+                <w:rFonts w:ascii="Arial" w:hAnsi="Arial" w:eastAsia="Arial" w:cs="Arial"/>
+                <w:i w:val="false"/>
+                <w:b w:val="false"/>
+                <w:u w:val="none"/>
+                <w:sz w:val="24"/>
+                <w:szCs w:val="24"/>
+                <w:color w:val="000000"/>
+              </w:rPr>
+            </w:pPr>
+            <w:r xmlns:w="http://schemas.openxmlformats.org/wordprocessingml/2006/main" xmlns:wp="http://schemas.openxmlformats.org/drawingml/2006/wordprocessingDrawing" xmlns:r="http://schemas.openxmlformats.org/officeDocument/2006/relationships" xmlns:w14="http://schemas.microsoft.com/office/word/2010/wordml">
+              <w:rPr>
+                <w:rFonts w:ascii="Arial" w:hAnsi="Arial" w:eastAsia="Arial" w:cs="Arial"/>
+                <w:i w:val="false"/>
+                <w:b w:val="false"/>
+                <w:u w:val="none"/>
+                <w:sz w:val="24"/>
+                <w:szCs w:val="24"/>
+                <w:color w:val="000000"/>
+              </w:rPr>
+              <w:t xml:space="preserve">0.6785</w:t>
+            </w:r>
+          </w:p>
+        </w:tc>
+      </w:tr>
+      <w:tr>
+        <w:trPr>
+          <w:trHeight w:val="510" w:hRule="auto"/>
+        </w:trPr>
+        body4
+        <w:tc>
+          <w:tcPr>
+            <w:tcBorders>
+              <w:bottom w:val="none" w:sz="0" w:space="0" w:color="000000"/>
+              <w:top w:val="none" w:sz="0" w:space="0" w:color="000000"/>
+              <w:left w:val="none" w:sz="0" w:space="0" w:color="000000"/>
+              <w:right w:val="none" w:sz="0" w:space="0" w:color="000000"/>
+            </w:tcBorders>
+            <w:shd w:val="clear" w:color="auto" w:fill="FFFFFF"/>
+            <w:tcMar>
+              <w:top w:w="0" w:type="dxa"/>
+              <w:bottom w:w="0" w:type="dxa"/>
+              <w:left w:w="0" w:type="dxa"/>
+              <w:right w:w="0" w:type="dxa"/>
+            </w:tcMar>
+            <w:vAlign w:val="center"/>
+          </w:tcPr>
+          <w:p>
+            <w:pPr>
+              <w:pStyle w:val="Normal"/>
+              <w:jc w:val="left"/>
+              <w:pBdr>
+                <w:bottom w:val="none" w:sz="0" w:space="0" w:color="000000"/>
+                <w:top w:val="none" w:sz="0" w:space="0" w:color="000000"/>
+                <w:left w:val="none" w:sz="0" w:space="0" w:color="000000"/>
+                <w:right w:val="none" w:sz="0" w:space="0" w:color="000000"/>
+              </w:pBdr>
+              <w:spacing w:after="60" w:before="60" w:line="312"/>
+              <w:ind w:left="80" w:right="80" w:firstLine="0" w:firstLineChars="0"/>
+              <w:rPr>
+                <w:rFonts w:ascii="Arial" w:hAnsi="Arial" w:eastAsia="Arial" w:cs="Arial"/>
+                <w:i w:val="false"/>
+                <w:b w:val="false"/>
+                <w:u w:val="none"/>
+                <w:sz w:val="24"/>
+                <w:szCs w:val="24"/>
+                <w:color w:val="000000"/>
+              </w:rPr>
+            </w:pPr>
+            <w:r xmlns:w="http://schemas.openxmlformats.org/wordprocessingml/2006/main" xmlns:wp="http://schemas.openxmlformats.org/drawingml/2006/wordprocessingDrawing" xmlns:r="http://schemas.openxmlformats.org/officeDocument/2006/relationships" xmlns:w14="http://schemas.microsoft.com/office/word/2010/wordml">
+              <w:rPr>
+                <w:rFonts w:ascii="Arial" w:hAnsi="Arial" w:eastAsia="Arial" w:cs="Arial"/>
+                <w:i w:val="false"/>
+                <w:b w:val="false"/>
+                <w:u w:val="none"/>
+                <w:sz w:val="24"/>
+                <w:szCs w:val="24"/>
+                <w:color w:val="000000"/>
+              </w:rPr>
+              <w:t xml:space="preserve">southeast-northwest</w:t>
+            </w:r>
+          </w:p>
+        </w:tc>
+        <w:tc>
+          <w:tcPr>
+            <w:tcBorders>
+              <w:bottom w:val="none" w:sz="0" w:space="0" w:color="000000"/>
+              <w:top w:val="none" w:sz="0" w:space="0" w:color="000000"/>
+              <w:left w:val="none" w:sz="0" w:space="0" w:color="000000"/>
+              <w:right w:val="none" w:sz="0" w:space="0" w:color="000000"/>
+            </w:tcBorders>
+            <w:shd w:val="clear" w:color="auto" w:fill="FFFFFF"/>
+            <w:tcMar>
+              <w:top w:w="0" w:type="dxa"/>
+              <w:bottom w:w="0" w:type="dxa"/>
+              <w:left w:w="0" w:type="dxa"/>
+              <w:right w:w="0" w:type="dxa"/>
+            </w:tcMar>
+            <w:vAlign w:val="center"/>
+          </w:tcPr>
+          <w:p>
+            <w:pPr>
+              <w:pStyle w:val="Normal"/>
+              <w:jc w:val="right"/>
+              <w:pBdr>
+                <w:bottom w:val="none" w:sz="0" w:space="0" w:color="000000"/>
+                <w:top w:val="none" w:sz="0" w:space="0" w:color="000000"/>
+                <w:left w:val="none" w:sz="0" w:space="0" w:color="000000"/>
+                <w:right w:val="none" w:sz="0" w:space="0" w:color="000000"/>
+              </w:pBdr>
+              <w:spacing w:after="60" w:before="60" w:line="312"/>
+              <w:ind w:left="80" w:right="80" w:firstLine="0" w:firstLineChars="0"/>
+              <w:rPr>
+                <w:rFonts w:ascii="Arial" w:hAnsi="Arial" w:eastAsia="Arial" w:cs="Arial"/>
+                <w:i w:val="false"/>
+                <w:b w:val="false"/>
+                <w:u w:val="none"/>
+                <w:sz w:val="24"/>
+                <w:szCs w:val="24"/>
+                <w:color w:val="000000"/>
+              </w:rPr>
+            </w:pPr>
+            <w:r xmlns:w="http://schemas.openxmlformats.org/wordprocessingml/2006/main" xmlns:wp="http://schemas.openxmlformats.org/drawingml/2006/wordprocessingDrawing" xmlns:r="http://schemas.openxmlformats.org/officeDocument/2006/relationships" xmlns:w14="http://schemas.microsoft.com/office/word/2010/wordml">
+              <w:rPr>
+                <w:rFonts w:ascii="Arial" w:hAnsi="Arial" w:eastAsia="Arial" w:cs="Arial"/>
+                <w:i w:val="false"/>
+                <w:b w:val="false"/>
+                <w:u w:val="none"/>
+                <w:sz w:val="24"/>
+                <w:szCs w:val="24"/>
+                <w:color w:val="000000"/>
+              </w:rPr>
+              <w:t xml:space="preserve">2,317.8361</w:t>
+            </w:r>
+          </w:p>
+        </w:tc>
+        <w:tc>
+          <w:tcPr>
+            <w:tcBorders>
+              <w:bottom w:val="none" w:sz="0" w:space="0" w:color="000000"/>
+              <w:top w:val="none" w:sz="0" w:space="0" w:color="000000"/>
+              <w:left w:val="none" w:sz="0" w:space="0" w:color="000000"/>
+              <w:right w:val="none" w:sz="0" w:space="0" w:color="000000"/>
+            </w:tcBorders>
+            <w:shd w:val="clear" w:color="auto" w:fill="FFFFFF"/>
+            <w:tcMar>
+              <w:top w:w="0" w:type="dxa"/>
+              <w:bottom w:w="0" w:type="dxa"/>
+              <w:left w:w="0" w:type="dxa"/>
+              <w:right w:w="0" w:type="dxa"/>
+            </w:tcMar>
+            <w:vAlign w:val="center"/>
+          </w:tcPr>
+          <w:p>
+            <w:pPr>
+              <w:pStyle w:val="Normal"/>
+              <w:jc w:val="right"/>
+              <w:pBdr>
+                <w:bottom w:val="none" w:sz="0" w:space="0" w:color="000000"/>
+                <w:top w:val="none" w:sz="0" w:space="0" w:color="000000"/>
+                <w:left w:val="none" w:sz="0" w:space="0" w:color="000000"/>
+                <w:right w:val="none" w:sz="0" w:space="0" w:color="000000"/>
+              </w:pBdr>
+              <w:spacing w:after="60" w:before="60" w:line="312"/>
+              <w:ind w:left="80" w:right="80" w:firstLine="0" w:firstLineChars="0"/>
+              <w:rPr>
+                <w:rFonts w:ascii="Arial" w:hAnsi="Arial" w:eastAsia="Arial" w:cs="Arial"/>
+                <w:i w:val="false"/>
+                <w:b w:val="false"/>
+                <w:u w:val="none"/>
+                <w:sz w:val="24"/>
+                <w:szCs w:val="24"/>
+                <w:color w:val="000000"/>
+              </w:rPr>
+            </w:pPr>
+            <w:r xmlns:w="http://schemas.openxmlformats.org/wordprocessingml/2006/main" xmlns:wp="http://schemas.openxmlformats.org/drawingml/2006/wordprocessingDrawing" xmlns:r="http://schemas.openxmlformats.org/officeDocument/2006/relationships" xmlns:w14="http://schemas.microsoft.com/office/word/2010/wordml">
+              <w:rPr>
+                <w:rFonts w:ascii="Arial" w:hAnsi="Arial" w:eastAsia="Arial" w:cs="Arial"/>
+                <w:i w:val="false"/>
+                <w:b w:val="false"/>
+                <w:u w:val="none"/>
+                <w:sz w:val="24"/>
+                <w:szCs w:val="24"/>
+                <w:color w:val="000000"/>
+              </w:rPr>
+              <w:t xml:space="preserve">-51.9524</w:t>
+            </w:r>
+          </w:p>
+        </w:tc>
+        <w:tc>
+          <w:tcPr>
+            <w:tcBorders>
+              <w:bottom w:val="none" w:sz="0" w:space="0" w:color="000000"/>
+              <w:top w:val="none" w:sz="0" w:space="0" w:color="000000"/>
+              <w:left w:val="none" w:sz="0" w:space="0" w:color="000000"/>
+              <w:right w:val="none" w:sz="0" w:space="0" w:color="000000"/>
+            </w:tcBorders>
+            <w:shd w:val="clear" w:color="auto" w:fill="FFFFFF"/>
+            <w:tcMar>
+              <w:top w:w="0" w:type="dxa"/>
+              <w:bottom w:w="0" w:type="dxa"/>
+              <w:left w:w="0" w:type="dxa"/>
+              <w:right w:w="0" w:type="dxa"/>
+            </w:tcMar>
+            <w:vAlign w:val="center"/>
+          </w:tcPr>
+          <w:p>
+            <w:pPr>
+              <w:pStyle w:val="Normal"/>
+              <w:jc w:val="right"/>
+              <w:pBdr>
+                <w:bottom w:val="none" w:sz="0" w:space="0" w:color="000000"/>
+                <w:top w:val="none" w:sz="0" w:space="0" w:color="000000"/>
+                <w:left w:val="none" w:sz="0" w:space="0" w:color="000000"/>
+                <w:right w:val="none" w:sz="0" w:space="0" w:color="000000"/>
+              </w:pBdr>
+              <w:spacing w:after="60" w:before="60" w:line="312"/>
+              <w:ind w:left="80" w:right="80" w:firstLine="0" w:firstLineChars="0"/>
+              <w:rPr>
+                <w:rFonts w:ascii="Arial" w:hAnsi="Arial" w:eastAsia="Arial" w:cs="Arial"/>
+                <w:i w:val="false"/>
+                <w:b w:val="false"/>
+                <w:u w:val="none"/>
+                <w:sz w:val="24"/>
+                <w:szCs w:val="24"/>
+                <w:color w:val="000000"/>
+              </w:rPr>
+            </w:pPr>
+            <w:r xmlns:w="http://schemas.openxmlformats.org/wordprocessingml/2006/main" xmlns:wp="http://schemas.openxmlformats.org/drawingml/2006/wordprocessingDrawing" xmlns:r="http://schemas.openxmlformats.org/officeDocument/2006/relationships" xmlns:w14="http://schemas.microsoft.com/office/word/2010/wordml">
+              <w:rPr>
+                <w:rFonts w:ascii="Arial" w:hAnsi="Arial" w:eastAsia="Arial" w:cs="Arial"/>
+                <w:i w:val="false"/>
+                <w:b w:val="false"/>
+                <w:u w:val="none"/>
+                <w:sz w:val="24"/>
+                <w:szCs w:val="24"/>
+                <w:color w:val="000000"/>
+              </w:rPr>
+              <w:t xml:space="preserve">4,687.6245</w:t>
+            </w:r>
+          </w:p>
+        </w:tc>
+        <w:tc>
+          <w:tcPr>
+            <w:tcBorders>
+              <w:bottom w:val="none" w:sz="0" w:space="0" w:color="000000"/>
+              <w:top w:val="none" w:sz="0" w:space="0" w:color="000000"/>
+              <w:left w:val="none" w:sz="0" w:space="0" w:color="000000"/>
+              <w:right w:val="none" w:sz="0" w:space="0" w:color="000000"/>
+            </w:tcBorders>
+            <w:shd w:val="clear" w:color="auto" w:fill="FFFFFF"/>
+            <w:tcMar>
+              <w:top w:w="0" w:type="dxa"/>
+              <w:bottom w:w="0" w:type="dxa"/>
+              <w:left w:w="0" w:type="dxa"/>
+              <w:right w:w="0" w:type="dxa"/>
+            </w:tcMar>
+            <w:vAlign w:val="center"/>
+          </w:tcPr>
+          <w:p>
+            <w:pPr>
+              <w:pStyle w:val="Normal"/>
+              <w:jc w:val="right"/>
+              <w:pBdr>
+                <w:bottom w:val="none" w:sz="0" w:space="0" w:color="000000"/>
+                <w:top w:val="none" w:sz="0" w:space="0" w:color="000000"/>
+                <w:left w:val="none" w:sz="0" w:space="0" w:color="000000"/>
+                <w:right w:val="none" w:sz="0" w:space="0" w:color="000000"/>
+              </w:pBdr>
+              <w:spacing w:after="60" w:before="60" w:line="312"/>
+              <w:ind w:left="80" w:right="80" w:firstLine="0" w:firstLineChars="0"/>
+              <w:rPr>
+                <w:rFonts w:ascii="Arial" w:hAnsi="Arial" w:eastAsia="Arial" w:cs="Arial"/>
+                <w:i w:val="false"/>
+                <w:b w:val="false"/>
+                <w:u w:val="none"/>
+                <w:sz w:val="24"/>
+                <w:szCs w:val="24"/>
+                <w:color w:val="000000"/>
+              </w:rPr>
+            </w:pPr>
+            <w:r xmlns:w="http://schemas.openxmlformats.org/wordprocessingml/2006/main" xmlns:wp="http://schemas.openxmlformats.org/drawingml/2006/wordprocessingDrawing" xmlns:r="http://schemas.openxmlformats.org/officeDocument/2006/relationships" xmlns:w14="http://schemas.microsoft.com/office/word/2010/wordml">
+              <w:rPr>
+                <w:rFonts w:ascii="Arial" w:hAnsi="Arial" w:eastAsia="Arial" w:cs="Arial"/>
+                <w:i w:val="false"/>
+                <w:b w:val="false"/>
+                <w:u w:val="none"/>
+                <w:sz w:val="24"/>
+                <w:szCs w:val="24"/>
+                <w:color w:val="000000"/>
+              </w:rPr>
+              <w:t xml:space="preserve">0.0579</w:t>
+            </w:r>
+          </w:p>
+        </w:tc>
+      </w:tr>
+      <w:tr>
+        <w:trPr>
+          <w:trHeight w:val="510" w:hRule="auto"/>
+        </w:trPr>
+        body5
+        <w:tc>
+          <w:tcPr>
+            <w:tcBorders>
+              <w:bottom w:val="none" w:sz="0" w:space="0" w:color="000000"/>
+              <w:top w:val="none" w:sz="0" w:space="0" w:color="000000"/>
+              <w:left w:val="none" w:sz="0" w:space="0" w:color="000000"/>
+              <w:right w:val="none" w:sz="0" w:space="0" w:color="000000"/>
+            </w:tcBorders>
+            <w:shd w:val="clear" w:color="auto" w:fill="FFFFFF"/>
+            <w:tcMar>
+              <w:top w:w="0" w:type="dxa"/>
+              <w:bottom w:w="0" w:type="dxa"/>
+              <w:left w:w="0" w:type="dxa"/>
+              <w:right w:w="0" w:type="dxa"/>
+            </w:tcMar>
+            <w:vAlign w:val="center"/>
+          </w:tcPr>
+          <w:p>
+            <w:pPr>
+              <w:pStyle w:val="Normal"/>
+              <w:jc w:val="left"/>
+              <w:pBdr>
+                <w:bottom w:val="none" w:sz="0" w:space="0" w:color="000000"/>
+                <w:top w:val="none" w:sz="0" w:space="0" w:color="000000"/>
+                <w:left w:val="none" w:sz="0" w:space="0" w:color="000000"/>
+                <w:right w:val="none" w:sz="0" w:space="0" w:color="000000"/>
+              </w:pBdr>
+              <w:spacing w:after="60" w:before="60" w:line="312"/>
+              <w:ind w:left="80" w:right="80" w:firstLine="0" w:firstLineChars="0"/>
+              <w:rPr>
+                <w:rFonts w:ascii="Arial" w:hAnsi="Arial" w:eastAsia="Arial" w:cs="Arial"/>
+                <w:i w:val="false"/>
+                <w:b w:val="false"/>
+                <w:u w:val="none"/>
+                <w:sz w:val="24"/>
+                <w:szCs w:val="24"/>
+                <w:color w:val="000000"/>
+              </w:rPr>
+            </w:pPr>
+            <w:r xmlns:w="http://schemas.openxmlformats.org/wordprocessingml/2006/main" xmlns:wp="http://schemas.openxmlformats.org/drawingml/2006/wordprocessingDrawing" xmlns:r="http://schemas.openxmlformats.org/officeDocument/2006/relationships" xmlns:w14="http://schemas.microsoft.com/office/word/2010/wordml">
+              <w:rPr>
+                <w:rFonts w:ascii="Arial" w:hAnsi="Arial" w:eastAsia="Arial" w:cs="Arial"/>
+                <w:i w:val="false"/>
+                <w:b w:val="false"/>
+                <w:u w:val="none"/>
+                <w:sz w:val="24"/>
+                <w:szCs w:val="24"/>
+                <w:color w:val="000000"/>
+              </w:rPr>
+              <w:t xml:space="preserve">southwest-northwest</w:t>
+            </w:r>
+          </w:p>
+        </w:tc>
+        <w:tc>
+          <w:tcPr>
+            <w:tcBorders>
+              <w:bottom w:val="none" w:sz="0" w:space="0" w:color="000000"/>
+              <w:top w:val="none" w:sz="0" w:space="0" w:color="000000"/>
+              <w:left w:val="none" w:sz="0" w:space="0" w:color="000000"/>
+              <w:right w:val="none" w:sz="0" w:space="0" w:color="000000"/>
+            </w:tcBorders>
+            <w:shd w:val="clear" w:color="auto" w:fill="FFFFFF"/>
+            <w:tcMar>
+              <w:top w:w="0" w:type="dxa"/>
+              <w:bottom w:w="0" w:type="dxa"/>
+              <w:left w:w="0" w:type="dxa"/>
+              <w:right w:w="0" w:type="dxa"/>
+            </w:tcMar>
+            <w:vAlign w:val="center"/>
+          </w:tcPr>
+          <w:p>
+            <w:pPr>
+              <w:pStyle w:val="Normal"/>
+              <w:jc w:val="right"/>
+              <w:pBdr>
+                <w:bottom w:val="none" w:sz="0" w:space="0" w:color="000000"/>
+                <w:top w:val="none" w:sz="0" w:space="0" w:color="000000"/>
+                <w:left w:val="none" w:sz="0" w:space="0" w:color="000000"/>
+                <w:right w:val="none" w:sz="0" w:space="0" w:color="000000"/>
+              </w:pBdr>
+              <w:spacing w:after="60" w:before="60" w:line="312"/>
+              <w:ind w:left="80" w:right="80" w:firstLine="0" w:firstLineChars="0"/>
+              <w:rPr>
+                <w:rFonts w:ascii="Arial" w:hAnsi="Arial" w:eastAsia="Arial" w:cs="Arial"/>
+                <w:i w:val="false"/>
+                <w:b w:val="false"/>
+                <w:u w:val="none"/>
+                <w:sz w:val="24"/>
+                <w:szCs w:val="24"/>
+                <w:color w:val="000000"/>
+              </w:rPr>
+            </w:pPr>
+            <w:r xmlns:w="http://schemas.openxmlformats.org/wordprocessingml/2006/main" xmlns:wp="http://schemas.openxmlformats.org/drawingml/2006/wordprocessingDrawing" xmlns:r="http://schemas.openxmlformats.org/officeDocument/2006/relationships" xmlns:w14="http://schemas.microsoft.com/office/word/2010/wordml">
+              <w:rPr>
+                <w:rFonts w:ascii="Arial" w:hAnsi="Arial" w:eastAsia="Arial" w:cs="Arial"/>
+                <w:i w:val="false"/>
+                <w:b w:val="false"/>
+                <w:u w:val="none"/>
+                <w:sz w:val="24"/>
+                <w:szCs w:val="24"/>
+                <w:color w:val="000000"/>
+              </w:rPr>
+              <w:t xml:space="preserve">-70.6380</w:t>
+            </w:r>
+          </w:p>
+        </w:tc>
+        <w:tc>
+          <w:tcPr>
+            <w:tcBorders>
+              <w:bottom w:val="none" w:sz="0" w:space="0" w:color="000000"/>
+              <w:top w:val="none" w:sz="0" w:space="0" w:color="000000"/>
+              <w:left w:val="none" w:sz="0" w:space="0" w:color="000000"/>
+              <w:right w:val="none" w:sz="0" w:space="0" w:color="000000"/>
+            </w:tcBorders>
+            <w:shd w:val="clear" w:color="auto" w:fill="FFFFFF"/>
+            <w:tcMar>
+              <w:top w:w="0" w:type="dxa"/>
+              <w:bottom w:w="0" w:type="dxa"/>
+              <w:left w:w="0" w:type="dxa"/>
+              <w:right w:w="0" w:type="dxa"/>
+            </w:tcMar>
+            <w:vAlign w:val="center"/>
+          </w:tcPr>
+          <w:p>
+            <w:pPr>
+              <w:pStyle w:val="Normal"/>
+              <w:jc w:val="right"/>
+              <w:pBdr>
+                <w:bottom w:val="none" w:sz="0" w:space="0" w:color="000000"/>
+                <w:top w:val="none" w:sz="0" w:space="0" w:color="000000"/>
+                <w:left w:val="none" w:sz="0" w:space="0" w:color="000000"/>
+                <w:right w:val="none" w:sz="0" w:space="0" w:color="000000"/>
+              </w:pBdr>
+              <w:spacing w:after="60" w:before="60" w:line="312"/>
+              <w:ind w:left="80" w:right="80" w:firstLine="0" w:firstLineChars="0"/>
+              <w:rPr>
+                <w:rFonts w:ascii="Arial" w:hAnsi="Arial" w:eastAsia="Arial" w:cs="Arial"/>
+                <w:i w:val="false"/>
+                <w:b w:val="false"/>
+                <w:u w:val="none"/>
+                <w:sz w:val="24"/>
+                <w:szCs w:val="24"/>
+                <w:color w:val="000000"/>
+              </w:rPr>
+            </w:pPr>
+            <w:r xmlns:w="http://schemas.openxmlformats.org/wordprocessingml/2006/main" xmlns:wp="http://schemas.openxmlformats.org/drawingml/2006/wordprocessingDrawing" xmlns:r="http://schemas.openxmlformats.org/officeDocument/2006/relationships" xmlns:w14="http://schemas.microsoft.com/office/word/2010/wordml">
+              <w:rPr>
+                <w:rFonts w:ascii="Arial" w:hAnsi="Arial" w:eastAsia="Arial" w:cs="Arial"/>
+                <w:i w:val="false"/>
+                <w:b w:val="false"/>
+                <w:u w:val="none"/>
+                <w:sz w:val="24"/>
+                <w:szCs w:val="24"/>
+                <w:color w:val="000000"/>
+              </w:rPr>
+              <w:t xml:space="preserve">-2,506.5728</w:t>
+            </w:r>
+          </w:p>
+        </w:tc>
+        <w:tc>
+          <w:tcPr>
+            <w:tcBorders>
+              <w:bottom w:val="none" w:sz="0" w:space="0" w:color="000000"/>
+              <w:top w:val="none" w:sz="0" w:space="0" w:color="000000"/>
+              <w:left w:val="none" w:sz="0" w:space="0" w:color="000000"/>
+              <w:right w:val="none" w:sz="0" w:space="0" w:color="000000"/>
+            </w:tcBorders>
+            <w:shd w:val="clear" w:color="auto" w:fill="FFFFFF"/>
+            <w:tcMar>
+              <w:top w:w="0" w:type="dxa"/>
+              <w:bottom w:w="0" w:type="dxa"/>
+              <w:left w:w="0" w:type="dxa"/>
+              <w:right w:w="0" w:type="dxa"/>
+            </w:tcMar>
+            <w:vAlign w:val="center"/>
+          </w:tcPr>
+          <w:p>
+            <w:pPr>
+              <w:pStyle w:val="Normal"/>
+              <w:jc w:val="right"/>
+              <w:pBdr>
+                <w:bottom w:val="none" w:sz="0" w:space="0" w:color="000000"/>
+                <w:top w:val="none" w:sz="0" w:space="0" w:color="000000"/>
+                <w:left w:val="none" w:sz="0" w:space="0" w:color="000000"/>
+                <w:right w:val="none" w:sz="0" w:space="0" w:color="000000"/>
+              </w:pBdr>
+              <w:spacing w:after="60" w:before="60" w:line="312"/>
+              <w:ind w:left="80" w:right="80" w:firstLine="0" w:firstLineChars="0"/>
+              <w:rPr>
+                <w:rFonts w:ascii="Arial" w:hAnsi="Arial" w:eastAsia="Arial" w:cs="Arial"/>
+                <w:i w:val="false"/>
+                <w:b w:val="false"/>
+                <w:u w:val="none"/>
+                <w:sz w:val="24"/>
+                <w:szCs w:val="24"/>
+                <w:color w:val="000000"/>
+              </w:rPr>
+            </w:pPr>
+            <w:r xmlns:w="http://schemas.openxmlformats.org/wordprocessingml/2006/main" xmlns:wp="http://schemas.openxmlformats.org/drawingml/2006/wordprocessingDrawing" xmlns:r="http://schemas.openxmlformats.org/officeDocument/2006/relationships" xmlns:w14="http://schemas.microsoft.com/office/word/2010/wordml">
+              <w:rPr>
+                <w:rFonts w:ascii="Arial" w:hAnsi="Arial" w:eastAsia="Arial" w:cs="Arial"/>
+                <w:i w:val="false"/>
+                <w:b w:val="false"/>
+                <w:u w:val="none"/>
+                <w:sz w:val="24"/>
+                <w:szCs w:val="24"/>
+                <w:color w:val="000000"/>
+              </w:rPr>
+              <w:t xml:space="preserve">2,365.2968</w:t>
+            </w:r>
+          </w:p>
+        </w:tc>
+        <w:tc>
+          <w:tcPr>
+            <w:tcBorders>
+              <w:bottom w:val="none" w:sz="0" w:space="0" w:color="000000"/>
+              <w:top w:val="none" w:sz="0" w:space="0" w:color="000000"/>
+              <w:left w:val="none" w:sz="0" w:space="0" w:color="000000"/>
+              <w:right w:val="none" w:sz="0" w:space="0" w:color="000000"/>
+            </w:tcBorders>
+            <w:shd w:val="clear" w:color="auto" w:fill="FFFFFF"/>
+            <w:tcMar>
+              <w:top w:w="0" w:type="dxa"/>
+              <w:bottom w:w="0" w:type="dxa"/>
+              <w:left w:w="0" w:type="dxa"/>
+              <w:right w:w="0" w:type="dxa"/>
+            </w:tcMar>
+            <w:vAlign w:val="center"/>
+          </w:tcPr>
+          <w:p>
+            <w:pPr>
+              <w:pStyle w:val="Normal"/>
+              <w:jc w:val="right"/>
+              <w:pBdr>
+                <w:bottom w:val="none" w:sz="0" w:space="0" w:color="000000"/>
+                <w:top w:val="none" w:sz="0" w:space="0" w:color="000000"/>
+                <w:left w:val="none" w:sz="0" w:space="0" w:color="000000"/>
+                <w:right w:val="none" w:sz="0" w:space="0" w:color="000000"/>
+              </w:pBdr>
+              <w:spacing w:after="60" w:before="60" w:line="312"/>
+              <w:ind w:left="80" w:right="80" w:firstLine="0" w:firstLineChars="0"/>
+              <w:rPr>
+                <w:rFonts w:ascii="Arial" w:hAnsi="Arial" w:eastAsia="Arial" w:cs="Arial"/>
+                <w:i w:val="false"/>
+                <w:b w:val="false"/>
+                <w:u w:val="none"/>
+                <w:sz w:val="24"/>
+                <w:szCs w:val="24"/>
+                <w:color w:val="000000"/>
+              </w:rPr>
+            </w:pPr>
+            <w:r xmlns:w="http://schemas.openxmlformats.org/wordprocessingml/2006/main" xmlns:wp="http://schemas.openxmlformats.org/drawingml/2006/wordprocessingDrawing" xmlns:r="http://schemas.openxmlformats.org/officeDocument/2006/relationships" xmlns:w14="http://schemas.microsoft.com/office/word/2010/wordml">
+              <w:rPr>
+                <w:rFonts w:ascii="Arial" w:hAnsi="Arial" w:eastAsia="Arial" w:cs="Arial"/>
+                <w:i w:val="false"/>
+                <w:b w:val="false"/>
+                <w:u w:val="none"/>
+                <w:sz w:val="24"/>
+                <w:szCs w:val="24"/>
+                <w:color w:val="000000"/>
+              </w:rPr>
+              <w:t xml:space="preserve">0.9999</w:t>
+            </w:r>
+          </w:p>
+        </w:tc>
+      </w:tr>
+      <w:tr>
+        <w:trPr>
+          <w:trHeight w:val="510" w:hRule="auto"/>
+        </w:trPr>
+        body6
+        <w:tc>
+          <w:tcPr>
+            <w:tcBorders>
+              <w:bottom w:val="single" w:sz="12" w:space="0" w:color="BEBEBE"/>
+              <w:top w:val="none" w:sz="0" w:space="0" w:color="000000"/>
+              <w:left w:val="none" w:sz="0" w:space="0" w:color="000000"/>
+              <w:right w:val="none" w:sz="0" w:space="0" w:color="000000"/>
+            </w:tcBorders>
+            <w:shd w:val="clear" w:color="auto" w:fill="FFFFFF"/>
+            <w:tcMar>
+              <w:top w:w="0" w:type="dxa"/>
+              <w:bottom w:w="0" w:type="dxa"/>
+              <w:left w:w="0" w:type="dxa"/>
+              <w:right w:w="0" w:type="dxa"/>
+            </w:tcMar>
+            <w:vAlign w:val="center"/>
+          </w:tcPr>
+          <w:p>
+            <w:pPr>
+              <w:pStyle w:val="Normal"/>
+              <w:jc w:val="left"/>
+              <w:pBdr>
+                <w:bottom w:val="none" w:sz="0" w:space="0" w:color="000000"/>
+                <w:top w:val="none" w:sz="0" w:space="0" w:color="000000"/>
+                <w:left w:val="none" w:sz="0" w:space="0" w:color="000000"/>
+                <w:right w:val="none" w:sz="0" w:space="0" w:color="000000"/>
+              </w:pBdr>
+              <w:spacing w:after="60" w:before="60" w:line="312"/>
+              <w:ind w:left="80" w:right="80" w:firstLine="0" w:firstLineChars="0"/>
+              <w:rPr>
+                <w:rFonts w:ascii="Arial" w:hAnsi="Arial" w:eastAsia="Arial" w:cs="Arial"/>
+                <w:i w:val="false"/>
+                <w:b w:val="false"/>
+                <w:u w:val="none"/>
+                <w:sz w:val="24"/>
+                <w:szCs w:val="24"/>
+                <w:color w:val="000000"/>
+              </w:rPr>
+            </w:pPr>
+            <w:r xmlns:w="http://schemas.openxmlformats.org/wordprocessingml/2006/main" xmlns:wp="http://schemas.openxmlformats.org/drawingml/2006/wordprocessingDrawing" xmlns:r="http://schemas.openxmlformats.org/officeDocument/2006/relationships" xmlns:w14="http://schemas.microsoft.com/office/word/2010/wordml">
+              <w:rPr>
+                <w:rFonts w:ascii="Arial" w:hAnsi="Arial" w:eastAsia="Arial" w:cs="Arial"/>
+                <w:i w:val="false"/>
+                <w:b w:val="false"/>
+                <w:u w:val="none"/>
+                <w:sz w:val="24"/>
+                <w:szCs w:val="24"/>
+                <w:color w:val="000000"/>
+              </w:rPr>
+              <w:t xml:space="preserve">southwest-southeast</w:t>
+            </w:r>
+          </w:p>
+        </w:tc>
+        <w:tc>
+          <w:tcPr>
+            <w:tcBorders>
+              <w:bottom w:val="single" w:sz="12" w:space="0" w:color="BEBEBE"/>
+              <w:top w:val="none" w:sz="0" w:space="0" w:color="000000"/>
+              <w:left w:val="none" w:sz="0" w:space="0" w:color="000000"/>
+              <w:right w:val="none" w:sz="0" w:space="0" w:color="000000"/>
+            </w:tcBorders>
+            <w:shd w:val="clear" w:color="auto" w:fill="FFFFFF"/>
+            <w:tcMar>
+              <w:top w:w="0" w:type="dxa"/>
+              <w:bottom w:w="0" w:type="dxa"/>
+              <w:left w:w="0" w:type="dxa"/>
+              <w:right w:w="0" w:type="dxa"/>
+            </w:tcMar>
+            <w:vAlign w:val="center"/>
+          </w:tcPr>
+          <w:p>
+            <w:pPr>
+              <w:pStyle w:val="Normal"/>
+              <w:jc w:val="right"/>
+              <w:pBdr>
+                <w:bottom w:val="none" w:sz="0" w:space="0" w:color="000000"/>
+                <w:top w:val="none" w:sz="0" w:space="0" w:color="000000"/>
+                <w:left w:val="none" w:sz="0" w:space="0" w:color="000000"/>
+                <w:right w:val="none" w:sz="0" w:space="0" w:color="000000"/>
+              </w:pBdr>
+              <w:spacing w:after="60" w:before="60" w:line="312"/>
+              <w:ind w:left="80" w:right="80" w:firstLine="0" w:firstLineChars="0"/>
+              <w:rPr>
+                <w:rFonts w:ascii="Arial" w:hAnsi="Arial" w:eastAsia="Arial" w:cs="Arial"/>
+                <w:i w:val="false"/>
+                <w:b w:val="false"/>
+                <w:u w:val="none"/>
+                <w:sz w:val="24"/>
+                <w:szCs w:val="24"/>
+                <w:color w:val="000000"/>
+              </w:rPr>
+            </w:pPr>
+            <w:r xmlns:w="http://schemas.openxmlformats.org/wordprocessingml/2006/main" xmlns:wp="http://schemas.openxmlformats.org/drawingml/2006/wordprocessingDrawing" xmlns:r="http://schemas.openxmlformats.org/officeDocument/2006/relationships" xmlns:w14="http://schemas.microsoft.com/office/word/2010/wordml">
+              <w:rPr>
+                <w:rFonts w:ascii="Arial" w:hAnsi="Arial" w:eastAsia="Arial" w:cs="Arial"/>
+                <w:i w:val="false"/>
+                <w:b w:val="false"/>
+                <w:u w:val="none"/>
+                <w:sz w:val="24"/>
+                <w:szCs w:val="24"/>
+                <w:color w:val="000000"/>
+              </w:rPr>
+              <w:t xml:space="preserve">-2,388.4741</w:t>
+            </w:r>
+          </w:p>
+        </w:tc>
+        <w:tc>
+          <w:tcPr>
+            <w:tcBorders>
+              <w:bottom w:val="single" w:sz="12" w:space="0" w:color="BEBEBE"/>
+              <w:top w:val="none" w:sz="0" w:space="0" w:color="000000"/>
+              <w:left w:val="none" w:sz="0" w:space="0" w:color="000000"/>
+              <w:right w:val="none" w:sz="0" w:space="0" w:color="000000"/>
+            </w:tcBorders>
+            <w:shd w:val="clear" w:color="auto" w:fill="FFFFFF"/>
+            <w:tcMar>
+              <w:top w:w="0" w:type="dxa"/>
+              <w:bottom w:w="0" w:type="dxa"/>
+              <w:left w:w="0" w:type="dxa"/>
+              <w:right w:w="0" w:type="dxa"/>
+            </w:tcMar>
+            <w:vAlign w:val="center"/>
+          </w:tcPr>
+          <w:p>
+            <w:pPr>
+              <w:pStyle w:val="Normal"/>
+              <w:jc w:val="right"/>
+              <w:pBdr>
+                <w:bottom w:val="none" w:sz="0" w:space="0" w:color="000000"/>
+                <w:top w:val="none" w:sz="0" w:space="0" w:color="000000"/>
+                <w:left w:val="none" w:sz="0" w:space="0" w:color="000000"/>
+                <w:right w:val="none" w:sz="0" w:space="0" w:color="000000"/>
+              </w:pBdr>
+              <w:spacing w:after="60" w:before="60" w:line="312"/>
+              <w:ind w:left="80" w:right="80" w:firstLine="0" w:firstLineChars="0"/>
+              <w:rPr>
+                <w:rFonts w:ascii="Arial" w:hAnsi="Arial" w:eastAsia="Arial" w:cs="Arial"/>
+                <w:i w:val="false"/>
+                <w:b w:val="false"/>
+                <w:u w:val="none"/>
+                <w:sz w:val="24"/>
+                <w:szCs w:val="24"/>
+                <w:color w:val="000000"/>
+              </w:rPr>
+            </w:pPr>
+            <w:r xmlns:w="http://schemas.openxmlformats.org/wordprocessingml/2006/main" xmlns:wp="http://schemas.openxmlformats.org/drawingml/2006/wordprocessingDrawing" xmlns:r="http://schemas.openxmlformats.org/officeDocument/2006/relationships" xmlns:w14="http://schemas.microsoft.com/office/word/2010/wordml">
+              <w:rPr>
+                <w:rFonts w:ascii="Arial" w:hAnsi="Arial" w:eastAsia="Arial" w:cs="Arial"/>
+                <w:i w:val="false"/>
+                <w:b w:val="false"/>
+                <w:u w:val="none"/>
+                <w:sz w:val="24"/>
+                <w:szCs w:val="24"/>
+                <w:color w:val="000000"/>
+              </w:rPr>
+              <w:t xml:space="preserve">-4,758.2625</w:t>
+            </w:r>
+          </w:p>
+        </w:tc>
+        <w:tc>
+          <w:tcPr>
+            <w:tcBorders>
+              <w:bottom w:val="single" w:sz="12" w:space="0" w:color="BEBEBE"/>
+              <w:top w:val="none" w:sz="0" w:space="0" w:color="000000"/>
+              <w:left w:val="none" w:sz="0" w:space="0" w:color="000000"/>
+              <w:right w:val="none" w:sz="0" w:space="0" w:color="000000"/>
+            </w:tcBorders>
+            <w:shd w:val="clear" w:color="auto" w:fill="FFFFFF"/>
+            <w:tcMar>
+              <w:top w:w="0" w:type="dxa"/>
+              <w:bottom w:w="0" w:type="dxa"/>
+              <w:left w:w="0" w:type="dxa"/>
+              <w:right w:w="0" w:type="dxa"/>
+            </w:tcMar>
+            <w:vAlign w:val="center"/>
+          </w:tcPr>
+          <w:p>
+            <w:pPr>
+              <w:pStyle w:val="Normal"/>
+              <w:jc w:val="right"/>
+              <w:pBdr>
+                <w:bottom w:val="none" w:sz="0" w:space="0" w:color="000000"/>
+                <w:top w:val="none" w:sz="0" w:space="0" w:color="000000"/>
+                <w:left w:val="none" w:sz="0" w:space="0" w:color="000000"/>
+                <w:right w:val="none" w:sz="0" w:space="0" w:color="000000"/>
+              </w:pBdr>
+              <w:spacing w:after="60" w:before="60" w:line="312"/>
+              <w:ind w:left="80" w:right="80" w:firstLine="0" w:firstLineChars="0"/>
+              <w:rPr>
+                <w:rFonts w:ascii="Arial" w:hAnsi="Arial" w:eastAsia="Arial" w:cs="Arial"/>
+                <w:i w:val="false"/>
+                <w:b w:val="false"/>
+                <w:u w:val="none"/>
+                <w:sz w:val="24"/>
+                <w:szCs w:val="24"/>
+                <w:color w:val="000000"/>
+              </w:rPr>
+            </w:pPr>
+            <w:r xmlns:w="http://schemas.openxmlformats.org/wordprocessingml/2006/main" xmlns:wp="http://schemas.openxmlformats.org/drawingml/2006/wordprocessingDrawing" xmlns:r="http://schemas.openxmlformats.org/officeDocument/2006/relationships" xmlns:w14="http://schemas.microsoft.com/office/word/2010/wordml">
+              <w:rPr>
+                <w:rFonts w:ascii="Arial" w:hAnsi="Arial" w:eastAsia="Arial" w:cs="Arial"/>
+                <w:i w:val="false"/>
+                <w:b w:val="false"/>
+                <w:u w:val="none"/>
+                <w:sz w:val="24"/>
+                <w:szCs w:val="24"/>
+                <w:color w:val="000000"/>
+              </w:rPr>
+              <w:t xml:space="preserve">-18.6856</w:t>
+            </w:r>
+          </w:p>
+        </w:tc>
+        <w:tc>
+          <w:tcPr>
+            <w:tcBorders>
+              <w:bottom w:val="single" w:sz="12" w:space="0" w:color="BEBEBE"/>
+              <w:top w:val="none" w:sz="0" w:space="0" w:color="000000"/>
+              <w:left w:val="none" w:sz="0" w:space="0" w:color="000000"/>
+              <w:right w:val="none" w:sz="0" w:space="0" w:color="000000"/>
+            </w:tcBorders>
+            <w:shd w:val="clear" w:color="auto" w:fill="FFFFFF"/>
+            <w:tcMar>
+              <w:top w:w="0" w:type="dxa"/>
+              <w:bottom w:w="0" w:type="dxa"/>
+              <w:left w:w="0" w:type="dxa"/>
+              <w:right w:w="0" w:type="dxa"/>
+            </w:tcMar>
+            <w:vAlign w:val="center"/>
+          </w:tcPr>
+          <w:p>
+            <w:pPr>
+              <w:pStyle w:val="Normal"/>
+              <w:jc w:val="right"/>
+              <w:pBdr>
+                <w:bottom w:val="none" w:sz="0" w:space="0" w:color="000000"/>
+                <w:top w:val="none" w:sz="0" w:space="0" w:color="000000"/>
+                <w:left w:val="none" w:sz="0" w:space="0" w:color="000000"/>
+                <w:right w:val="none" w:sz="0" w:space="0" w:color="000000"/>
+              </w:pBdr>
+              <w:spacing w:after="60" w:before="60" w:line="312"/>
+              <w:ind w:left="80" w:right="80" w:firstLine="0" w:firstLineChars="0"/>
+              <w:rPr>
+                <w:rFonts w:ascii="Arial" w:hAnsi="Arial" w:eastAsia="Arial" w:cs="Arial"/>
+                <w:i w:val="false"/>
+                <w:b w:val="false"/>
+                <w:u w:val="none"/>
+                <w:sz w:val="24"/>
+                <w:szCs w:val="24"/>
+                <w:color w:val="000000"/>
+              </w:rPr>
+            </w:pPr>
+            <w:r xmlns:w="http://schemas.openxmlformats.org/wordprocessingml/2006/main" xmlns:wp="http://schemas.openxmlformats.org/drawingml/2006/wordprocessingDrawing" xmlns:r="http://schemas.openxmlformats.org/officeDocument/2006/relationships" xmlns:w14="http://schemas.microsoft.com/office/word/2010/wordml">
+              <w:rPr>
+                <w:rFonts w:ascii="Arial" w:hAnsi="Arial" w:eastAsia="Arial" w:cs="Arial"/>
+                <w:i w:val="false"/>
+                <w:b w:val="false"/>
+                <w:u w:val="none"/>
+                <w:sz w:val="24"/>
+                <w:szCs w:val="24"/>
+                <w:color w:val="000000"/>
+              </w:rPr>
+              <w:t xml:space="preserve">0.0474</w:t>
+            </w:r>
+          </w:p>
+        </w:tc>
+      </w:tr>
+    </w:tbl>
+    <w:p>
+      <w:pPr>
         <w:pStyle w:val="BodyText"/>
+      </w:pPr>
+      <w:r>
+        <w:t xml:space="preserve">One other pair of regions came close to being significantly different (southeast-northwest, see Figure 1: TukeyHSD Visualization), but as shown by our visualization of the TukeyHSD results all the other regions show little to no significant evidence of differences.</w:t>
+      </w:r>
+    </w:p>
+    <w:p>
+      <w:pPr>
+        <w:pStyle w:val="CaptionedFigure"/>
       </w:pPr>
       <w:r>
         <w:drawing>
           <wp:inline>
             <wp:extent cx="4620126" cy="3696101"/>
             <wp:effectExtent b="0" l="0" r="0" t="0"/>
-            <wp:docPr descr="" title="" id="22" name="Picture"/>
+            <wp:docPr descr="Figure 1: TukeyHSD Visualization, differences in mean medical costs billed by insurance (charges) region by region. This makes visible the significant difference in mean medical costs between the southwest and southeast regions, as shown by the 95% confidence interval for the difference in their mean costs not including 0" title="" id="23" name="Picture"/>
             <a:graphic>
               <a:graphicData uri="http://schemas.openxmlformats.org/drawingml/2006/picture">
                 <pic:pic>
                   <pic:nvPicPr>
-                    <pic:cNvPr descr="Medical-Cost-Analyis---Jon-Duea---John-Clark_files/figure-docx/Two-Way%20ANOVA%20table-1.png" id="23" name="Picture"/>
+                    <pic:cNvPr descr="Medical-Cost-Analyis---Jon-Duea---John-Clark_files/figure-docx/TukeyHSD%20Figure-1.png" id="24" name="Picture"/>
                     <pic:cNvPicPr>
                       <a:picLocks noChangeArrowheads="1" noChangeAspect="1"/>
                     </pic:cNvPicPr>
                   </pic:nvPicPr>
                   <pic:blipFill>
-                    <a:blip r:embed="rId21"/>
+                    <a:blip r:embed="rId22"/>
                     <a:stretch>
                       <a:fillRect/>
                     </a:stretch>
@@ -1223,18 +4996,64 @@
         </w:drawing>
       </w:r>
     </w:p>
-    <w:bookmarkEnd w:id="24"/>
-    <w:bookmarkStart w:id="32" w:name="references"/>
     <w:p>
       <w:pPr>
+        <w:pStyle w:val="ImageCaption"/>
+      </w:pPr>
+      <w:r>
+        <w:t xml:space="preserve">Figure 1: TukeyHSD Visualization, differences in mean medical costs billed by insurance (charges) region by region. This makes visible the significant difference in mean medical costs between the southwest and southeast regions, as shown by the 95% confidence interval for the difference in their mean costs not including 0</w:t>
+      </w:r>
+    </w:p>
+    <w:p>
+      <w:pPr>
+        <w:pStyle w:val="BodyText"/>
+      </w:pPr>
+      <w:r>
+        <w:t xml:space="preserve">It is important to note that while our analysis has given some insight into the differences in medical costs between male and female sexes, as well as four different regions of the US, the relevance of this analysis is limited as the data used was generated from US census bureau statistics and is quite dated as of 2025 (the data was generated for the year the book</w:t>
+      </w:r>
+      <w:r>
+        <w:t xml:space="preserve"> </w:t>
+      </w:r>
+      <w:r>
+        <w:rPr>
+          <w:i/>
+          <w:iCs/>
+        </w:rPr>
+        <w:t xml:space="preserve">Machine Learning with R</w:t>
+      </w:r>
+      <w:r>
+        <w:t xml:space="preserve"> </w:t>
+      </w:r>
+      <w:r>
+        <w:t xml:space="preserve">(</w:t>
+      </w:r>
+      <w:hyperlink w:anchor="ref-lantz_2013_machine">
+        <w:r>
+          <w:rPr>
+            <w:rStyle w:val="Hyperlink"/>
+          </w:rPr>
+          <w:t xml:space="preserve">Lantz 2013</w:t>
+        </w:r>
+      </w:hyperlink>
+      <w:r>
+        <w:t xml:space="preserve">)</w:t>
+      </w:r>
+      <w:r>
+        <w:t xml:space="preserve">, was first published i.e. 2013). It is likely that if the same sort of analysis were to be performed with data based off recent census bureau statistics the results may or may not be the same.</w:t>
+      </w:r>
+    </w:p>
+    <w:bookmarkEnd w:id="25"/>
+    <w:bookmarkStart w:id="33" w:name="references"/>
+    <w:p>
+      <w:pPr>
         <w:pStyle w:val="Heading1"/>
       </w:pPr>
       <w:r>
         <w:t xml:space="preserve">References</w:t>
       </w:r>
     </w:p>
-    <w:bookmarkStart w:id="31" w:name="refs"/>
-    <w:bookmarkStart w:id="26" w:name="ref-choi_medical"/>
+    <w:bookmarkStart w:id="32" w:name="refs"/>
+    <w:bookmarkStart w:id="27" w:name="ref-choi_medical"/>
     <w:p>
       <w:pPr>
         <w:pStyle w:val="Bibliography"/>
@@ -1257,7 +5076,7 @@
       <w:r>
         <w:t xml:space="preserve"> </w:t>
       </w:r>
-      <w:hyperlink r:id="rId25">
+      <w:hyperlink r:id="rId26">
         <w:r>
           <w:rPr>
             <w:rStyle w:val="Hyperlink"/>
@@ -1269,8 +5088,8 @@
         <w:t xml:space="preserve">.</w:t>
       </w:r>
     </w:p>
-    <w:bookmarkEnd w:id="26"/>
-    <w:bookmarkStart w:id="28" w:name="ref-lantz_2013_machine"/>
+    <w:bookmarkEnd w:id="27"/>
+    <w:bookmarkStart w:id="29" w:name="ref-lantz_2013_machine"/>
     <w:p>
       <w:pPr>
         <w:pStyle w:val="Bibliography"/>
@@ -1293,7 +5112,7 @@
       <w:r>
         <w:t xml:space="preserve"> </w:t>
       </w:r>
-      <w:hyperlink r:id="rId27">
+      <w:hyperlink r:id="rId28">
         <w:r>
           <w:rPr>
             <w:rStyle w:val="Hyperlink"/>
@@ -1305,8 +5124,8 @@
         <w:t xml:space="preserve">.</w:t>
       </w:r>
     </w:p>
-    <w:bookmarkEnd w:id="28"/>
-    <w:bookmarkStart w:id="30" w:name="ref-stednick_2022_data"/>
+    <w:bookmarkEnd w:id="29"/>
+    <w:bookmarkStart w:id="31" w:name="ref-stednick_2022_data"/>
     <w:p>
       <w:pPr>
         <w:pStyle w:val="Bibliography"/>
@@ -1329,7 +5148,7 @@
       <w:r>
         <w:t xml:space="preserve"> </w:t>
       </w:r>
-      <w:hyperlink r:id="rId29">
+      <w:hyperlink r:id="rId30">
         <w:r>
           <w:rPr>
             <w:rStyle w:val="Hyperlink"/>
@@ -1341,9 +5160,9 @@
         <w:t xml:space="preserve">.</w:t>
       </w:r>
     </w:p>
-    <w:bookmarkEnd w:id="30"/>
     <w:bookmarkEnd w:id="31"/>
     <w:bookmarkEnd w:id="32"/>
+    <w:bookmarkEnd w:id="33"/>
     <w:sectPr>
       <w:pgSz w:h="15840" w:w="12240"/>
       <w:pgMar w:bottom="1440" w:footer="720" w:gutter="0" w:header="720" w:left="1440" w:right="1440" w:top="1440"/>
@@ -1887,12 +5706,45 @@
     <w:abstractNumId w:val="991"/>
   </w:num>
   <w:num w:numId="1007">
-    <w:abstractNumId w:val="991"/>
+    <w:abstractNumId w:val="99411"/>
+    <w:lvlOverride w:ilvl="0">
+      <w:startOverride w:val="1"/>
+    </w:lvlOverride>
+    <w:lvlOverride w:ilvl="1">
+      <w:startOverride w:val="1"/>
+    </w:lvlOverride>
+    <w:lvlOverride w:ilvl="2">
+      <w:startOverride w:val="1"/>
+    </w:lvlOverride>
+    <w:lvlOverride w:ilvl="3">
+      <w:startOverride w:val="1"/>
+    </w:lvlOverride>
+    <w:lvlOverride w:ilvl="4">
+      <w:startOverride w:val="1"/>
+    </w:lvlOverride>
+    <w:lvlOverride w:ilvl="5">
+      <w:startOverride w:val="1"/>
+    </w:lvlOverride>
+    <w:lvlOverride w:ilvl="6">
+      <w:startOverride w:val="1"/>
+    </w:lvlOverride>
+    <w:lvlOverride w:ilvl="7">
+      <w:startOverride w:val="1"/>
+    </w:lvlOverride>
+    <w:lvlOverride w:ilvl="8">
+      <w:startOverride w:val="1"/>
+    </w:lvlOverride>
   </w:num>
   <w:num w:numId="1008">
     <w:abstractNumId w:val="991"/>
   </w:num>
   <w:num w:numId="1009">
+    <w:abstractNumId w:val="991"/>
+  </w:num>
+  <w:num w:numId="1010">
+    <w:abstractNumId w:val="991"/>
+  </w:num>
+  <w:num w:numId="1011">
     <w:abstractNumId w:val="991"/>
   </w:num>
 </w:numbering>
@@ -2369,7 +6221,6 @@
   <w:style w:default="1" w:styleId="DefaultParagraphFont" w:type="character">
     <w:name w:val="Default Paragraph Font"/>
     <w:uiPriority w:val="1"/>
-    <w:semiHidden/>
     <w:unhideWhenUsed/>
   </w:style>
   <w:style w:default="1" w:styleId="TableNormal" w:type="table">
@@ -2769,6 +6620,10 @@
   <w:style w:customStyle="1" w:styleId="ImageCaption" w:type="paragraph">
     <w:name w:val="Image Caption"/>
     <w:basedOn w:val="Caption"/>
+    <w:rsid w:val="00A821A9"/>
+    <w:pPr>
+      <w:spacing w:line="240" w:lineRule="auto"/>
+    </w:pPr>
   </w:style>
   <w:style w:customStyle="1" w:styleId="Figure" w:type="paragraph">
     <w:name w:val="Figure"/>
@@ -2777,8 +6632,10 @@
   <w:style w:customStyle="1" w:styleId="CaptionedFigure" w:type="paragraph">
     <w:name w:val="Captioned Figure"/>
     <w:basedOn w:val="Figure"/>
+    <w:rsid w:val="00A821A9"/>
     <w:pPr>
       <w:keepNext/>
+      <w:spacing w:line="240" w:lineRule="auto"/>
     </w:pPr>
   </w:style>
   <w:style w:customStyle="1" w:styleId="CaptionChar" w:type="character">

</xml_diff>